<commit_message>
Manuscript v4.8 final: cold-read fixes, framework framing, related work
Co-Authored-By: Claude Opus 5.5 <noreply@anthropic.com>
Claude-Session: https://claude.ai/code/session_01NVWVRPSXWbvUmxdzTrqBTy
</commit_message>
<xml_diff>
--- a/paper/User_First_Intelligence_v4.8_2026-10-12.docx
+++ b/paper/User_First_Intelligence_v4.8_2026-10-12.docx
@@ -26,7 +26,7 @@
         <w:t xml:space="preserve"> </w:t>
       </w:r>
       <w:r>
-        <w:t xml:space="preserve">KL University (doctoral programme), Atlanta, GA, USA</w:t>
+        <w:t xml:space="preserve">KL University (doctoral program), Andhra Pradesh, India</w:t>
       </w:r>
       <w:r>
         <w:t xml:space="preserve"> </w:t>
@@ -40,7 +40,7 @@
         <w:pStyle w:val="BodyText"/>
       </w:pPr>
       <w:r>
-        <w:t xml:space="preserve">Keywords: search measurement; instrument validity; AI Overviews; generative engine optimization; deployment measurement study; reference content</w:t>
+        <w:t xml:space="preserve">Keywords: User First Intelligence; content gap discovery; ontology; knowledge graph; competency questions; search measurement; instrument validity; AI Overviews; generative engine optimization; deployment measurement study; reference content</w:t>
       </w:r>
     </w:p>
     <w:bookmarkStart w:id="20" w:name="abstract"/>
@@ -57,7 +57,7 @@
         <w:pStyle w:val="FirstParagraph"/>
       </w:pPr>
       <w:r>
-        <w:t xml:space="preserve">Applied search research runs almost entirely on commercial analytics platforms and treats their outputs as measurements. This paper reports what happens when two of them are pointed at the same object.</w:t>
+        <w:t xml:space="preserve">User First Intelligence (UFI) is a framework for finding content gaps from the structure of an industry’s knowledge and the questions its users ask, rather than from keyword search volume. It organizes the industry under an ontology, populates a knowledge graph from several source classes, expresses user needs as executable competency questions, and scores gaps with a Content Gap Score; the specification and an open implementation are released. This paper reports one deployment of a gap of the kind the framework targets, and what happens when two commercial analytics platforms are pointed at the result. Applied search research runs almost entirely on such platforms and treats their outputs as measurements.</w:t>
       </w:r>
     </w:p>
     <w:p>
@@ -107,7 +107,7 @@
         <w:pStyle w:val="BodyText"/>
       </w:pPr>
       <w:r>
-        <w:t xml:space="preserve">The vendors do not claim otherwise in their documentation, which describes click models over estimated volumes at estimated positions. The practice treats them as counters anyway. This paper is an attempt to put a number on what that costs.</w:t>
+        <w:t xml:space="preserve">The vendors do not claim otherwise in their documentation, which describes click models over estimated volumes at estimated positions. The practice treats them as counters anyway. This paper is an attempt to put a number on what that costs. The question matters for any framework that claims to find content worth building, including the one this paper specifies: User First Intelligence identifies gaps from an industry’s knowledge structure and its users’ questions rather than from keyword volume, and the first thing such a framework needs is an honest measurement of what happens when a gap is filled.</w:t>
       </w:r>
     </w:p>
     <w:bookmarkStart w:id="21" w:name="Xb1af0e1b50aa7e2fd0c239798b9480eadff2d42"/>
@@ -140,7 +140,7 @@
         <w:pStyle w:val="BodyText"/>
       </w:pPr>
       <w:r>
-        <w:t xml:space="preserve">This paper uses one such section: 381 code pages plus hubs under a single prefix on a top-authority domain, published on 26 July 2026 and observed daily for 77 days.</w:t>
+        <w:t xml:space="preserve">This paper uses one such section: 381 code pages plus hubs under a single prefix on a top-authority domain, published on 26 July 2026 and observed for 77 days, with ranking positions captured daily and the other quantities at seven checkpoints and monthly.</w:t>
       </w:r>
     </w:p>
     <w:bookmarkEnd w:id="21"/>
@@ -191,7 +191,7 @@
         <w:t xml:space="preserve">A cross-section of twelve prefixes on one domain, both instruments, one day</w:t>
       </w:r>
       <w:r>
-        <w:t xml:space="preserve">, showing that the vendor ratio on estimated visits spans 0.20x to 7.24x within a site (0.20x to 8.89x territory-matched), shows no relationship with section age, and does not follow the keyword-universe ratio, while the vendors agree on the ordering of sections (rank correlation 0.94). Section 5.5. This is the paper’s main result, and it retracts the age hypothesis the preceding version advanced.</w:t>
+        <w:t xml:space="preserve">, showing that the vendor ratio on estimated visits spans 0.20x to 7.24x within a site (0.20x to 8.89x territory-matched), shows no relationship with section age, and does not follow the keyword-universe ratio, while the vendors agree on the ordering of sections (rank correlation 0.94). Section 5.5. This is the paper’s main empirical result, and it retracts the age hypothesis advanced in version 4.0.</w:t>
       </w:r>
     </w:p>
     <w:p>
@@ -273,7 +273,26 @@
         <w:t xml:space="preserve"> </w:t>
       </w:r>
       <w:r>
-        <w:t xml:space="preserve">Sections 3, 8 and 9.</w:t>
+        <w:t xml:space="preserve">Sections 3.1 and 9.</w:t>
+      </w:r>
+    </w:p>
+    <w:p>
+      <w:pPr>
+        <w:numPr>
+          <w:ilvl w:val="0"/>
+          <w:numId w:val="1001"/>
+        </w:numPr>
+        <w:pStyle w:val="Compact"/>
+      </w:pPr>
+      <w:r>
+        <w:rPr>
+          <w:bCs/>
+          <w:b/>
+        </w:rPr>
+        <w:t xml:space="preserve">The User First Intelligence framework</w:t>
+      </w:r>
+      <w:r>
+        <w:t xml:space="preserve">: its specification, including the Content Gap Score and two competency-question metrics (schema pass rate and instance coverage), and an open reference implementation. Appendix B and Section 12. The score’s predictive value is not evaluated here; Section 11 registers the study that would evaluate it.</w:t>
       </w:r>
     </w:p>
     <w:bookmarkEnd w:id="22"/>
@@ -309,7 +328,7 @@
         <w:t xml:space="preserve"> </w:t>
       </w:r>
       <w:r>
-        <w:t xml:space="preserve">The design is observational. There is no treatment assignment, no control group, no randomization and no matched comparison. The provider’s list of sections launched in the same window is not available, so we cannot say whether this section outperformed conventionally selected content on the same domain in the same period. Where the deployment series appears, it is a description of what was observed following publication, and</w:t>
+        <w:t xml:space="preserve">The design is observational. There is no treatment assignment, no control group, no randomization and no matched comparison. The provider’s list of sections launched in the same window is not available, so this study cannot say whether this section outperformed conventionally selected content on the same domain in the same period. Where the deployment series appears, it is a description of what was observed following publication, and</w:t>
       </w:r>
       <w:r>
         <w:t xml:space="preserve"> </w:t>
@@ -345,7 +364,7 @@
         <w:t xml:space="preserve"> </w:t>
       </w:r>
       <w:r>
-        <w:t xml:space="preserve">The deployment ran on a domain with an Ahrefs Domain Rating of 90 and a Semrush Authority Score of 86. Nothing here bounds how much of the outcome that explains, and Section 10 lists it first among the threats. An earlier version of this work claimed a bound from a comparison with two carriers of similar authority; that comparison is computed within a set selected on the provider’s own presence and bounds nothing, as Section 7.2 sets out.</w:t>
+        <w:t xml:space="preserve">The deployment ran on a domain with an Ahrefs Domain Rating of 90 and a Semrush Authority Score of 86. Nothing here bounds how much of the outcome that explains, and Section 10 lists it among the confounds. An earlier version of this work claimed a bound from a comparison with two carriers of similar authority; that comparison is computed within a set selected on the provider’s own presence and bounds nothing, as Section 7.2 sets out.</w:t>
       </w:r>
     </w:p>
     <w:p>
@@ -363,7 +382,7 @@
         <w:t xml:space="preserve"> </w:t>
       </w:r>
       <w:r>
-        <w:t xml:space="preserve">Earlier versions of this work proposed a Content Gap Score and devoted their framing to it. It was never computed when the build decision was taken, nothing here tests it, and no published study has tested whether it predicts anything. It is a specification with a reference implementation, and it has been moved to Appendix B so that it cannot be mistaken for a result of this paper.</w:t>
+        <w:t xml:space="preserve">The framework’s Content Gap Score was not computed when the build decision was taken, nothing here tests it, and no published study has tested whether it predicts anything. It is specified in Appendix B with a reference implementation, and it is kept out of the results so that it cannot be mistaken for one.</w:t>
       </w:r>
     </w:p>
     <w:p>
@@ -381,7 +400,7 @@
         <w:t xml:space="preserve"> </w:t>
       </w:r>
       <w:r>
-        <w:t xml:space="preserve">No figure in this paper is a counted visit. Internal analytics would be and are not available to us.</w:t>
+        <w:t xml:space="preserve">No figure in this paper is a counted visit. The provider’s internal analytics were not available for this study.</w:t>
       </w:r>
     </w:p>
     <w:p>
@@ -428,7 +447,7 @@
         <w:t xml:space="preserve"> </w:t>
       </w:r>
       <w:r>
-        <w:t xml:space="preserve">Vendor estimates of search volume and traffic are known to be imprecise, and the practice of treating them as measurements is long-standing. What is less often reported is a direct, longitudinal comparison of two vendors on a single object with a known start date. The nearest analogues are audits of search result composition rather than of the estimation layer. This paper’s contribution is narrow and empirical: a divergence series on one prefix, with the raw vendor figures printed so the ratios can be recomputed.</w:t>
+        <w:t xml:space="preserve">The validity of vendor traffic estimates has been measured mainly against first-party analytics, site by site. An agency comparison of Similarweb, Ahrefs and Semrush against Google Analytics organic visits for 25 sites found all three wrong in level, with the two keyword-based tools underestimating total traffic by 17% and 30% [Langridge 2016]. A vendor study of 1,635 sites against Google Search Console reports a median deviation of 49.5% for Ahrefs and 68.4% for Semrush, and a correlation with the first-party figure of 0.76 and 0.74 [Soulo 2022]; it is the vendor reporting on itself and on a competitor, and is cited for its design rather than its ranking. In academic work, traffic-ranking services have been compared as proxies for organizational performance [Vaughan &amp; Yang 2013], and the major top-site lists were shown to disagree with one another on most of their entries and to churn by up to half of their domains a day [Scheitle et al. 2018], which motivated a ranking built to be stable and hard to manipulate [Le Pochat et al. 2019]. Those studies compare an estimate with a ground truth across many sites, or compare lists across the whole web. This paper does neither: it has no ground truth, and it holds the site fixed. What it adds is a reading of two vendors on an object both observed from zero, and a cross-section of twelve sections of one domain on one day, which separates disagreement about a site from disagreement about a section of it.</w:t>
       </w:r>
     </w:p>
     <w:p>
@@ -440,31 +459,13 @@
           <w:bCs/>
           <w:b/>
         </w:rPr>
-        <w:t xml:space="preserve">AI answer surfaces.</w:t>
-      </w:r>
-      <w:r>
-        <w:t xml:space="preserve"> </w:t>
-      </w:r>
-      <w:r>
-        <w:t xml:space="preserve">An audit of 55,393 queries found that 29.8% of the domains cited by Google’s AI Overviews did not appear on the first page of organic results for the same query [Xu, Iqbal &amp; Montgomery 2026]; vendor measurement across 15,000 prompts reports that only 12% of URLs cited by ChatGPT, Gemini and Copilot rank in Google’s top ten for the same prompt, with Perplexity at 28.6% [Linehan &amp; Guan 2025]. Users click less when a summary appears and rarely click its sources: a click on a link inside an AI summary occurred in 1% of visits to pages showing one [Chapekis &amp; Lieb 2025]. A critical survey of 45 generative-engine-optimization studies finds no page-level technique with a stable cross-platform effect on visibility, and identifies topical relevance as the most reproducible lever [Martinez 2026]. Section 5.3 adds a measurement observation those studies need: the two vendor definitions of</w:t>
-      </w:r>
-      <w:r>
-        <w:t xml:space="preserve"> </w:t>
-      </w:r>
-      <w:r>
-        <w:t xml:space="preserve">“</w:t>
-      </w:r>
-      <w:r>
-        <w:t xml:space="preserve">cited in an AI Overview</w:t>
-      </w:r>
-      <w:r>
-        <w:t xml:space="preserve">”</w:t>
-      </w:r>
-      <w:r>
-        <w:t xml:space="preserve"> </w:t>
-      </w:r>
-      <w:r>
-        <w:t xml:space="preserve">differ by a factor that is itself time-varying, so a GEO result reported on one vendor’s definition is not directly comparable to one reported on the other’s.</w:t>
+        <w:t xml:space="preserve">Comparison across non-identical universes.</w:t>
+      </w:r>
+      <w:r>
+        <w:t xml:space="preserve"> </w:t>
+      </w:r>
+      <w:r>
+        <w:t xml:space="preserve">Comparing two measurements computed over different underlying sets is an old problem in information retrieval evaluation. Pooled relevance judgments are incomplete, and systems that did not contribute to the pool are scored on a universe they did not help define [Zobel 1998]; measures robust to incomplete judgments were proposed for exactly that case [Buckley &amp; Voorhees 2004], and the bias a pooled universe imposes on a new system can be estimated and adjusted [Webber &amp; Park 2009]. Section 5.6 makes the same move on commercial instruments: it decomposes the visits divergence into a keyword-universe term and a per-keyword term, so that a disagreement about how much surface each vendor indexes is not read as a disagreement about traffic. Unlike a test collection, neither vendor’s universe is published, so the decomposition can be computed only at the aggregate level reported here.</w:t>
       </w:r>
     </w:p>
     <w:p>
@@ -476,13 +477,31 @@
           <w:bCs/>
           <w:b/>
         </w:rPr>
-        <w:t xml:space="preserve">Information needs and query fragmentation.</w:t>
-      </w:r>
-      <w:r>
-        <w:t xml:space="preserve"> </w:t>
-      </w:r>
-      <w:r>
-        <w:t xml:space="preserve">The gap between the unit a user has in mind and the unit a retrieval system indexes is old ground [Belkin, Oddy &amp; Brooks 1982; Taylor 1968], as is the observation that aggregate demand concentrates differently from individual demand [Goel et al. 2010]. The taxonomy of web search [Broder 2002] distinguishes query intent rather than query granularity. Section 4 describes a deployment in which the operative distinction was granularity: one need expressed as thousands of distinct strings.</w:t>
+        <w:t xml:space="preserve">AI answer surfaces.</w:t>
+      </w:r>
+      <w:r>
+        <w:t xml:space="preserve"> </w:t>
+      </w:r>
+      <w:r>
+        <w:t xml:space="preserve">An audit of 55,393 queries found that 29.8% of the domains cited by Google’s AI Overviews did not appear on the first page of organic results for the same query [Xu, Iqbal &amp; Montgomery 2026]; vendor measurement across 15,000 prompts reports that only 12% of URLs cited by ChatGPT, Gemini and Copilot rank in Google’s top ten for the same prompt, with Perplexity at 28.6% [Linehan &amp; Guan 2025]. Users click less when a summary appears and rarely click its sources: a click on a link inside an AI summary occurred in 1% of visits to pages showing one [Chapekis &amp; Lieb 2025]. A critical survey of 45 generative-engine-optimization studies finds no page-level technique with a stable cross-platform effect on visibility, and identifies topical relevance as the most reproducible lever [Martinez 2026]. Section 5.3 adds a measurement observation those studies need: the two vendor definitions of</w:t>
+      </w:r>
+      <w:r>
+        <w:t xml:space="preserve"> </w:t>
+      </w:r>
+      <w:r>
+        <w:t xml:space="preserve">“</w:t>
+      </w:r>
+      <w:r>
+        <w:t xml:space="preserve">cited in an AI Overview</w:t>
+      </w:r>
+      <w:r>
+        <w:t xml:space="preserve">”</w:t>
+      </w:r>
+      <w:r>
+        <w:t xml:space="preserve"> </w:t>
+      </w:r>
+      <w:r>
+        <w:t xml:space="preserve">differ by a factor that is itself time-varying, so a GEO result reported on one vendor’s definition is not directly comparable to one reported on the other’s.</w:t>
       </w:r>
     </w:p>
     <w:p>
@@ -494,6 +513,24 @@
           <w:bCs/>
           <w:b/>
         </w:rPr>
+        <w:t xml:space="preserve">Information needs and query fragmentation.</w:t>
+      </w:r>
+      <w:r>
+        <w:t xml:space="preserve"> </w:t>
+      </w:r>
+      <w:r>
+        <w:t xml:space="preserve">The gap between the unit a user has in mind and the unit a retrieval system indexes is old ground [Belkin, Oddy &amp; Brooks 1982; Taylor 1968], as is the observation that aggregate demand concentrates differently from individual demand [Goel et al. 2010]. The taxonomy of web search [Broder 2002] distinguishes query intent rather than query granularity. Section 4 describes a deployment in which the operative distinction was granularity: one need expressed as thousands of distinct strings.</w:t>
+      </w:r>
+    </w:p>
+    <w:p>
+      <w:pPr>
+        <w:pStyle w:val="BodyText"/>
+      </w:pPr>
+      <w:r>
+        <w:rPr>
+          <w:bCs/>
+          <w:b/>
+        </w:rPr>
         <w:t xml:space="preserve">Completeness in knowledge bases.</w:t>
       </w:r>
       <w:r>
@@ -568,15 +605,15 @@
         <w:t xml:space="preserve"> </w:t>
       </w:r>
       <w:r>
-        <w:t xml:space="preserve">The 290 was carried from an early draft and never re-counted, and the control it implied was advertised for four review rounds without anyone fetching the pages. The correction came from doing so.</w:t>
-      </w:r>
-    </w:p>
-    <w:p>
-      <w:pPr>
-        <w:pStyle w:val="BodyText"/>
-      </w:pPr>
-      <w:r>
-        <w:t xml:space="preserve">All code pages, the state hubs and the national hub were published together at launch; no pages were added to the section during the observation window. This is the author’s statement of the deployment’s publishing history. Table 5’s series of pages holding a position (210, 365, 391, 414, 440) is therefore the indexing of a fixed set of 434 URLs by one instrument, and not growth in the section itself. The figure of 440 at day 75 against 434 published URLs is within what the instrument attributes to a prefix beyond its canonical pages.</w:t>
+        <w:t xml:space="preserve">The 290 was carried from an early draft and never re-counted, and the control it implied was never checked against the pages; fetching every page corrected both figures.</w:t>
+      </w:r>
+    </w:p>
+    <w:p>
+      <w:pPr>
+        <w:pStyle w:val="BodyText"/>
+      </w:pPr>
+      <w:r>
+        <w:t xml:space="preserve">All code pages, the state hubs and the national hub were published together at launch; no pages were added to the section during the observation window. This is the author’s statement of the deployment’s publishing history. Table 5’s series of pages holding a position (210, 365, 391, 414, 440) is therefore the indexing of a fixed set of 434 URLs by one instrument, and not growth in the section itself.</w:t>
       </w:r>
     </w:p>
     <w:p>
@@ -616,7 +653,7 @@
         <w:t xml:space="preserve"> </w:t>
       </w:r>
       <w:r>
-        <w:t xml:space="preserve">is the number of URLs under the prefix holding at least one ranking position on 11 October, which is selected on the outcome; it exceeds 381 plus the 53 hub pages by seven, which is within what the instrument attributes to a prefix beyond its canonical pages. Every fact on the pages is templated from two public-domain US government sources, the numbering plan administrator’s registry and census data. The section went live on 26 July 2026, which is day 0 throughout this paper, dated from the first third-party detection of the pages.</w:t>
+        <w:t xml:space="preserve">is the number of URLs under the prefix holding at least one ranking position on 11 October, which is selected on the outcome; it exceeds 381 plus the 53 hub pages by seven, which is within what the instrument attributes to a prefix beyond its canonical pages. Brand Radar’s count of 455 distinct cited pages (Section 5.3) exceeds 434 by 21; that instrument does not document how it normalizes URL variants, and the difference is reported rather than reconciled. Every fact on the pages is templated from two public-domain US government sources, the numbering plan administrator’s registry and census data. The section went live on 26 July 2026, which is day 0 throughout this paper, dated from the first third-party detection of the pages.</w:t>
       </w:r>
     </w:p>
     <w:bookmarkStart w:id="26" w:name="X2d058e9f8ac4d8e33a31210c9c079ac97f573dc"/>
@@ -1241,43 +1278,43 @@
               <w:jc w:val="left"/>
             </w:pPr>
             <w:r>
-              <w:t xml:space="preserve">Referring domains</w:t>
-            </w:r>
-          </w:p>
-        </w:tc>
-        <w:tc>
-          <w:tcPr/>
-          <w:p>
-            <w:pPr>
-              <w:pStyle w:val="Compact"/>
-              <w:jc w:val="left"/>
-            </w:pPr>
-            <w:r>
-              <w:t xml:space="preserve">live linking domains to the prefix</w:t>
-            </w:r>
-          </w:p>
-        </w:tc>
-        <w:tc>
-          <w:tcPr/>
-          <w:p>
-            <w:pPr>
-              <w:pStyle w:val="Compact"/>
-              <w:jc w:val="left"/>
-            </w:pPr>
-            <w:r>
-              <w:t xml:space="preserve">Ahrefs; Semrush Backlink Analytics</w:t>
-            </w:r>
-          </w:p>
-        </w:tc>
-        <w:tc>
-          <w:tcPr/>
-          <w:p>
-            <w:pPr>
-              <w:pStyle w:val="Compact"/>
-              <w:jc w:val="left"/>
-            </w:pPr>
-            <w:r>
-              <w:t xml:space="preserve">11 Oct 2026</w:t>
+              <w:t xml:space="preserve">AI visibility (Semrush)</w:t>
+            </w:r>
+          </w:p>
+        </w:tc>
+        <w:tc>
+          <w:tcPr/>
+          <w:p>
+            <w:pPr>
+              <w:pStyle w:val="Compact"/>
+              <w:jc w:val="left"/>
+            </w:pPr>
+            <w:r>
+              <w:t xml:space="preserve">mentions and cited pages in the AI-visibility panel; scoped to the domain whatever subfolder is queried (Section 5.5)</w:t>
+            </w:r>
+          </w:p>
+        </w:tc>
+        <w:tc>
+          <w:tcPr/>
+          <w:p>
+            <w:pPr>
+              <w:pStyle w:val="Compact"/>
+              <w:jc w:val="left"/>
+            </w:pPr>
+            <w:r>
+              <w:t xml:space="preserve">Semrush</w:t>
+            </w:r>
+          </w:p>
+        </w:tc>
+        <w:tc>
+          <w:tcPr/>
+          <w:p>
+            <w:pPr>
+              <w:pStyle w:val="Compact"/>
+              <w:jc w:val="left"/>
+            </w:pPr>
+            <w:r>
+              <w:t xml:space="preserve">10 Oct; 12 Oct 2026</w:t>
             </w:r>
           </w:p>
         </w:tc>
@@ -1291,6 +1328,156 @@
               <w:jc w:val="left"/>
             </w:pPr>
             <w:r>
+              <w:t xml:space="preserve">Referring domains</w:t>
+            </w:r>
+          </w:p>
+        </w:tc>
+        <w:tc>
+          <w:tcPr/>
+          <w:p>
+            <w:pPr>
+              <w:pStyle w:val="Compact"/>
+              <w:jc w:val="left"/>
+            </w:pPr>
+            <w:r>
+              <w:t xml:space="preserve">live linking domains to the prefix</w:t>
+            </w:r>
+          </w:p>
+        </w:tc>
+        <w:tc>
+          <w:tcPr/>
+          <w:p>
+            <w:pPr>
+              <w:pStyle w:val="Compact"/>
+              <w:jc w:val="left"/>
+            </w:pPr>
+            <w:r>
+              <w:t xml:space="preserve">Ahrefs; Semrush Backlink Analytics</w:t>
+            </w:r>
+          </w:p>
+        </w:tc>
+        <w:tc>
+          <w:tcPr/>
+          <w:p>
+            <w:pPr>
+              <w:pStyle w:val="Compact"/>
+              <w:jc w:val="left"/>
+            </w:pPr>
+            <w:r>
+              <w:t xml:space="preserve">11 Oct 2026</w:t>
+            </w:r>
+          </w:p>
+        </w:tc>
+      </w:tr>
+      <w:tr>
+        <w:tc>
+          <w:tcPr/>
+          <w:p>
+            <w:pPr>
+              <w:pStyle w:val="Compact"/>
+              <w:jc w:val="left"/>
+            </w:pPr>
+            <w:r>
+              <w:t xml:space="preserve">Section age (Table 4)</w:t>
+            </w:r>
+          </w:p>
+        </w:tc>
+        <w:tc>
+          <w:tcPr/>
+          <w:p>
+            <w:pPr>
+              <w:pStyle w:val="Compact"/>
+              <w:jc w:val="left"/>
+            </w:pPr>
+            <w:r>
+              <w:t xml:space="preserve">months since the first month with organic traffic in the all-time series; left-censored at September 2015</w:t>
+            </w:r>
+          </w:p>
+        </w:tc>
+        <w:tc>
+          <w:tcPr/>
+          <w:p>
+            <w:pPr>
+              <w:pStyle w:val="Compact"/>
+              <w:jc w:val="left"/>
+            </w:pPr>
+            <w:r>
+              <w:t xml:space="preserve">Ahrefs Site Explorer, prefix mode, chart interval all</w:t>
+            </w:r>
+          </w:p>
+        </w:tc>
+        <w:tc>
+          <w:tcPr/>
+          <w:p>
+            <w:pPr>
+              <w:pStyle w:val="Compact"/>
+              <w:jc w:val="left"/>
+            </w:pPr>
+            <w:r>
+              <w:t xml:space="preserve">12 Oct 2026</w:t>
+            </w:r>
+          </w:p>
+        </w:tc>
+      </w:tr>
+      <w:tr>
+        <w:tc>
+          <w:tcPr/>
+          <w:p>
+            <w:pPr>
+              <w:pStyle w:val="Compact"/>
+              <w:jc w:val="left"/>
+            </w:pPr>
+            <w:r>
+              <w:t xml:space="preserve">US share (Table 4)</w:t>
+            </w:r>
+          </w:p>
+        </w:tc>
+        <w:tc>
+          <w:tcPr/>
+          <w:p>
+            <w:pPr>
+              <w:pStyle w:val="Compact"/>
+              <w:jc w:val="left"/>
+            </w:pPr>
+            <w:r>
+              <w:t xml:space="preserve">United States share of the prefix’s estimated visits, from the traffic-by-location table</w:t>
+            </w:r>
+          </w:p>
+        </w:tc>
+        <w:tc>
+          <w:tcPr/>
+          <w:p>
+            <w:pPr>
+              <w:pStyle w:val="Compact"/>
+              <w:jc w:val="left"/>
+            </w:pPr>
+            <w:r>
+              <w:t xml:space="preserve">Ahrefs Site Explorer</w:t>
+            </w:r>
+          </w:p>
+        </w:tc>
+        <w:tc>
+          <w:tcPr/>
+          <w:p>
+            <w:pPr>
+              <w:pStyle w:val="Compact"/>
+              <w:jc w:val="left"/>
+            </w:pPr>
+            <w:r>
+              <w:t xml:space="preserve">12 Oct 2026</w:t>
+            </w:r>
+          </w:p>
+        </w:tc>
+      </w:tr>
+      <w:tr>
+        <w:tc>
+          <w:tcPr/>
+          <w:p>
+            <w:pPr>
+              <w:pStyle w:val="Compact"/>
+              <w:jc w:val="left"/>
+            </w:pPr>
+            <w:r>
               <w:t xml:space="preserve">Monthly search volume</w:t>
             </w:r>
           </w:p>
@@ -1338,7 +1525,7 @@
         <w:pStyle w:val="BodyText"/>
       </w:pPr>
       <w:r>
-        <w:t xml:space="preserve">Two properties of these instruments bear on everything that follows, and the first is this paper’s subject.</w:t>
+        <w:t xml:space="preserve">Two properties of these instruments bear on everything that follows, and the first is the subject of Section 5.</w:t>
       </w:r>
     </w:p>
     <w:p>
@@ -1413,7 +1600,7 @@
         <w:t xml:space="preserve">Shares and percentages computed on it are not</w:t>
       </w:r>
       <w:r>
-        <w:t xml:space="preserve">, because the denominator was selected on the outcome. Every share in this paper is one of the following, and is labelled at the point of use: a share whose denominator is outcome-selected, flagged as such and drawing no comparative conclusion; or a ratio between two instruments on the same object, which is this paper’s primary result and is not affected, because both denominators are the same prefix.</w:t>
+        <w:t xml:space="preserve">, because the denominator was selected on the outcome. Every share in this paper is one of the following, and is labeled at the point of use: a share whose denominator is outcome-selected, flagged as such and drawing no comparative conclusion; or a ratio between two instruments on the same object, which is this paper’s primary result and is not affected, because both denominators are the same prefix.</w:t>
       </w:r>
     </w:p>
     <w:bookmarkEnd w:id="29"/>
@@ -1431,7 +1618,7 @@
         <w:pStyle w:val="FirstParagraph"/>
       </w:pPr>
       <w:r>
-        <w:t xml:space="preserve">Three disturbances fall in the observation window. The September 2026 spam update began on 24 September, day 60, which is also the day of the estimated-traffic peak. Ahrefs posted a notice on 29 September that Google had changed how it serves results and that SERP data might be inconsistent from that date, covering days 60 to 75. And an automated link network began arriving in the day-37 to day-45 interval.</w:t>
+        <w:t xml:space="preserve">Three disturbances fall in the observation window. The September 2026 spam update began on 24 September, day 60, which is also the day of the estimated-traffic peak. Ahrefs posted a notice on 29 September, day 65, that Google had changed how it serves results and that SERP data might be inconsistent from that date, which covers days 65 to 75. And an automated link network began arriving in the day-37 to day-45 interval.</w:t>
       </w:r>
     </w:p>
     <w:p>
@@ -1446,7 +1633,7 @@
         <w:t xml:space="preserve">Day 37 (1 September 2026) is the primary checkpoint</w:t>
       </w:r>
       <w:r>
-        <w:t xml:space="preserve">: the last observation preceding all three. An earlier version of this work used day 45 and justified it as preceding the link arrival, which its own table refuted. Day 37 carries a cost that is stated rather than worked around: it was not one of the fifteen-day checkpoints at which the full quantity set was captured, so it is reported on four quantities and not nine. The claims this paper makes at day 37 concern ranking positions, top-three positions, estimated visits and the link profile, and nothing else.</w:t>
+        <w:t xml:space="preserve">: the last observation preceding all three. Day 37 carries a cost that is stated rather than worked around: it was not one of the fifteen-day checkpoints at which the full quantity set was captured, so it is reported on four quantities and not nine. The claims this paper makes at day 37 concern ranking positions, top-three positions, estimated visits and the link profile, and nothing else.</w:t>
       </w:r>
     </w:p>
     <w:bookmarkEnd w:id="30"/>
@@ -1509,42 +1696,7 @@
           <w:iCs/>
           <w:i/>
         </w:rPr>
-        <w:t xml:space="preserve">, and is marked accordingly; version 4.0 of this manuscript labelled it</w:t>
-      </w:r>
-      <w:r>
-        <w:rPr>
-          <w:iCs/>
-          <w:i/>
-        </w:rPr>
-        <w:t xml:space="preserve"> </w:t>
-      </w:r>
-      <w:r>
-        <w:rPr>
-          <w:iCs/>
-          <w:i/>
-        </w:rPr>
-        <w:t xml:space="preserve">“</w:t>
-      </w:r>
-      <w:r>
-        <w:rPr>
-          <w:iCs/>
-          <w:i/>
-        </w:rPr>
-        <w:t xml:space="preserve">month-to-date</w:t>
-      </w:r>
-      <w:r>
-        <w:rPr>
-          <w:iCs/>
-          <w:i/>
-        </w:rPr>
-        <w:t xml:space="preserve">”</w:t>
-      </w:r>
-      <w:r>
-        <w:rPr>
-          <w:iCs/>
-          <w:i/>
-        </w:rPr>
-        <w:t xml:space="preserve">, which is a different construct and made the last row of the series incomparable with the rest. The ratio column uses the US figure. Section 5.1 gives the territory-matched ratios, which are larger.</w:t>
+        <w:t xml:space="preserve">, and is marked accordingly. The ratio column uses the US figure. Section 5.6 gives the territory-matched ratios, which are larger.</w:t>
       </w:r>
     </w:p>
     <w:tbl>
@@ -1895,7 +2047,7 @@
               <w:jc w:val="left"/>
             </w:pPr>
             <w:r>
-              <w:t xml:space="preserve">77</w:t>
+              <w:t xml:space="preserve">11 (77 cumulative)</w:t>
             </w:r>
           </w:p>
         </w:tc>
@@ -2088,13 +2240,13 @@
           <w:bCs/>
           <w:b/>
         </w:rPr>
-        <w:t xml:space="preserve">A comparison we withdraw.</w:t>
-      </w:r>
-      <w:r>
-        <w:t xml:space="preserve"> </w:t>
-      </w:r>
-      <w:r>
-        <w:t xml:space="preserve">Earlier versions reported a factor of 9.2 on AI answers, from Ahrefs Brand Radar’s 17,206 stored answers citing the section against Semrush’s 158,100 mentions. That ratio is not a divergence about the same object. Semrush’s companion figure is 29,600 cited pages, which is 68 times the 434 URLs the section holds (381 code pages and 53 hubs) and 67 times the 441 URLs the other instrument attributes to the prefix, so the Semrush count is scoped to the domain or the brand rather than to this prefix. A scope mismatch of that size is not a measurement disagreement and the figure is removed from the abstract and from the comparison. We also drop the claim that the two instruments disagree about platform ordering, because the evidence for it was a platform breakdown whose own figures did not sum to its stated total and which is not reproduced here.</w:t>
+        <w:t xml:space="preserve">A withdrawn comparison.</w:t>
+      </w:r>
+      <w:r>
+        <w:t xml:space="preserve"> </w:t>
+      </w:r>
+      <w:r>
+        <w:t xml:space="preserve">Earlier versions reported a factor of 9.2 on AI answers, from Ahrefs Brand Radar’s 17,206 stored answers citing the section against Semrush’s 158,100 mentions, read on 10 October. That ratio is not a divergence about the same object. Semrush’s companion figure is 29,600 cited pages, which is 68 times the 434 URLs the section holds (381 code pages and 53 hubs) and 67 times the 441 URLs the other instrument attributes to the prefix, so the Semrush count is scoped to the domain or the brand rather than to this prefix. A scope mismatch of that size is not a measurement disagreement and the figure is removed from the abstract and from the comparison. The claim that the two instruments disagree about platform ordering is also dropped, because the evidence for it was a platform breakdown whose own figures did not sum to its stated total and which is not reproduced here.</w:t>
       </w:r>
     </w:p>
     <w:p>
@@ -2480,7 +2632,7 @@
           <wp:inline>
             <wp:extent cx="5334000" cy="2136013"/>
             <wp:effectExtent b="0" l="0" r="0" t="0"/>
-            <wp:docPr descr="Figure 2. AI Overview citation under two vendor definitions, same prefix, same months. (a) Ahrefs definition (a) as a share of all AI Overview keywords the prefix ranks on, with 95% Wilson intervals; the denominators grow from 284 to 37,238. (b) The two vendor counts, Semrush keywords with an AI Overview position against the Ahrefs numerator, on a logarithmic axis, with their ratio labelled. Sources as in Table 3." title="" id="38" name="Picture"/>
+            <wp:docPr descr="Figure 2. AI Overview citation under two vendor definitions, same prefix, same months. (a) Ahrefs definition (a) as a share of all AI Overview keywords the prefix ranks on, with 95% Wilson intervals; the denominators grow from 284 to 37,238. (b) The two vendor counts, Semrush keywords with an AI Overview position against the Ahrefs numerator, on a logarithmic axis, with their ratio labeled. Sources as in Table 3." title="" id="38" name="Picture"/>
             <a:graphic>
               <a:graphicData uri="http://schemas.openxmlformats.org/drawingml/2006/picture">
                 <pic:pic>
@@ -2523,15 +2675,15 @@
         <w:pStyle w:val="ImageCaption"/>
       </w:pPr>
       <w:r>
-        <w:t xml:space="preserve">Figure 2. AI Overview citation under two vendor definitions, same prefix, same months. (a) Ahrefs definition (a) as a share of all AI Overview keywords the prefix ranks on, with 95% Wilson intervals; the denominators grow from 284 to 37,238. (b) The two vendor counts, Semrush keywords with an AI Overview position against the Ahrefs numerator, on a logarithmic axis, with their ratio labelled. Sources as in Table 3.</w:t>
-      </w:r>
-    </w:p>
-    <w:p>
-      <w:pPr>
-        <w:pStyle w:val="BodyText"/>
-      </w:pPr>
-      <w:r>
-        <w:t xml:space="preserve">The ratio between the two counts falls from 2.94 to 1.34 over four months (Figure 2b). Two cautions on reading it. The comparison is between a count (b) and the numerator of a ratio (a), and the two vendors’ territories differ, so what the column measures is partly a territory difference and not purely a definitional one; version 4.0 described it as definitional and that was imprecise. And the series has three intervals, so</w:t>
+        <w:t xml:space="preserve">Figure 2. AI Overview citation under two vendor definitions, same prefix, same months. (a) Ahrefs definition (a) as a share of all AI Overview keywords the prefix ranks on, with 95% Wilson intervals; the denominators grow from 284 to 37,238. (b) The two vendor counts, Semrush keywords with an AI Overview position against the Ahrefs numerator, on a logarithmic axis, with their ratio labeled. Sources as in Table 3.</w:t>
+      </w:r>
+    </w:p>
+    <w:p>
+      <w:pPr>
+        <w:pStyle w:val="BodyText"/>
+      </w:pPr>
+      <w:r>
+        <w:t xml:space="preserve">The ratio between the two counts falls from 2.94 to 1.34 over four months (Figure 2b). Two cautions on reading it. The comparison is between a count (b) and the numerator of a ratio (a), and the two vendors’ territories differ, so what the column measures is partly a territory difference and not purely a definitional one. And the series has three intervals, so</w:t>
       </w:r>
       <w:r>
         <w:t xml:space="preserve"> </w:t>
@@ -2549,15 +2701,15 @@
         <w:t xml:space="preserve"> </w:t>
       </w:r>
       <w:r>
-        <w:t xml:space="preserve">describes the observed sequence and is not a trend estimate. The July row rests on 47 events over six days live, and its interval is correspondingly wide. A study reporting an AI Overview visibility figure on one vendor’s definition, for a section of a given age, is not reporting a quantity comparable to the same figure from the other vendor, and the incomparability is itself a function of age.</w:t>
-      </w:r>
-    </w:p>
-    <w:p>
-      <w:pPr>
-        <w:pStyle w:val="BodyText"/>
-      </w:pPr>
-      <w:r>
-        <w:t xml:space="preserve">The (a) column’s percentage is the one proportion in this paper whose denominator grows by two orders of magnitude across the series, from 284 to 37,238, and it is not monotone. Its denominator is outcome-selected: it counts only AI Overviews on keywords the prefix already ranks on. We report it because numerator and denominator come from one instrument on one date, and we draw no trend from it.</w:t>
+        <w:t xml:space="preserve">describes the observed sequence and is not a trend estimate. The July row rests on 47 events over six days live, and its interval is correspondingly wide. A study reporting an AI Overview visibility figure on one vendor’s definition, for a section of a given age, is not reporting a quantity comparable to the same figure from the other vendor, and on this prefix the size of the incomparability changed over its first four months.</w:t>
+      </w:r>
+    </w:p>
+    <w:p>
+      <w:pPr>
+        <w:pStyle w:val="BodyText"/>
+      </w:pPr>
+      <w:r>
+        <w:t xml:space="preserve">The (a) column’s percentage is the one proportion in this paper whose denominator grows by two orders of magnitude across the series, from 284 to 37,238, and it is not monotone. Its denominator is outcome-selected: it counts only AI Overviews on keywords the prefix already ranks on. It is reported because numerator and denominator come from one instrument on one date, and no trend is drawn from it.</w:t>
       </w:r>
     </w:p>
     <w:bookmarkEnd w:id="40"/>
@@ -2650,13 +2802,13 @@
       </w:r>
     </w:p>
     <w:bookmarkEnd w:id="44"/>
-    <w:bookmarkStart w:id="48" w:name="Xec53b8157fc3283be7a33cc42f0d11e2cebb2ac"/>
+    <w:bookmarkStart w:id="48" w:name="Xd9b58a84cd0241a28c2550a62e74a9c530544ea"/>
     <w:p>
       <w:pPr>
         <w:pStyle w:val="Heading3"/>
       </w:pPr>
       <w:r>
-        <w:t xml:space="preserve">5.5 Twelve prefixes on one domain: the divergence is prefix-specific and not about age</w:t>
+        <w:t xml:space="preserve">5.5 Twelve prefixes on one domain: the divergence is prefix-specific, with no detectable relationship to age</w:t>
       </w:r>
     </w:p>
     <w:p>
@@ -2706,7 +2858,7 @@
         <w:t xml:space="preserve">released beside them</w:t>
       </w:r>
       <w:r>
-        <w:t xml:space="preserve">, because the first draft of this section was written from recollection of the table and miscounted it.</w:t>
+        <w:t xml:space="preserve">.</w:t>
       </w:r>
     </w:p>
     <w:p>
@@ -2718,7 +2870,7 @@
           <w:iCs/>
           <w:i/>
         </w:rPr>
-        <w:t xml:space="preserve">Table 4. Twelve URL prefixes on one domain, both instruments, read 12 October 2026. Age is months since the first month with organic traffic in the Ahrefs all-time series, read to the nearest month or quarter; the series begins in September 2015, so the three oldest ages are left-censored at that horizon. Ahrefs visits are worldwide and Semrush visits are the US database; the</w:t>
+        <w:t xml:space="preserve">Table 4. Twelve URL prefixes on one domain, both instruments, read 12 October 2026. Age is months since the first month with organic traffic in the Ahrefs all-time series, read to the nearest month or quarter; the series begins in September 2015, so the oldest age (/es-us/local/) is left-censored at that horizon and the next two lie within four months of it. Ahrefs visits are worldwide and Semrush visits are the US database; the</w:t>
       </w:r>
       <w:r>
         <w:rPr>
@@ -2760,7 +2912,7 @@
           <w:iCs/>
           <w:i/>
         </w:rPr>
-        <w:t xml:space="preserve">column is the United States share of Ahrefs’ estimate from its traffic-by-location table, and the matched ratio divides Semrush US by Ahrefs US-only. Keyword and referring-domain ratios are as in version 4.6.</w:t>
+        <w:t xml:space="preserve">column is the United States share of Ahrefs’ estimate from its traffic-by-location table, and the matched ratio divides Semrush US by Ahrefs US-only. The keyword ratio is Semrush over Ahrefs, like the visits ratios; the referring-domain ratio is Ahrefs over Semrush. Referring-domain counts are the 12 October reads and differ slightly from Section 5.4’s 11 October read (80 Semrush domains, 11.4x).</w:t>
       </w:r>
     </w:p>
     <w:tbl>
@@ -4915,7 +5067,7 @@
         <w:pStyle w:val="BodyText"/>
       </w:pPr>
       <w:r>
-        <w:t xml:space="preserve">Five things follow (Figure 4), and the first retracts a claim this paper made in version 4.0.</w:t>
+        <w:t xml:space="preserve">Six things follow (Figure 4), and the first retracts a claim this paper made in version 4.0.</w:t>
       </w:r>
     </w:p>
     <w:p>
@@ -4927,13 +5079,13 @@
           <w:bCs/>
           <w:b/>
         </w:rPr>
-        <w:t xml:space="preserve">The cross-section shows no relationship between the ratio and section age.</w:t>
-      </w:r>
-      <w:r>
-        <w:t xml:space="preserve"> </w:t>
-      </w:r>
-      <w:r>
-        <w:t xml:space="preserve">Spearman’s rank correlation between age and the unmatched visits ratio is −0.11 over twelve prefixes, with a Fisher 95% interval of −0.64 to +0.49 and a permutation p of 0.73; territory-matched it is −0.28; excluding the area-code section it is +0.15. Twelve prefixes give roughly 38% power to detect a correlation of 0.5, so this is not a demonstration that no age effect exists. What it does establish is narrower and sufficient: the ratio does not converge on a common value as sections mature, because sections aged between seven and eleven years sit anywhere from 0.46x to 6.61x. The hypothesis in version 4.0, that each vendor’s index fills in at its own rate and the ratio settles as a section ages, is withdrawn, and the narrowing of the area-code ratio from 27.1x to 7.5x over three months is reported as an observation on one section and not attributed. Only one prefix in the cross-section is under twenty-one months old, so the first months of a section’s life are not characterized here beyond that one case.</w:t>
+        <w:t xml:space="preserve">The cross-section shows no detectable relationship between the ratio and section age.</w:t>
+      </w:r>
+      <w:r>
+        <w:t xml:space="preserve"> </w:t>
+      </w:r>
+      <w:r>
+        <w:t xml:space="preserve">Spearman’s rank correlation between age and the unmatched visits ratio is −0.11 over twelve prefixes, with a Fisher 95% interval of −0.64 to +0.49 and a permutation p of 0.73; territory-matched it is −0.28; excluding the area-code section it is +0.15. Twelve prefixes give roughly 38% power to detect a correlation of 0.5, so this is not a demonstration that no age effect exists. What it does establish is narrower and sufficient: the ratio does not converge on a common value as sections mature, because the seven sections aged between seven and eleven years sit anywhere from 0.25x to 6.57x unmatched (0.46x to 6.61x matched). The hypothesis in version 4.0, that each vendor’s index fills in at its own rate and the ratio settles as a section ages, is withdrawn, and the narrowing of the area-code ratio from 27.1x to 7.5x over three months is reported as an observation on one section and not attributed. Only one prefix in the cross-section is under twenty-one months old, so the first months of a section’s life are not characterized here beyond that one case.</w:t>
       </w:r>
     </w:p>
     <w:p>
@@ -4951,7 +5103,7 @@
         <w:t xml:space="preserve"> </w:t>
       </w:r>
       <w:r>
-        <w:t xml:space="preserve">Unmatched for territory, Semrush’s estimate runs from one fifth of Ahrefs’ (/local/bundles/, 0.20x) to seven times it (/local/area-codes/, 7.24x), a spread of 1.55 orders of magnitude, with a median of 1.01 and six of twelve prefixes below one. Matched for territory the spread is wider (0.20x to 8.89x), the median is 1.06, and four of twelve are below one, because two of the six sub-one prefixes have large non-US shares (/es-us/local/ at 43% US, /product-compare/ at 70%) that the matching corrects. The territory objection therefore changes the count and not the conclusion: on the same domain, on the same day, the vendors’ estimates differ by factors from well below one to well above it, and no single correction factor maps one onto the other.</w:t>
+        <w:t xml:space="preserve">Unmatched for territory, Semrush’s estimate runs from one fifth of Ahrefs’ (/local/bundles/, 0.20x) to seven times it (/local/area-codes/, 7.24x), a spread of 1.55 orders of magnitude, with a median of 1.01 and six of twelve prefixes below one. Matched for territory the spread is wider (0.20x to 8.89x), the median is 1.06, and four of twelve are below one, because two of the six sub-one prefixes cross one once their non-US traffic is removed (/product-compare/, 70% US, from 0.75x to 1.07x; /device-compare/, 83% US, from 0.99x to 1.20x); /es-us/local/, at 43% US, moves from 0.25x to 0.58x and stays below one. The territory objection therefore changes the count and not the conclusion: on the same domain, on the same day, the vendors’ estimates differ by factors from well below one to well above it, and no single correction factor maps one onto the other.</w:t>
       </w:r>
     </w:p>
     <w:p>
@@ -4969,22 +5121,7 @@
         <w:t xml:space="preserve"> </w:t>
       </w:r>
       <w:r>
-        <w:t xml:space="preserve">Across the twelve prefixes, the rank correlation between the two instruments’ visit estimates is +0.94 (Kendall’s tau +0.82, 60 of 66 pairs concordant). Version 4.6 concluded from the ratio spread that a single-vendor comparison between two sections</w:t>
-      </w:r>
-      <w:r>
-        <w:t xml:space="preserve"> </w:t>
-      </w:r>
-      <w:r>
-        <w:t xml:space="preserve">“</w:t>
-      </w:r>
-      <w:r>
-        <w:t xml:space="preserve">carries an unknown sign</w:t>
-      </w:r>
-      <w:r>
-        <w:t xml:space="preserve">”</w:t>
-      </w:r>
-      <w:r>
-        <w:t xml:space="preserve">. That overstated it. The vendors agree on which section is larger in 60 of 66 pairs; what has unknown sign and magnitude is the</w:t>
+        <w:t xml:space="preserve">Across the twelve prefixes, the rank correlation between the two instruments’ visit estimates is +0.94 (Kendall’s tau +0.82, 60 of 66 pairs concordant). The vendors agree on which section is larger in 60 of 66 pairs; what has unknown sign and magnitude is the</w:t>
       </w:r>
       <w:r>
         <w:t xml:space="preserve"> </w:t>
@@ -5054,7 +5191,7 @@
         <w:t xml:space="preserve"> </w:t>
       </w:r>
       <w:r>
-        <w:t xml:space="preserve">Semrush’s AI-visibility panel reported 158.3K mentions and 29.5K cited pages for every one of the twelve subfolders, identically. Those figures are domain-scoped whatever prefix is queried. Section 5.3’s withdrawal of the 9.2x AI-answer comparison, made in version 4.1 by inference from the page count, is confirmed by observation.</w:t>
+        <w:t xml:space="preserve">Semrush’s AI-visibility panel reported 158.3K mentions and 29.5K cited pages for every one of the twelve subfolders, identically, on 12 October (Section 5.3 quotes the 10 October read of 158,100 and 29,600). Those figures are domain-scoped whatever prefix is queried. Section 5.3’s withdrawal of the 9.2x AI-answer comparison, made in version 4.1 by inference from the page count, is confirmed by observation.</w:t>
       </w:r>
     </w:p>
     <w:p>
@@ -5072,7 +5209,7 @@
         <w:t xml:space="preserve"> </w:t>
       </w:r>
       <w:r>
-        <w:t xml:space="preserve">Twelve prefixes, one domain, one read date; the age proxy is a chart read, left-censored at September 2015 for three prefixes; one prefix under twenty-one months; the territory match uses each prefix’s US share as the instrument reports it. A second domain and a second read date are the next step, and neither needs this provider.</w:t>
+        <w:t xml:space="preserve">Twelve prefixes, one domain, one read date; the age proxy is a chart read, left-censored at September 2015 for one prefix and close to that horizon for two more; one prefix under twenty-one months; the territory match uses each prefix’s US share as the instrument reports it. A second domain and a second read date are the next step, and neither needs this provider.</w:t>
       </w:r>
     </w:p>
     <w:bookmarkEnd w:id="48"/>
@@ -5100,7 +5237,7 @@
         <w:t xml:space="preserve"> </w:t>
       </w:r>
       <w:r>
-        <w:t xml:space="preserve">There is no ground truth here. Neither vendor’s figure can be checked against a counted visit, because the provider’s analytics are not available to us. Divergence is therefore not error, and version 4.0 of this manuscript wrote that it was. What two readings A and B of one quantity with true value T license is a bound on the larger error and nothing more:</w:t>
+        <w:t xml:space="preserve">There is no ground truth here. Neither vendor’s figure can be checked against a counted visit, because the provider’s analytics were not available for this study. Divergence is therefore not error. What two readings A and B of one quantity with true value T license is a bound on the larger error and nothing more:</w:t>
       </w:r>
     </w:p>
     <w:p>
@@ -5116,7 +5253,7 @@
         <w:pStyle w:val="BodyText"/>
       </w:pPr>
       <w:r>
-        <w:t xml:space="preserve">At the August ratio of 27.1x, at least one of the two instruments is wrong about this prefix by more than an order of magnitude, and this study cannot say which. That is the whole of the inference, and it is enough to be worth reporting: a field that treats these outputs as measurements should know that at least one major vendor can be off by 13x on a two-month-old section, without knowing which one.</w:t>
+        <w:t xml:space="preserve">At the August ratio of 27.1x, the two readings cannot both lie within a factor of 5.2, the square root of 27.1, of the true value, so at least one instrument is off about this prefix by a factor of five or more, and this study cannot say which. In absolute terms the bound is larger: at least one reading errs by at least 13 times the smaller reading. That is the whole of the inference, and it is enough to be worth reporting: a field that treats these outputs as measurements should know that at least one major vendor can be off by a factor of five or more on a two-month-old section, without knowing which one.</w:t>
       </w:r>
     </w:p>
     <w:p>
@@ -5192,7 +5329,7 @@
         <w:t xml:space="preserve"> </w:t>
       </w:r>
       <w:r>
-        <w:t xml:space="preserve">against the 7.5x in the table. We report the conservative pairing in the table and state the matched ones here.</w:t>
+        <w:t xml:space="preserve">against the 7.5x in the table. The table reports the conservative pairing; the matched ones are stated here.</w:t>
       </w:r>
     </w:p>
     <w:p>
@@ -5210,7 +5347,7 @@
         <w:t xml:space="preserve"> </w:t>
       </w:r>
       <w:r>
-        <w:t xml:space="preserve">The design this bears on is the standard one in applied content work: publish something, read one dashboard, compare it against the rest of the site or against a competitor. Section 5.5 is the finding that bears on it most directly. Across twelve sections of one domain the vendor ratio on estimated visits spans 0.20x to 7.24x (0.20x to 8.89x territory-matched), so no domain-level calibration factor can convert one vendor’s figure into the other’s. The vendors agree on which of two sections is larger in 60 of 66 pairs, so a single-vendor ranking of sections is usually right in direction; the magnitude of any difference, and any ratio between a section’s figure on one vendor and another section’s on the other, can be off by an order of magnitude either way. An effect of the size applied papers usually report is small against that. Reporting both vendors does not resolve which is right; it makes the uncertainty visible, and reporting one hides it.</w:t>
+        <w:t xml:space="preserve">The design this bears on is the standard one in applied content work: publish something, read one dashboard, compare it against the rest of the site or against a competitor. Section 5.5 is the finding that bears on it most directly. Across twelve sections of one domain the vendor ratio on estimated visits spans 0.20x to 7.24x (0.20x to 8.89x territory-matched), so no domain-level calibration factor can convert one vendor’s figure into the other’s. The vendors agree on which of two sections is larger in 60 of 66 pairs, so a single-vendor ranking of sections is usually right in direction; the magnitude of any difference, and any ratio between a section’s figure on one vendor and another section’s on the other, can be off by a factor of five below to nearly nine above. An effect of the size applied papers usually report is small against that. Reporting both vendors does not resolve which is right; it makes the uncertainty visible, and reporting one hides it.</w:t>
       </w:r>
     </w:p>
     <w:p>
@@ -5228,7 +5365,7 @@
         <w:t xml:space="preserve"> </w:t>
       </w:r>
       <w:r>
-        <w:t xml:space="preserve">One domain, one vendor pair, no ground truth; the longitudinal series is one prefix over 77 days and the cross-section is twelve prefixes on one date. What is established is that disagreements of an order of magnitude occur in both directions between sections of one site, that they are unrelated to section age, and that keyword-universe size does not predict them. What is not established is which instrument is closer to the truth for any section, or what determines the ratio. Section 11 sets out the next step: a second domain, a second read date, and a per-section territory match.</w:t>
+        <w:t xml:space="preserve">One domain, one vendor pair, no ground truth; the longitudinal series is one prefix over 77 days and the cross-section is twelve prefixes on one date. What is established is that disagreements of up to an order of magnitude occur in both directions between sections of one site, from a factor of five below to nearly nine above, that no relationship with section age is detectable across twelve sections, only one of them under twenty-one months old, and that keyword-universe size does not predict them. What is not established is which instrument is closer to the truth for any section, or what determines the ratio. Section 11 sets out the next step: a second domain and a second read date.</w:t>
       </w:r>
     </w:p>
     <w:bookmarkEnd w:id="49"/>
@@ -5312,14 +5449,15 @@
         <w:jc w:val="start"/>
       </w:tblPr>
       <w:tblGrid>
-        <w:gridCol w:w="990"/>
-        <w:gridCol w:w="990"/>
-        <w:gridCol w:w="990"/>
-        <w:gridCol w:w="990"/>
-        <w:gridCol w:w="990"/>
-        <w:gridCol w:w="990"/>
-        <w:gridCol w:w="990"/>
-        <w:gridCol w:w="990"/>
+        <w:gridCol w:w="879"/>
+        <w:gridCol w:w="879"/>
+        <w:gridCol w:w="879"/>
+        <w:gridCol w:w="879"/>
+        <w:gridCol w:w="879"/>
+        <w:gridCol w:w="879"/>
+        <w:gridCol w:w="879"/>
+        <w:gridCol w:w="879"/>
+        <w:gridCol w:w="879"/>
       </w:tblGrid>
       <w:tr>
         <w:trPr>
@@ -5425,6 +5563,18 @@
             </w:r>
           </w:p>
         </w:tc>
+        <w:tc>
+          <w:tcPr/>
+          <w:p>
+            <w:pPr>
+              <w:pStyle w:val="Compact"/>
+              <w:jc w:val="left"/>
+            </w:pPr>
+            <w:r>
+              <w:t xml:space="preserve">Day 77 (11 Oct)</w:t>
+            </w:r>
+          </w:p>
+        </w:tc>
       </w:tr>
       <w:tr>
         <w:tc>
@@ -5527,6 +5677,18 @@
             </w:r>
           </w:p>
         </w:tc>
+        <w:tc>
+          <w:tcPr/>
+          <w:p>
+            <w:pPr>
+              <w:pStyle w:val="Compact"/>
+              <w:jc w:val="left"/>
+            </w:pPr>
+            <w:r>
+              <w:t xml:space="preserve">441</w:t>
+            </w:r>
+          </w:p>
+        </w:tc>
       </w:tr>
       <w:tr>
         <w:tc>
@@ -5629,6 +5791,18 @@
             </w:r>
           </w:p>
         </w:tc>
+        <w:tc>
+          <w:tcPr/>
+          <w:p>
+            <w:pPr>
+              <w:pStyle w:val="Compact"/>
+              <w:jc w:val="left"/>
+            </w:pPr>
+            <w:r>
+              <w:t xml:space="preserve">43,980</w:t>
+            </w:r>
+          </w:p>
+        </w:tc>
       </w:tr>
       <w:tr>
         <w:tc>
@@ -5731,6 +5905,18 @@
             </w:r>
           </w:p>
         </w:tc>
+        <w:tc>
+          <w:tcPr/>
+          <w:p>
+            <w:pPr>
+              <w:pStyle w:val="Compact"/>
+              <w:jc w:val="left"/>
+            </w:pPr>
+            <w:r>
+              <w:t xml:space="preserve">9,239</w:t>
+            </w:r>
+          </w:p>
+        </w:tc>
       </w:tr>
       <w:tr>
         <w:tc>
@@ -5833,6 +6019,18 @@
             </w:r>
           </w:p>
         </w:tc>
+        <w:tc>
+          <w:tcPr/>
+          <w:p>
+            <w:pPr>
+              <w:pStyle w:val="Compact"/>
+              <w:jc w:val="left"/>
+            </w:pPr>
+            <w:r>
+              <w:t xml:space="preserve">33,560</w:t>
+            </w:r>
+          </w:p>
+        </w:tc>
       </w:tr>
       <w:tr>
         <w:tc>
@@ -5935,6 +6133,18 @@
             </w:r>
           </w:p>
         </w:tc>
+        <w:tc>
+          <w:tcPr/>
+          <w:p>
+            <w:pPr>
+              <w:pStyle w:val="Compact"/>
+              <w:jc w:val="left"/>
+            </w:pPr>
+            <w:r>
+              <w:t xml:space="preserve">n/r</w:t>
+            </w:r>
+          </w:p>
+        </w:tc>
       </w:tr>
       <w:tr>
         <w:tc>
@@ -6037,6 +6247,18 @@
             </w:r>
           </w:p>
         </w:tc>
+        <w:tc>
+          <w:tcPr/>
+          <w:p>
+            <w:pPr>
+              <w:pStyle w:val="Compact"/>
+              <w:jc w:val="left"/>
+            </w:pPr>
+            <w:r>
+              <w:t xml:space="preserve">n/r</w:t>
+            </w:r>
+          </w:p>
+        </w:tc>
       </w:tr>
       <w:tr>
         <w:tc>
@@ -6139,6 +6361,18 @@
             </w:r>
           </w:p>
         </w:tc>
+        <w:tc>
+          <w:tcPr/>
+          <w:p>
+            <w:pPr>
+              <w:pStyle w:val="Compact"/>
+              <w:jc w:val="left"/>
+            </w:pPr>
+            <w:r>
+              <w:t xml:space="preserve">n/r</w:t>
+            </w:r>
+          </w:p>
+        </w:tc>
       </w:tr>
       <w:tr>
         <w:tc>
@@ -6241,6 +6475,18 @@
             </w:r>
           </w:p>
         </w:tc>
+        <w:tc>
+          <w:tcPr/>
+          <w:p>
+            <w:pPr>
+              <w:pStyle w:val="Compact"/>
+              <w:jc w:val="left"/>
+            </w:pPr>
+            <w:r>
+              <w:t xml:space="preserve">913</w:t>
+            </w:r>
+          </w:p>
+        </w:tc>
       </w:tr>
       <w:tr>
         <w:tc>
@@ -6343,6 +6589,18 @@
             </w:r>
           </w:p>
         </w:tc>
+        <w:tc>
+          <w:tcPr/>
+          <w:p>
+            <w:pPr>
+              <w:pStyle w:val="Compact"/>
+              <w:jc w:val="left"/>
+            </w:pPr>
+            <w:r>
+              <w:t xml:space="preserve">17,206</w:t>
+            </w:r>
+          </w:p>
+        </w:tc>
       </w:tr>
     </w:tbl>
     <w:p>
@@ -6350,15 +6608,15 @@
         <w:pStyle w:val="BodyText"/>
       </w:pPr>
       <w:r>
-        <w:t xml:space="preserve">The 21–100 row is derived as the total less the three reported bands, because Section 4.1 defines a ranking position as positions 1–100 while the instrument reports only three bands and the total. It is arithmetic on vendor estimates and not a fourth measurement. It closes every full column.</w:t>
-      </w:r>
-    </w:p>
-    <w:p>
-      <w:pPr>
-        <w:pStyle w:val="BodyText"/>
-      </w:pPr>
-      <w:r>
-        <w:t xml:space="preserve">Day 60 and day 75 fall inside the window the Ahrefs data notice covers. The estimated-visits peak at day 60 coincides with the first day of the spam update, and the subsequent fall is consistent with either a data artifact or a ranking change. We do not distinguish them.</w:t>
+        <w:t xml:space="preserve">The 21–100 row is derived as the total less the three reported bands, because Section 4.1 defines a ranking position as positions 1–100 while the instrument reports only three bands and the total. It is arithmetic on vendor estimates and not a fourth measurement. It closes every full column. Day 77 is the last read of the series and the one the abstract and this section quote; positions 11–20 were not captured that day, so the 21–100 row cannot be derived for it, and the daily visits series was read only to day 75 (the October run-rate in Table 2 is a different construct). Its referring-domain figure is the instrument’s overview count, which differs from its daily series (Section 8).</w:t>
+      </w:r>
+    </w:p>
+    <w:p>
+      <w:pPr>
+        <w:pStyle w:val="BodyText"/>
+      </w:pPr>
+      <w:r>
+        <w:t xml:space="preserve">Day 75 falls inside the window the Ahrefs data notice covers, and day 60 is the first day of the spam update. The estimated-visits peak at day 60 coincides with that day, and the subsequent fall is consistent with either a data artifact or a ranking change; this study does not distinguish them.</w:t>
       </w:r>
     </w:p>
     <w:p>
@@ -6385,85 +6643,31 @@
           <w:bCs/>
           <w:b/>
         </w:rPr>
-        <w:t xml:space="preserve">Concentration, with a defect in the earlier reporting of it.</w:t>
-      </w:r>
-      <w:r>
-        <w:t xml:space="preserve"> </w:t>
-      </w:r>
-      <w:r>
-        <w:t xml:space="preserve">Version 4.0 wrote that</w:t>
-      </w:r>
-      <w:r>
-        <w:t xml:space="preserve"> </w:t>
-      </w:r>
-      <w:r>
-        <w:t xml:space="preserve">“</w:t>
-      </w:r>
-      <w:r>
-        <w:t xml:space="preserve">the result is broad rather than driven by a few pages</w:t>
-      </w:r>
-      <w:r>
-        <w:t xml:space="preserve">”</w:t>
-      </w:r>
-      <w:r>
-        <w:t xml:space="preserve"> </w:t>
-      </w:r>
-      <w:r>
-        <w:t xml:space="preserve">and then gave figures that contradict it and each other. Of the 441 URLs holding a position, the ten highest-traffic carry 22.8% of estimated visits and the top 50 carry 64.9%. Fifty of 441 is 11% of the pages carrying about two thirds of the estimated traffic, which is concentration, not breadth. The paragraph also reported that 88.9% of pages receive 1 to 1,000 estimated visits a month and</w:t>
-      </w:r>
-      <w:r>
-        <w:t xml:space="preserve"> </w:t>
-      </w:r>
-      <w:r>
-        <w:t xml:space="preserve">“</w:t>
-      </w:r>
-      <w:r>
-        <w:t xml:space="preserve">together carry 64%</w:t>
-      </w:r>
-      <w:r>
-        <w:t xml:space="preserve">”</w:t>
-      </w:r>
-      <w:r>
-        <w:t xml:space="preserve">, which cannot hold alongside the top-50 figure on the same denominator without a single page carrying roughly 29% of about 222,000 estimated visits, against the same paragraph’s claim that none exceeds 10,000. At least one of the three figures is computed on a different denominator than the other two, and the source reads that would establish which have not been repeated.</w:t>
-      </w:r>
-    </w:p>
-    <w:p>
-      <w:pPr>
-        <w:pStyle w:val="BodyText"/>
-      </w:pPr>
-      <w:r>
-        <w:t xml:space="preserve">What is reported here is therefore only what is internally consistent:</w:t>
-      </w:r>
-      <w:r>
-        <w:t xml:space="preserve"> </w:t>
-      </w:r>
+        <w:t xml:space="preserve">Concentration.</w:t>
+      </w:r>
+      <w:r>
+        <w:t xml:space="preserve"> </w:t>
+      </w:r>
+      <w:r>
+        <w:t xml:space="preserve">Of the 441 URLs holding a position on 11 October, the ten highest-traffic carry 22.8% of estimated visits and the top 50 carry 64.9%, both from one instrument and both on a universe selected by the outcome. Fifty of 441 is 11% of the pages carrying about two thirds of the estimated traffic, which is concentration, not breadth; an earlier claim of breadth is withdrawn (Appendix A).</w:t>
+      </w:r>
+    </w:p>
+    <w:p>
+      <w:pPr>
+        <w:pStyle w:val="BodyText"/>
+      </w:pPr>
       <w:r>
         <w:rPr>
           <w:bCs/>
           <w:b/>
         </w:rPr>
-        <w:t xml:space="preserve">the ten highest-traffic URLs carry 22.8% and the top 50 carry 64.9% of estimated visits</w:t>
-      </w:r>
-      <w:r>
-        <w:t xml:space="preserve">, both on the 441 URLs holding a position on 11 October, both from one instrument, and both on a universe selected by the outcome. The breadth claim is withdrawn.</w:t>
-      </w:r>
-    </w:p>
-    <w:p>
-      <w:pPr>
-        <w:pStyle w:val="BodyText"/>
-      </w:pPr>
-      <w:r>
-        <w:rPr>
-          <w:bCs/>
-          <w:b/>
-        </w:rPr>
         <w:t xml:space="preserve">Demand the volume tools do not report.</w:t>
       </w:r>
       <w:r>
         <w:t xml:space="preserve"> </w:t>
       </w:r>
       <w:r>
-        <w:t xml:space="preserve">Among the 58,586 US keywords, the lowest-traffic rows are misspellings, non-English forms, numeric fragments and question forms with 40 to 170 reported searches a month or none at all. The section ranks in 105 countries, with 18.5% of Ahrefs-estimated visits from outside the US. We state this as a distributional observation and not as a test; the per-page threshold test that would make it one requires the full per-page keyword export matched to pre-launch reported volume, which we have not run.</w:t>
+        <w:t xml:space="preserve">Among the 58,586 US keywords, the lowest-traffic rows are misspellings, non-English forms, numeric fragments and question forms with 40 to 170 reported searches a month or none at all. The section ranks in 105 countries, with 18.5% of Ahrefs-estimated visits from outside the US. This is stated as a distributional observation and not as a test; the per-page threshold test that would make it one requires the full per-page keyword export matched to pre-launch reported volume, which has not been run.</w:t>
       </w:r>
     </w:p>
     <w:bookmarkEnd w:id="51"/>
@@ -6571,15 +6775,15 @@
         <w:t xml:space="preserve"> </w:t>
       </w:r>
       <w:r>
-        <w:t xml:space="preserve">is answered most directly by the 214 page, and that page is cited less than the page listing every Texas code. If this generalizes, enumerating pages are more citable than per-entity pages for this class of question, and the unit a content programme should publish is not the unit the question names.</w:t>
-      </w:r>
-    </w:p>
-    <w:p>
-      <w:pPr>
-        <w:pStyle w:val="BodyText"/>
-      </w:pPr>
-      <w:r>
-        <w:t xml:space="preserve">We note it as an observation on one section. It is the finding in this paper most worth testing elsewhere, and testing it needs no access to this deployment: any site with both hub and per-entity pages on an enumerable class can check it.</w:t>
+        <w:t xml:space="preserve">is answered most directly by the 214 page, and that page is cited less than the page listing every Texas code. If this generalizes, enumerating pages are more citable than per-entity pages for this class of question, and the unit a content program should publish is not the unit the question names.</w:t>
+      </w:r>
+    </w:p>
+    <w:p>
+      <w:pPr>
+        <w:pStyle w:val="BodyText"/>
+      </w:pPr>
+      <w:r>
+        <w:t xml:space="preserve">It is an observation on one section. It is the finding in this paper most worth testing elsewhere, and testing it needs no access to this deployment: any site with both hub and per-entity pages on an enumerable class can check it.</w:t>
       </w:r>
     </w:p>
     <w:bookmarkEnd w:id="55"/>
@@ -6597,7 +6801,7 @@
         <w:pStyle w:val="FirstParagraph"/>
       </w:pPr>
       <w:r>
-        <w:t xml:space="preserve">The queries are held, and the AI answers supplied, by encyclopedic and directory sites. The five domains with the largest keyword overlap with the section are two area-code directories, a time-zone reference and two voice vendors, at Domain Ratings between 13 and 83. Wikipedia, at 97, is co-cited in roughly 11,000 of the answers that cite the section. Two carriers of comparable authority are co-cited 9 times (Verizon, DR 91) and 240 times (T-Mobile, DR 87), against the section’s 17,206. Neither published a page per code.</w:t>
+        <w:t xml:space="preserve">The queries are held, and the AI answers supplied, by encyclopedic and directory sites. The five domains with the largest keyword overlap with the section are two area-code directories, a time-zone reference and two voice vendors, at Domain Ratings between 13 and 83. Wikipedia, at 97, is co-cited in roughly 11,000 of the answers that cite the section. Two other national carriers of comparable authority are co-cited 9 times (Domain Rating 91) and 240 times (Domain Rating 87), against the section’s 17,206. Neither published a page per code.</w:t>
       </w:r>
     </w:p>
     <w:p>
@@ -6633,7 +6837,7 @@
         <w:pStyle w:val="BodyText"/>
       </w:pPr>
       <w:r>
-        <w:t xml:space="preserve">The comparison that would establish it is outcome-independent and has not been run: the registry’s codes crossed with a fixed set of verbalizations, queried without reference to who is cited, so that each domain’s presence is measured on a denominator none of them selected. Section 11 registers it and Section 12 records that it remains undone.</w:t>
+        <w:t xml:space="preserve">The comparison that would establish it is outcome-independent and has not been run: the registry’s codes crossed with a fixed set of verbalizations, queried without reference to who is cited, so that each domain’s presence is measured on a denominator none of them selected. Section 11 registers it.</w:t>
       </w:r>
     </w:p>
     <w:bookmarkEnd w:id="56"/>
@@ -6700,11 +6904,12 @@
         <w:jc w:val="start"/>
       </w:tblPr>
       <w:tblGrid>
-        <w:gridCol w:w="1584"/>
-        <w:gridCol w:w="1584"/>
-        <w:gridCol w:w="1584"/>
-        <w:gridCol w:w="1584"/>
-        <w:gridCol w:w="1584"/>
+        <w:gridCol w:w="1320"/>
+        <w:gridCol w:w="1320"/>
+        <w:gridCol w:w="1320"/>
+        <w:gridCol w:w="1320"/>
+        <w:gridCol w:w="1320"/>
+        <w:gridCol w:w="1320"/>
       </w:tblGrid>
       <w:tr>
         <w:trPr>
@@ -6742,6 +6947,18 @@
               <w:jc w:val="left"/>
             </w:pPr>
             <w:r>
+              <w:t xml:space="preserve">Domains gained</w:t>
+            </w:r>
+          </w:p>
+        </w:tc>
+        <w:tc>
+          <w:tcPr/>
+          <w:p>
+            <w:pPr>
+              <w:pStyle w:val="Compact"/>
+              <w:jc w:val="left"/>
+            </w:pPr>
+            <w:r>
               <w:t xml:space="preserve">Positions gained</w:t>
             </w:r>
           </w:p>
@@ -6804,6 +7021,18 @@
               <w:jc w:val="left"/>
             </w:pPr>
             <w:r>
+              <w:t xml:space="preserve">1</w:t>
+            </w:r>
+          </w:p>
+        </w:tc>
+        <w:tc>
+          <w:tcPr/>
+          <w:p>
+            <w:pPr>
+              <w:pStyle w:val="Compact"/>
+              <w:jc w:val="left"/>
+            </w:pPr>
+            <w:r>
               <w:t xml:space="preserve">3,383</w:t>
             </w:r>
           </w:p>
@@ -6866,6 +7095,18 @@
               <w:jc w:val="left"/>
             </w:pPr>
             <w:r>
+              <w:t xml:space="preserve">18</w:t>
+            </w:r>
+          </w:p>
+        </w:tc>
+        <w:tc>
+          <w:tcPr/>
+          <w:p>
+            <w:pPr>
+              <w:pStyle w:val="Compact"/>
+              <w:jc w:val="left"/>
+            </w:pPr>
+            <w:r>
               <w:t xml:space="preserve">11,520</w:t>
             </w:r>
           </w:p>
@@ -6916,7 +7157,19 @@
               <w:jc w:val="left"/>
             </w:pPr>
             <w:r>
-              <w:t xml:space="preserve">19</w:t>
+              <w:t xml:space="preserve">19 to 19</w:t>
+            </w:r>
+          </w:p>
+        </w:tc>
+        <w:tc>
+          <w:tcPr/>
+          <w:p>
+            <w:pPr>
+              <w:pStyle w:val="Compact"/>
+              <w:jc w:val="left"/>
+            </w:pPr>
+            <w:r>
+              <w:t xml:space="preserve">0</w:t>
             </w:r>
           </w:p>
         </w:tc>
@@ -6990,6 +7243,18 @@
               <w:jc w:val="left"/>
             </w:pPr>
             <w:r>
+              <w:t xml:space="preserve">396</w:t>
+            </w:r>
+          </w:p>
+        </w:tc>
+        <w:tc>
+          <w:tcPr/>
+          <w:p>
+            <w:pPr>
+              <w:pStyle w:val="Compact"/>
+              <w:jc w:val="left"/>
+            </w:pPr>
+            <w:r>
               <w:t xml:space="preserve">4,496</w:t>
             </w:r>
           </w:p>
@@ -7040,7 +7305,19 @@
               <w:jc w:val="left"/>
             </w:pPr>
             <w:r>
-              <w:t xml:space="preserve">415</w:t>
+              <w:t xml:space="preserve">415 to 828</w:t>
+            </w:r>
+          </w:p>
+        </w:tc>
+        <w:tc>
+          <w:tcPr/>
+          <w:p>
+            <w:pPr>
+              <w:pStyle w:val="Compact"/>
+              <w:jc w:val="left"/>
+            </w:pPr>
+            <w:r>
+              <w:t xml:space="preserve">413</w:t>
             </w:r>
           </w:p>
         </w:tc>
@@ -7102,7 +7379,19 @@
               <w:jc w:val="left"/>
             </w:pPr>
             <w:r>
-              <w:t xml:space="preserve">828</w:t>
+              <w:t xml:space="preserve">828 to 909</w:t>
+            </w:r>
+          </w:p>
+        </w:tc>
+        <w:tc>
+          <w:tcPr/>
+          <w:p>
+            <w:pPr>
+              <w:pStyle w:val="Compact"/>
+              <w:jc w:val="left"/>
+            </w:pPr>
+            <w:r>
+              <w:t xml:space="preserve">81</w:t>
             </w:r>
           </w:p>
         </w:tc>
@@ -7153,7 +7442,7 @@
           <wp:inline>
             <wp:extent cx="5334000" cy="3515313"/>
             <wp:effectExtent b="0" l="0" r="0" t="0"/>
-            <wp:docPr descr="Figure 6. Ranking positions and the link profile over 77 days. Upper panel: ranking positions in positions 1 to 100 and in positions 1 to 3, Ahrefs daily series for the prefix, all locations, read 11 October 2026; the hatched band is the interval in which the automated link network arrived; the vertical rules mark the primary checkpoint (day 37), the September 2026 spam update (day 60) and the vendor data-reliability notice (day 65); live referring domains at each checkpoint are printed along the top. Lower panel: positions gained per day in each interval of Table 6, shaded by link status." title="" id="59" name="Picture"/>
+            <wp:docPr descr="Figure 6. Ranking positions and the link profile over 77 days. Upper panel: ranking positions in positions 1 to 100 and in positions 1 to 3, Ahrefs daily series for the prefix, all locations, read 11 October 2026; the hatched band is the interval in which the automated link network arrived; the vertical rules mark the primary checkpoint (day 37), the September 2026 spam update (day 60) and the vendor data-reliability notice (day 65); live referring domains at each checkpoint are printed along the top. Lower panel: positions gained per day in each interval of Table 6, shaded by link status. The upper panel also plots two reads from the same daily series that are not checkpoints in Table 5: day 6 (984 positions, 186 in 1–3) and day 67 (38,801 and 6,942)." title="" id="59" name="Picture"/>
             <a:graphic>
               <a:graphicData uri="http://schemas.openxmlformats.org/drawingml/2006/picture">
                 <pic:pic>
@@ -7196,7 +7485,7 @@
         <w:pStyle w:val="ImageCaption"/>
       </w:pPr>
       <w:r>
-        <w:t xml:space="preserve">Figure 6. Ranking positions and the link profile over 77 days. Upper panel: ranking positions in positions 1 to 100 and in positions 1 to 3, Ahrefs daily series for the prefix, all locations, read 11 October 2026; the hatched band is the interval in which the automated link network arrived; the vertical rules mark the primary checkpoint (day 37), the September 2026 spam update (day 60) and the vendor data-reliability notice (day 65); live referring domains at each checkpoint are printed along the top. Lower panel: positions gained per day in each interval of Table 6, shaded by link status.</w:t>
+        <w:t xml:space="preserve">Figure 6. Ranking positions and the link profile over 77 days. Upper panel: ranking positions in positions 1 to 100 and in positions 1 to 3, Ahrefs daily series for the prefix, all locations, read 11 October 2026; the hatched band is the interval in which the automated link network arrived; the vertical rules mark the primary checkpoint (day 37), the September 2026 spam update (day 60) and the vendor data-reliability notice (day 65); live referring domains at each checkpoint are printed along the top. Lower panel: positions gained per day in each interval of Table 6, shaded by link status. The upper panel also plots two reads from the same daily series that are not checkpoints in Table 5: day 6 (984 positions, 186 in 1–3) and day 67 (38,801 and 6,942).</w:t>
       </w:r>
     </w:p>
     <w:p>
@@ -7258,7 +7547,7 @@
         <w:t xml:space="preserve"> </w:t>
       </w:r>
       <w:r>
-        <w:t xml:space="preserve">The fastest clean interval, 768 a day across days 15 to 30, is 37% faster than the 562 a day of the arrival interval. A draft of this section reported only the last four intervals and inferred an acceleration from the 132-a-day trough immediately before the arrival; that is a baseline selected at the series minimum, and the inference does not survive showing all six. A 441-page section entering an index does not grow linearly. The network is therefore</w:t>
+        <w:t xml:space="preserve">The fastest clean interval, 768 a day across days 15 to 30, is 37% faster than the 562 a day of the arrival interval. Reading the 132-a-day trough immediately before the arrival as a baseline would suggest an acceleration; that baseline sits at the series minimum, and the inference does not survive showing all six intervals. A 441-page section entering an index does not grow linearly. The network is therefore</w:t>
       </w:r>
       <w:r>
         <w:t xml:space="preserve"> </w:t>
@@ -7289,7 +7578,7 @@
         <w:t xml:space="preserve"> </w:t>
       </w:r>
       <w:r>
-        <w:t xml:space="preserve">The provider has an exposure this paper discloses rather than analyses: a spam link profile pointed at a live section, which the provider has been asked to review. A manual action before a later checkpoint would confound any continuation of this series. The author did not commission, purchase or solicit any link to the section.</w:t>
+        <w:t xml:space="preserve">The provider has an exposure this paper discloses rather than analyzes: a spam link profile pointed at a live section, which the provider has been asked to review. A manual action before a later checkpoint would confound any continuation of this series. The author did not commission, purchase or solicit any link to the section.</w:t>
       </w:r>
     </w:p>
     <w:bookmarkEnd w:id="61"/>
@@ -7635,7 +7924,7 @@
         <w:t xml:space="preserve"> </w:t>
       </w:r>
       <w:r>
-        <w:t xml:space="preserve">conditions 1 to 3 of Section 3.1 held, and they do not hold for most classes. And the dominant cost was analysis rather than production, which inverts the usual content-programme cost structure and is the part a reader should expect to pay.</w:t>
+        <w:t xml:space="preserve">conditions 1 to 3 of Section 3.1 held, and they do not hold for most classes. And the dominant cost was analysis rather than production, which inverts the usual content-program cost structure and is the part a reader should expect to pay.</w:t>
       </w:r>
     </w:p>
     <w:bookmarkEnd w:id="63"/>
@@ -7675,7 +7964,7 @@
         <w:t xml:space="preserve"> </w:t>
       </w:r>
       <w:r>
-        <w:t xml:space="preserve">We did not, so the demand layer derives from what competitors already rank for. Cost: the method claim, which is why Appendix B’s score is a specification and not a result.</w:t>
+        <w:t xml:space="preserve">This deployment did not, so its demand layer derives from what competitors already rank for. Cost: an evaluated method claim; the framework is specified in Appendix B, and this deployment cannot serve as its validation.</w:t>
       </w:r>
     </w:p>
     <w:p>
@@ -7697,7 +7986,7 @@
         <w:t xml:space="preserve"> </w:t>
       </w:r>
       <w:r>
-        <w:t xml:space="preserve">We did not, so every share in this paper would otherwise be computed on a denominator selected by the outcome. Cost: all comparative claims. The released implementation makes freezing a command so the failure is harder to repeat.</w:t>
+        <w:t xml:space="preserve">This deployment did not, so every share in this paper would otherwise be computed on a denominator selected by the outcome. Cost: all comparative claims. The released implementation makes freezing a command so the failure is harder to repeat.</w:t>
       </w:r>
     </w:p>
     <w:p>
@@ -7719,7 +8008,7 @@
         <w:t xml:space="preserve"> </w:t>
       </w:r>
       <w:r>
-        <w:t xml:space="preserve">We collected none: no forum, Q&amp;A, video, social or review data was linked to any entity. Cost: any user-centred framing, which is why this paper’s title does not carry one.</w:t>
+        <w:t xml:space="preserve">This deployment collected none: no forum, Q&amp;A, video, social or review data was linked to any entity. Cost: the deployment cannot show that the framework’s user-question layer did any work; that layer is specified in Appendix B and is untested here.</w:t>
       </w:r>
     </w:p>
     <w:p>
@@ -7811,7 +8100,7 @@
         <w:t xml:space="preserve">Instrumentation</w:t>
       </w:r>
       <w:r>
-        <w:t xml:space="preserve">, which is this paper’s subject rather than a caveat on it. No outcome is a measured visit. On the area-code prefix the two instruments differ by 7.5x to 27.1x on estimated visits, 2.0x on ranking keywords and 11.4x on referring domains; across twelve prefixes of the same domain the visits ratio runs from 0.20x to 8.89x. A fourth comparison, on AI answers, is withdrawn in Section 5.3 as a scope mismatch rather than a divergence. One instrument posted a data-reliability notice covering days 60 to 75. Internal analytics would resolve much of this and are not available.</w:t>
+        <w:t xml:space="preserve">, which is the subject of Section 5 rather than a caveat on it. No outcome is a measured visit. On the area-code prefix the two instruments differ by 7.5x to 27.1x on estimated visits, 2.0x on ranking keywords and 11.4x on referring domains; across twelve prefixes of the same domain the visits ratio runs from 0.20x to 8.89x. A fourth comparison, on AI answers, is withdrawn in Section 5.3 as a scope mismatch rather than a divergence. One instrument posted a data-reliability notice covering days 65 to 75. Internal analytics would resolve much of this and are not available.</w:t>
       </w:r>
     </w:p>
     <w:p>
@@ -7829,43 +8118,7 @@
         <w:t xml:space="preserve"> </w:t>
       </w:r>
       <w:r>
-        <w:t xml:space="preserve">One bookkeeping correction first: version 4.0 said</w:t>
-      </w:r>
-      <w:r>
-        <w:t xml:space="preserve"> </w:t>
-      </w:r>
-      <w:r>
-        <w:t xml:space="preserve">“</w:t>
-      </w:r>
-      <w:r>
-        <w:t xml:space="preserve">two</w:t>
-      </w:r>
-      <w:r>
-        <w:t xml:space="preserve">”</w:t>
-      </w:r>
-      <w:r>
-        <w:t xml:space="preserve"> </w:t>
-      </w:r>
-      <w:r>
-        <w:t xml:space="preserve">and</w:t>
-      </w:r>
-      <w:r>
-        <w:t xml:space="preserve"> </w:t>
-      </w:r>
-      <w:r>
-        <w:t xml:space="preserve">“</w:t>
-      </w:r>
-      <w:r>
-        <w:t xml:space="preserve">three</w:t>
-      </w:r>
-      <w:r>
-        <w:t xml:space="preserve">”</w:t>
-      </w:r>
-      <w:r>
-        <w:t xml:space="preserve"> </w:t>
-      </w:r>
-      <w:r>
-        <w:t xml:space="preserve">algorithm updates in adjacent sentences while Section 4.3 names one.</w:t>
+        <w:t xml:space="preserve">Domain authority: direction positive, magnitude unknown,</w:t>
       </w:r>
       <w:r>
         <w:t xml:space="preserve"> </w:t>
@@ -7875,34 +8128,28 @@
           <w:bCs/>
           <w:b/>
         </w:rPr>
-        <w:t xml:space="preserve">One</w:t>
-      </w:r>
-      <w:r>
-        <w:t xml:space="preserve"> </w:t>
-      </w:r>
-      <w:r>
-        <w:t xml:space="preserve">named, dated update falls in the window, the September 2026 spam update beginning 24 September (day 60). Whether others occurred unannounced is not knowable from here, and the text no longer implies a count it cannot support.</w:t>
-      </w:r>
-    </w:p>
-    <w:p>
-      <w:pPr>
-        <w:pStyle w:val="BodyText"/>
-      </w:pPr>
-      <w:r>
-        <w:t xml:space="preserve">Domain authority: direction positive, magnitude unknown,</w:t>
-      </w:r>
-      <w:r>
-        <w:t xml:space="preserve"> </w:t>
-      </w:r>
+        <w:t xml:space="preserve">no bound available</w:t>
+      </w:r>
+      <w:r>
+        <w:t xml:space="preserve">. An earlier version named the carrier comparison in Section 7.2 as a bound; that comparison is computed on a set selected on the provider’s presence and bounds nothing. Content quality and execution: templating, registry facts, structured markup and internal linking are perfectly confounded with selection; direction positive; no estimate. Topic contest: no defender responded. The automated link network: between 53.1% and 63.4% of day-75 positions postdate its arrival, the range reflecting that the arrival is dated only to an eight-day interval; direction unknown, magnitude unestimated, and confounded with index maturation and with the September spam update. Algorithm updates: one named, dated update falls in the window, on the day of the traffic peak; whether unannounced ones did is not knowable from here.</w:t>
+      </w:r>
+    </w:p>
+    <w:p>
+      <w:pPr>
+        <w:pStyle w:val="BodyText"/>
+      </w:pPr>
       <w:r>
         <w:rPr>
           <w:bCs/>
           <w:b/>
         </w:rPr>
-        <w:t xml:space="preserve">no bound available</w:t>
-      </w:r>
-      <w:r>
-        <w:t xml:space="preserve">. An earlier version named the carrier comparison in Section 7.2 as a bound; that comparison is computed on a set selected on the provider’s presence and bounds nothing. Content quality and execution: templating, registry facts, structured markup and internal linking are perfectly confounded with selection; direction positive; no estimate. Topic contest: no defender responded. The automated link network: between 53.1% and 63.4% of day-75 positions postdate its arrival, the range reflecting that the arrival is dated only to an eight-day interval; direction unknown, magnitude unestimated, and confounded with index maturation and with the September spam update. Algorithm updates: one named, dated update falls in the window, on the day of the traffic peak; whether unannounced ones did is not knowable from here.</w:t>
+        <w:t xml:space="preserve">Selection.</w:t>
+      </w:r>
+      <w:r>
+        <w:t xml:space="preserve"> </w:t>
+      </w:r>
+      <w:r>
+        <w:t xml:space="preserve">The query universes were defined after launch. Counts are reported on them; shares are reported only where the denominator is stated and flagged, or where the quantity is a ratio between two instruments on the same prefix, which selection does not affect.</w:t>
       </w:r>
     </w:p>
     <w:p>
@@ -7914,13 +8161,43 @@
           <w:bCs/>
           <w:b/>
         </w:rPr>
-        <w:t xml:space="preserve">Selection.</w:t>
-      </w:r>
-      <w:r>
-        <w:t xml:space="preserve"> </w:t>
-      </w:r>
-      <w:r>
-        <w:t xml:space="preserve">The query universes were defined after launch. Counts are reported on them; shares are reported only where the denominator is stated and flagged, or where the quantity is a ratio between two instruments on the same prefix, which selection does not affect.</w:t>
+        <w:t xml:space="preserve">Construct.</w:t>
+      </w:r>
+      <w:r>
+        <w:t xml:space="preserve"> </w:t>
+      </w:r>
+      <w:r>
+        <w:t xml:space="preserve">“</w:t>
+      </w:r>
+      <w:r>
+        <w:t xml:space="preserve">AI Overview citation</w:t>
+      </w:r>
+      <w:r>
+        <w:t xml:space="preserve">”</w:t>
+      </w:r>
+      <w:r>
+        <w:t xml:space="preserve"> </w:t>
+      </w:r>
+      <w:r>
+        <w:t xml:space="preserve">has two operational definitions here and they differ by a factor that falls from 2.94 to 1.34; both are reported.</w:t>
+      </w:r>
+      <w:r>
+        <w:t xml:space="preserve"> </w:t>
+      </w:r>
+      <w:r>
+        <w:t xml:space="preserve">“</w:t>
+      </w:r>
+      <w:r>
+        <w:t xml:space="preserve">Visibility</w:t>
+      </w:r>
+      <w:r>
+        <w:t xml:space="preserve">”</w:t>
+      </w:r>
+      <w:r>
+        <w:t xml:space="preserve"> </w:t>
+      </w:r>
+      <w:r>
+        <w:t xml:space="preserve">is not value: no revenue, conversion or impression figure appears in this paper and none should be inferred.</w:t>
       </w:r>
     </w:p>
     <w:p>
@@ -7932,43 +8209,13 @@
           <w:bCs/>
           <w:b/>
         </w:rPr>
-        <w:t xml:space="preserve">Construct.</w:t>
-      </w:r>
-      <w:r>
-        <w:t xml:space="preserve"> </w:t>
-      </w:r>
-      <w:r>
-        <w:t xml:space="preserve">“</w:t>
-      </w:r>
-      <w:r>
-        <w:t xml:space="preserve">AI Overview citation</w:t>
-      </w:r>
-      <w:r>
-        <w:t xml:space="preserve">”</w:t>
-      </w:r>
-      <w:r>
-        <w:t xml:space="preserve"> </w:t>
-      </w:r>
-      <w:r>
-        <w:t xml:space="preserve">has two operational definitions here and they differ by a factor that falls from 2.94 to 1.34; both are reported.</w:t>
-      </w:r>
-      <w:r>
-        <w:t xml:space="preserve"> </w:t>
-      </w:r>
-      <w:r>
-        <w:t xml:space="preserve">“</w:t>
-      </w:r>
-      <w:r>
-        <w:t xml:space="preserve">Visibility</w:t>
-      </w:r>
-      <w:r>
-        <w:t xml:space="preserve">”</w:t>
-      </w:r>
-      <w:r>
-        <w:t xml:space="preserve"> </w:t>
-      </w:r>
-      <w:r>
-        <w:t xml:space="preserve">is not value: no revenue, conversion or impression figure appears in this paper and none should be inferred.</w:t>
+        <w:t xml:space="preserve">Non-human traffic.</w:t>
+      </w:r>
+      <w:r>
+        <w:t xml:space="preserve"> </w:t>
+      </w:r>
+      <w:r>
+        <w:t xml:space="preserve">The estimated-visit figures are vendor click models and do not distinguish automated from human requests. A section attracting an automated link network may also attract automated requests. No instrument available here separates them, and the estimated-visit figures should be read with that unresolved.</w:t>
       </w:r>
     </w:p>
     <w:p>
@@ -7980,31 +8227,13 @@
           <w:bCs/>
           <w:b/>
         </w:rPr>
-        <w:t xml:space="preserve">Non-human traffic.</w:t>
-      </w:r>
-      <w:r>
-        <w:t xml:space="preserve"> </w:t>
-      </w:r>
-      <w:r>
-        <w:t xml:space="preserve">The estimated-visit figures are vendor click models and do not distinguish automated from human requests. A section attracting an automated link network may also attract automated requests. No instrument available here separates them, and the paper’s engagement figures should be read with that unresolved.</w:t>
-      </w:r>
-    </w:p>
-    <w:p>
-      <w:pPr>
-        <w:pStyle w:val="BodyText"/>
-      </w:pPr>
-      <w:r>
-        <w:rPr>
-          <w:bCs/>
-          <w:b/>
-        </w:rPr>
         <w:t xml:space="preserve">External validity.</w:t>
       </w:r>
       <w:r>
         <w:t xml:space="preserve"> </w:t>
       </w:r>
       <w:r>
-        <w:t xml:space="preserve">One organization, one industry, one class, a top-authority domain, 77 days, six stated conditions. For Section 5’s divergence result: one prefix, one vendor pair, no ground truth.</w:t>
+        <w:t xml:space="preserve">One organization, one industry, one class, a top-authority domain, 77 days, six stated conditions. For Section 5’s divergence result: twelve prefixes on one domain, one of them followed for 77 days; one vendor pair; one read date for the cross-section; no ground truth.</w:t>
       </w:r>
     </w:p>
     <w:p>
@@ -8199,7 +8428,7 @@
         <w:t xml:space="preserve"> </w:t>
       </w:r>
       <w:r>
-        <w:t xml:space="preserve">The cross-section was run on one domain. The result that the vendor ratio is prefix-specific and age-independent needs a second site, a second read date, and a per-section territory match before it is more than an observation about one domain. Anyone with both subscriptions and any multi-section site can do it in a day; the data file released with this paper gives the read method.</w:t>
+        <w:t xml:space="preserve">The cross-section was run on one domain. The result that the vendor ratio is prefix-specific, with no detectable relationship to age, needs a second site and a second read date before it is more than an observation about one domain. Anyone with both subscriptions and any multi-section site can do it in a day; the data file released with this paper gives the read method.</w:t>
       </w:r>
     </w:p>
     <w:bookmarkEnd w:id="67"/>
@@ -8267,7 +8496,7 @@
         <w:rPr>
           <w:rStyle w:val="VerbatimChar"/>
         </w:rPr>
-        <w:t xml:space="preserve">02d7588</w:t>
+        <w:t xml:space="preserve">0ae8678</w:t>
       </w:r>
       <w:r>
         <w:t xml:space="preserve">: test suite, command line interface, and a worked example that runs offline on public data. The corrected numbering-plan ontology in YAML with OWL and SHACL export, and the area-code dataset the example uses. It has</w:t>
@@ -8292,10 +8521,13 @@
         <w:rPr>
           <w:rStyle w:val="VerbatimChar"/>
         </w:rPr>
-        <w:t xml:space="preserve">http://w3id.org/ufi/nanp</w:t>
-      </w:r>
-      <w:r>
-        <w:t xml:space="preserve">, which does not resolve, and that is a defect in the released artifact rather than a shorthand.</w:t>
+        <w:t xml:space="preserve">urn:ufi:&lt;name&gt;</w:t>
+      </w:r>
+      <w:r>
+        <w:t xml:space="preserve"> </w:t>
+      </w:r>
+      <w:r>
+        <w:t xml:space="preserve">by default, which makes no resolution claim; no persistent namespace has been registered.</w:t>
       </w:r>
     </w:p>
     <w:p>
@@ -8328,7 +8560,7 @@
         <w:t xml:space="preserve"> </w:t>
       </w:r>
       <w:r>
-        <w:t xml:space="preserve">in the repository below.</w:t>
+        <w:t xml:space="preserve">in the repository named above.</w:t>
       </w:r>
     </w:p>
     <w:p>
@@ -8346,7 +8578,7 @@
         <w:t xml:space="preserve"> </w:t>
       </w:r>
       <w:r>
-        <w:t xml:space="preserve">Every figure in Sections 5 and 6 can be re-read from the same two dashboards for the same prefix, subject to index drift. The Ahrefs daily series reproduces the checkpoint rows until it ages out of the six-month window.</w:t>
+        <w:t xml:space="preserve">Every figure in Sections 5 and 6 can be re-read from the same two dashboards for the same prefix, subject to index drift. The exception is the Brand Radar answer count, which moved from 14,823 (9 October) to 17,206 (11 October) and 17,400 (12 October) as stored answers were refreshed; it is reported with its read date and is not claimed to be re-readable. The Ahrefs daily series reproduces the checkpoint rows until it ages out of the six-month window.</w:t>
       </w:r>
     </w:p>
     <w:p>
@@ -8364,7 +8596,7 @@
         <w:t xml:space="preserve"> </w:t>
       </w:r>
       <w:r>
-        <w:t xml:space="preserve">The provider’s internal graph database, the crawl of its site, and its analytics. Figures drawn from them are labelled internally measured where they appear.</w:t>
+        <w:t xml:space="preserve">The provider’s internal graph database, the crawl of its site, and its analytics. No figure in this paper is drawn from them; the cost figures in Section 9.1 are the author’s reconstruction from project records.</w:t>
       </w:r>
     </w:p>
     <w:p>
@@ -8382,7 +8614,7 @@
         <w:t xml:space="preserve"> </w:t>
       </w:r>
       <w:r>
-        <w:t xml:space="preserve">No human subjects were involved; no user-level, session, cookie or personally identifying data was collected or analysed. The deployment published reference pages and ran no experiment on visitors. Outcome figures come from commercial dashboards read through their own interfaces under paid subscriptions, within those vendors’ terms; no vendor was scraped and no API was used to assemble the series. This study performed no crawl of any third-party site; the provider’s own site crawl is an internal operation on the organization’s own property. Page facts derive from the numbering plan administrator’s public registry and US Census data, both public-domain US government sources.</w:t>
+        <w:t xml:space="preserve">No human subjects were involved; no user-level, session, cookie or personally identifying data was collected or analyzed. The deployment published reference pages and ran no experiment on visitors. Outcome figures come from commercial dashboards read through their own interfaces under paid subscriptions, within those vendors’ terms; no vendor was scraped and no API was used to assemble the series. This study performed no crawl of any third-party site; the provider’s own site crawl is an internal operation on the organization’s own property. Page facts derive from the numbering plan administrator’s public registry and US Census data, both public-domain US government sources.</w:t>
       </w:r>
     </w:p>
     <w:p>
@@ -8436,38 +8668,176 @@
         <w:t xml:space="preserve"> </w:t>
       </w:r>
       <w:r>
-        <w:t xml:space="preserve">Appendix A gives the full version history; this list and that appendix now name the same items, which version 4.0 did not. Four corrections change how a figure must be read. The October 2025 carrier exports were described as not selected on the outcome and are ranked-keyword exports, selected on a prior ranking outcome. Day 45 was named the primary checkpoint on the ground that it preceded the link arrival, which the data refute; the checkpoint is day 37. A past-tense claim that two independent annotators had graded the audit samples was false, and no annotation study has been run. And</w:t>
-      </w:r>
-      <w:r>
-        <w:t xml:space="preserve"> </w:t>
-      </w:r>
+        <w:t xml:space="preserve">Appendix A is the single record of corrections across versions, including those that change how a figure must be read.</w:t>
+      </w:r>
+    </w:p>
+    <w:p>
+      <w:pPr>
+        <w:pStyle w:val="BodyText"/>
+      </w:pPr>
       <w:r>
         <w:rPr>
           <w:bCs/>
           <w:b/>
         </w:rPr>
-        <w:t xml:space="preserve">the section’s size was misstated in every version through 4.1</w:t>
-      </w:r>
-      <w:r>
-        <w:t xml:space="preserve">: 441 was called its size when it is the number of URLs holding a ranking position on one date, and separately the section was said to hold 290 code pages with 88 geographic codes uncovered. It holds 381 code pages, 374 geographic and 7 toll-free, with only the six territory codes uncovered; the 88-code control arm those versions registered does not exist, and Section 11 withdraws it.</w:t>
-      </w:r>
-    </w:p>
-    <w:p>
-      <w:pPr>
-        <w:pStyle w:val="BodyText"/>
-      </w:pPr>
+        <w:t xml:space="preserve">Organizational permission.</w:t>
+      </w:r>
+      <w:r>
+        <w:t xml:space="preserve"> </w:t>
+      </w:r>
+      <w:r>
+        <w:t xml:space="preserve">The organization that operates the section approved publication of the figures in this paper. Approval date:</w:t>
+      </w:r>
+      <w:r>
+        <w:t xml:space="preserve"> </w:t>
+      </w:r>
+      <w:r>
+        <w:rPr>
+          <w:iCs/>
+          <w:i/>
+        </w:rPr>
+        <w:t xml:space="preserve">[to be completed]</w:t>
+      </w:r>
+      <w:r>
+        <w:t xml:space="preserve">. Approving role and unit:</w:t>
+      </w:r>
+      <w:r>
+        <w:t xml:space="preserve"> </w:t>
+      </w:r>
+      <w:r>
+        <w:rPr>
+          <w:iCs/>
+          <w:i/>
+        </w:rPr>
+        <w:t xml:space="preserve">[to be completed]</w:t>
+      </w:r>
+      <w:r>
+        <w:t xml:space="preserve">. Scope:</w:t>
+      </w:r>
+      <w:r>
+        <w:t xml:space="preserve"> </w:t>
+      </w:r>
+      <w:r>
+        <w:rPr>
+          <w:iCs/>
+          <w:i/>
+        </w:rPr>
+        <w:t xml:space="preserve">[to be completed]</w:t>
+      </w:r>
+      <w:r>
+        <w:t xml:space="preserve">.</w:t>
+      </w:r>
+      <w:r>
+        <w:t xml:space="preserve"> </w:t>
+      </w:r>
       <w:r>
         <w:rPr>
           <w:bCs/>
           <w:b/>
         </w:rPr>
-        <w:t xml:space="preserve">Organizational permission.</w:t>
-      </w:r>
-      <w:r>
-        <w:t xml:space="preserve"> </w:t>
-      </w:r>
-      <w:r>
-        <w:t xml:space="preserve">The organization that operates the section approved publication of the figures in this paper. Approval date:</w:t>
+        <w:t xml:space="preserve">These three fields are unfilled, and the manuscript is not submitted anywhere until they are.</w:t>
+      </w:r>
+      <w:r>
+        <w:t xml:space="preserve"> </w:t>
+      </w:r>
+      <w:r>
+        <w:t xml:space="preserve">The organization is not named in this paper.</w:t>
+      </w:r>
+    </w:p>
+    <w:p>
+      <w:pPr>
+        <w:pStyle w:val="BodyText"/>
+      </w:pPr>
+      <w:r>
+        <w:rPr>
+          <w:bCs/>
+          <w:b/>
+        </w:rPr>
+        <w:t xml:space="preserve">Conflicts of interest.</w:t>
+      </w:r>
+      <w:r>
+        <w:t xml:space="preserve"> </w:t>
+      </w:r>
+      <w:r>
+        <w:t xml:space="preserve">As stated in Section 10. The mitigations are weaker than the conflict: the primary result is two vendors’ readings of a public prefix that any reader with the same subscriptions can re-read, the implementation is released so the specification can be checked against the description, and the designs in Section 11 are registered before their data exist.</w:t>
+      </w:r>
+    </w:p>
+    <w:p>
+      <w:pPr>
+        <w:pStyle w:val="BodyText"/>
+      </w:pPr>
+      <w:r>
+        <w:rPr>
+          <w:bCs/>
+          <w:b/>
+        </w:rPr>
+        <w:t xml:space="preserve">What has not been done, after seven rounds of internal review.</w:t>
+      </w:r>
+      <w:r>
+        <w:t xml:space="preserve"> </w:t>
+      </w:r>
+      <w:r>
+        <w:t xml:space="preserve">No independent party has checked any number in this paper. The one check that would change that requires nobody’s permission, budget or cooperation: a third-party re-read of the day-37 row of Table 5 and of Table 4 from the same dashboards. It has not been performed. The cross-prefix replication registered in version 4.0 was performed on 12 October 2026 (Section 5.5); the within-class control registered with it was found not to exist (Section 3). A reader is entitled to weigh that the remaining undone check is the only one requiring another person’s name.</w:t>
+      </w:r>
+    </w:p>
+    <w:bookmarkEnd w:id="68"/>
+    <w:bookmarkStart w:id="69" w:name="conclusion"/>
+    <w:p>
+      <w:pPr>
+        <w:pStyle w:val="Heading2"/>
+      </w:pPr>
+      <w:r>
+        <w:t xml:space="preserve">13 Conclusion</w:t>
+      </w:r>
+    </w:p>
+    <w:p>
+      <w:pPr>
+        <w:pStyle w:val="FirstParagraph"/>
+      </w:pPr>
+      <w:r>
+        <w:t xml:space="preserve">Two commercial analytics platforms watched the same section from the day it appeared. Over four months they disagreed about its estimated traffic by factors between 7.5 and 27.1, about its ranking keywords by a factor of two, and about its referring domains by a factor of eleven. Read on the same day across twelve sections of the same domain, their ratio on estimated visits ran from one fifth to seven times, with no detectable relationship to how old each section was or to how many keywords each vendor had found. The disagreement is larger than the effects most applied search papers report, the correction factor between the vendors has no fixed sign or size, and it cannot be applied at the domain level; the vendors rank sections alike and size them differently, so a single-vendor study of magnitudes carries an error it cannot bound from its own data.</w:t>
+      </w:r>
+    </w:p>
+    <w:p>
+      <w:pPr>
+        <w:pStyle w:val="BodyText"/>
+      </w:pPr>
+      <w:r>
+        <w:t xml:space="preserve">The deployment underneath that measurement is reported as context. Following the publication of one page per member of a finite enumerable class, templated from a free registry on a top-decile domain that no comparable competitor covered and no one defended, the section held 15,830 ranking positions with nineteen referring domains at day 37, and by day 77 appeared in 17,206 recorded AI answers having earned no editorial link. The pages most cited were the ones that enumerate rather than the ones that answer. What that conjunction depended on, and in what proportion, is not estimated here, and the within-class comparison that would have begun to estimate it cannot be run on this section, because every code in the class has a page.</w:t>
+      </w:r>
+    </w:p>
+    <w:p>
+      <w:pPr>
+        <w:pStyle w:val="BodyText"/>
+      </w:pPr>
+      <w:r>
+        <w:t xml:space="preserve">The framework under which the section was built, User First Intelligence, is specified in Appendix B and released as an open implementation with executable competency questions, whose schema pass rate and instance coverage are reported separately. Its scoring function is not evaluated here. Section 11 registers the prospective study, with parameters locked before any data exist, that would test whether it identifies gaps worth building.</w:t>
+      </w:r>
+    </w:p>
+    <w:bookmarkEnd w:id="69"/>
+    <w:bookmarkStart w:id="70" w:name="references"/>
+    <w:p>
+      <w:pPr>
+        <w:pStyle w:val="Heading2"/>
+      </w:pPr>
+      <w:r>
+        <w:t xml:space="preserve">References</w:t>
+      </w:r>
+    </w:p>
+    <w:p>
+      <w:pPr>
+        <w:pStyle w:val="FirstParagraph"/>
+      </w:pPr>
+      <w:r>
+        <w:t xml:space="preserve">Twenty-nine entries, each cited in the text.</w:t>
+      </w:r>
+    </w:p>
+    <w:p>
+      <w:pPr>
+        <w:pStyle w:val="BodyText"/>
+      </w:pPr>
+      <w:r>
+        <w:t xml:space="preserve">Balaraman, V., Razniewski, S., &amp; Nutt, W. (2018). Recoin: Relative completeness in Wikidata. In</w:t>
       </w:r>
       <w:r>
         <w:t xml:space="preserve"> </w:t>
@@ -8477,10 +8847,21 @@
           <w:iCs/>
           <w:i/>
         </w:rPr>
-        <w:t xml:space="preserve">[to be completed]</w:t>
-      </w:r>
-      <w:r>
-        <w:t xml:space="preserve">. Approving role and unit:</w:t>
+        <w:t xml:space="preserve">Companion Proceedings of The Web Conference 2018</w:t>
+      </w:r>
+      <w:r>
+        <w:t xml:space="preserve"> </w:t>
+      </w:r>
+      <w:r>
+        <w:t xml:space="preserve">(pp. 1787–1792). ACM.</w:t>
+      </w:r>
+    </w:p>
+    <w:p>
+      <w:pPr>
+        <w:pStyle w:val="BodyText"/>
+      </w:pPr>
+      <w:r>
+        <w:t xml:space="preserve">Belkin, N. J., Oddy, R. N., &amp; Brooks, H. M. (1982). ASK for information retrieval: Part I. Background and theory.</w:t>
       </w:r>
       <w:r>
         <w:t xml:space="preserve"> </w:t>
@@ -8490,10 +8871,18 @@
           <w:iCs/>
           <w:i/>
         </w:rPr>
-        <w:t xml:space="preserve">[to be completed]</w:t>
-      </w:r>
-      <w:r>
-        <w:t xml:space="preserve">. Scope:</w:t>
+        <w:t xml:space="preserve">Journal of Documentation, 38</w:t>
+      </w:r>
+      <w:r>
+        <w:t xml:space="preserve">(2), 61–71.</w:t>
+      </w:r>
+    </w:p>
+    <w:p>
+      <w:pPr>
+        <w:pStyle w:val="BodyText"/>
+      </w:pPr>
+      <w:r>
+        <w:t xml:space="preserve">Broder, A. (2002). A taxonomy of web search.</w:t>
       </w:r>
       <w:r>
         <w:t xml:space="preserve"> </w:t>
@@ -8503,26 +8892,655 @@
           <w:iCs/>
           <w:i/>
         </w:rPr>
-        <w:t xml:space="preserve">[to be completed]</w:t>
-      </w:r>
-      <w:r>
-        <w:t xml:space="preserve">.</w:t>
-      </w:r>
-      <w:r>
-        <w:t xml:space="preserve"> </w:t>
-      </w:r>
+        <w:t xml:space="preserve">SIGIR Forum, 36</w:t>
+      </w:r>
+      <w:r>
+        <w:t xml:space="preserve">(2), 3–10.</w:t>
+      </w:r>
+    </w:p>
+    <w:p>
+      <w:pPr>
+        <w:pStyle w:val="BodyText"/>
+      </w:pPr>
+      <w:r>
+        <w:t xml:space="preserve">Buckley, C., &amp; Voorhees, E. M. (2004). Retrieval evaluation with incomplete information. In</w:t>
+      </w:r>
+      <w:r>
+        <w:t xml:space="preserve"> </w:t>
+      </w:r>
+      <w:r>
+        <w:rPr>
+          <w:iCs/>
+          <w:i/>
+        </w:rPr>
+        <w:t xml:space="preserve">Proceedings of the 27th Annual International ACM SIGIR Conference on Research and Development in Information Retrieval</w:t>
+      </w:r>
+      <w:r>
+        <w:t xml:space="preserve"> </w:t>
+      </w:r>
+      <w:r>
+        <w:t xml:space="preserve">(pp. 25–32). ACM.</w:t>
+      </w:r>
+    </w:p>
+    <w:p>
+      <w:pPr>
+        <w:pStyle w:val="BodyText"/>
+      </w:pPr>
+      <w:r>
+        <w:t xml:space="preserve">Chapekis, A., &amp; Lieb, A. (2025, July 22).</w:t>
+      </w:r>
+      <w:r>
+        <w:t xml:space="preserve"> </w:t>
+      </w:r>
+      <w:r>
+        <w:rPr>
+          <w:iCs/>
+          <w:i/>
+        </w:rPr>
+        <w:t xml:space="preserve">Google users are less likely to click on links when an AI summary appears in the results.</w:t>
+      </w:r>
+      <w:r>
+        <w:t xml:space="preserve"> </w:t>
+      </w:r>
+      <w:r>
+        <w:t xml:space="preserve">Pew Research Center.</w:t>
+      </w:r>
+    </w:p>
+    <w:p>
+      <w:pPr>
+        <w:pStyle w:val="BodyText"/>
+      </w:pPr>
+      <w:r>
+        <w:t xml:space="preserve">Galárraga, L., Razniewski, S., Amarilli, A., &amp; Suchanek, F. M. (2017). Predicting completeness in knowledge bases. In</w:t>
+      </w:r>
+      <w:r>
+        <w:t xml:space="preserve"> </w:t>
+      </w:r>
+      <w:r>
+        <w:rPr>
+          <w:iCs/>
+          <w:i/>
+        </w:rPr>
+        <w:t xml:space="preserve">WSDM ’17</w:t>
+      </w:r>
+      <w:r>
+        <w:t xml:space="preserve"> </w:t>
+      </w:r>
+      <w:r>
+        <w:t xml:space="preserve">(pp. 375–383). ACM.</w:t>
+      </w:r>
+    </w:p>
+    <w:p>
+      <w:pPr>
+        <w:pStyle w:val="BodyText"/>
+      </w:pPr>
+      <w:r>
+        <w:t xml:space="preserve">Goel, S., Broder, A., Gabrilovich, E., &amp; Pang, B. (2010). Anatomy of the long tail: Ordinary people with extraordinary tastes. In</w:t>
+      </w:r>
+      <w:r>
+        <w:t xml:space="preserve"> </w:t>
+      </w:r>
+      <w:r>
+        <w:rPr>
+          <w:iCs/>
+          <w:i/>
+        </w:rPr>
+        <w:t xml:space="preserve">WSDM ’10</w:t>
+      </w:r>
+      <w:r>
+        <w:t xml:space="preserve"> </w:t>
+      </w:r>
+      <w:r>
+        <w:t xml:space="preserve">(pp. 201–210). ACM.</w:t>
+      </w:r>
+    </w:p>
+    <w:p>
+      <w:pPr>
+        <w:pStyle w:val="BodyText"/>
+      </w:pPr>
+      <w:r>
+        <w:t xml:space="preserve">Golebiewski, M., &amp; boyd, d. (2018).</w:t>
+      </w:r>
+      <w:r>
+        <w:t xml:space="preserve"> </w:t>
+      </w:r>
+      <w:r>
+        <w:rPr>
+          <w:iCs/>
+          <w:i/>
+        </w:rPr>
+        <w:t xml:space="preserve">Data voids: Where missing data can easily be exploited.</w:t>
+      </w:r>
+      <w:r>
+        <w:t xml:space="preserve"> </w:t>
+      </w:r>
+      <w:r>
+        <w:t xml:space="preserve">Data &amp; Society Research Institute.</w:t>
+      </w:r>
+    </w:p>
+    <w:p>
+      <w:pPr>
+        <w:pStyle w:val="BodyText"/>
+      </w:pPr>
+      <w:r>
+        <w:t xml:space="preserve">Haveliwala, T. H. (2002). Topic-sensitive PageRank. In</w:t>
+      </w:r>
+      <w:r>
+        <w:t xml:space="preserve"> </w:t>
+      </w:r>
+      <w:r>
+        <w:rPr>
+          <w:iCs/>
+          <w:i/>
+        </w:rPr>
+        <w:t xml:space="preserve">WWW ’02</w:t>
+      </w:r>
+      <w:r>
+        <w:t xml:space="preserve"> </w:t>
+      </w:r>
+      <w:r>
+        <w:t xml:space="preserve">(pp. 517–526). ACM.</w:t>
+      </w:r>
+    </w:p>
+    <w:p>
+      <w:pPr>
+        <w:pStyle w:val="BodyText"/>
+      </w:pPr>
+      <w:r>
+        <w:t xml:space="preserve">Hopkinson, A., Gurdasani, A., Palfrey, D., &amp; Mittal, A. (2018). Demand-weighted completeness prediction for a knowledge base. In</w:t>
+      </w:r>
+      <w:r>
+        <w:t xml:space="preserve"> </w:t>
+      </w:r>
+      <w:r>
+        <w:rPr>
+          <w:iCs/>
+          <w:i/>
+        </w:rPr>
+        <w:t xml:space="preserve">NAACL-HLT 2018, Industry Papers</w:t>
+      </w:r>
+      <w:r>
+        <w:t xml:space="preserve"> </w:t>
+      </w:r>
+      <w:r>
+        <w:t xml:space="preserve">(pp. 200–207). ACL.</w:t>
+      </w:r>
+    </w:p>
+    <w:p>
+      <w:pPr>
+        <w:pStyle w:val="BodyText"/>
+      </w:pPr>
+      <w:r>
+        <w:t xml:space="preserve">Langridge, P. (2016, June 13).</w:t>
+      </w:r>
+      <w:r>
+        <w:t xml:space="preserve"> </w:t>
+      </w:r>
+      <w:r>
+        <w:rPr>
+          <w:iCs/>
+          <w:i/>
+        </w:rPr>
+        <w:t xml:space="preserve">How accurate are website traffic estimators?</w:t>
+      </w:r>
+      <w:r>
+        <w:t xml:space="preserve"> </w:t>
+      </w:r>
+      <w:r>
+        <w:t xml:space="preserve">Screaming Frog. https://www.screamingfrog.co.uk/how-accurate-are-website-traffic-estimators/ (25 sites, February to April 2016, against Google Analytics; accessed 12 October 2026.)</w:t>
+      </w:r>
+    </w:p>
+    <w:p>
+      <w:pPr>
+        <w:pStyle w:val="BodyText"/>
+      </w:pPr>
+      <w:r>
+        <w:t xml:space="preserve">Le Pochat, V., Van Goethem, T., Tajalizadehkhoob, S., Korczyński, M., &amp; Joosen, W. (2019). Tranco: A research-oriented top sites ranking hardened against manipulation. In</w:t>
+      </w:r>
+      <w:r>
+        <w:t xml:space="preserve"> </w:t>
+      </w:r>
+      <w:r>
+        <w:rPr>
+          <w:iCs/>
+          <w:i/>
+        </w:rPr>
+        <w:t xml:space="preserve">Proceedings of the Network and Distributed System Security Symposium (NDSS 2019)</w:t>
+      </w:r>
+      <w:r>
+        <w:t xml:space="preserve">. Internet Society.</w:t>
+      </w:r>
+    </w:p>
+    <w:p>
+      <w:pPr>
+        <w:pStyle w:val="BodyText"/>
+      </w:pPr>
+      <w:r>
+        <w:t xml:space="preserve">Linehan, L., &amp; Guan, X. (2025, August 11).</w:t>
+      </w:r>
+      <w:r>
+        <w:t xml:space="preserve"> </w:t>
+      </w:r>
+      <w:r>
+        <w:rPr>
+          <w:iCs/>
+          <w:i/>
+        </w:rPr>
+        <w:t xml:space="preserve">Only 12% of AI cited URLs rank in Google’s top 10 for the original prompt.</w:t>
+      </w:r>
+      <w:r>
+        <w:t xml:space="preserve"> </w:t>
+      </w:r>
+      <w:r>
+        <w:t xml:space="preserve">Ahrefs. https://ahrefs.com/blog/ai-search-overlap/ (15,000 long-tail prompts across ChatGPT, Gemini, Copilot and Perplexity; accessed 12 October 2026.)</w:t>
+      </w:r>
+    </w:p>
+    <w:p>
+      <w:pPr>
+        <w:pStyle w:val="BodyText"/>
+      </w:pPr>
+      <w:r>
+        <w:t xml:space="preserve">Luggen, M., Difallah, D., Sarasua, C., Demartini, G., &amp; Cudré-Mauroux, P. (2019). Non-parametric class completeness estimators for collaborative knowledge graphs: The case of Wikidata. In</w:t>
+      </w:r>
+      <w:r>
+        <w:t xml:space="preserve"> </w:t>
+      </w:r>
+      <w:r>
+        <w:rPr>
+          <w:iCs/>
+          <w:i/>
+        </w:rPr>
+        <w:t xml:space="preserve">ISWC 2019</w:t>
+      </w:r>
+      <w:r>
+        <w:t xml:space="preserve"> </w:t>
+      </w:r>
+      <w:r>
+        <w:t xml:space="preserve">(pp. 453–469). Springer.</w:t>
+      </w:r>
+    </w:p>
+    <w:p>
+      <w:pPr>
+        <w:pStyle w:val="BodyText"/>
+      </w:pPr>
+      <w:r>
+        <w:t xml:space="preserve">Martinez, O. (2026).</w:t>
+      </w:r>
+      <w:r>
+        <w:t xml:space="preserve"> </w:t>
+      </w:r>
+      <w:r>
+        <w:rPr>
+          <w:iCs/>
+          <w:i/>
+        </w:rPr>
+        <w:t xml:space="preserve">Optimizing visibility in generative engines: A critical survey of generative engine optimization (2023–2026).</w:t>
+      </w:r>
+      <w:r>
+        <w:t xml:space="preserve"> </w:t>
+      </w:r>
+      <w:r>
+        <w:t xml:space="preserve">arXiv:2607.14035.</w:t>
+      </w:r>
+    </w:p>
+    <w:p>
+      <w:pPr>
+        <w:pStyle w:val="BodyText"/>
+      </w:pPr>
+      <w:r>
+        <w:t xml:space="preserve">Piccardi, T., Catasta, M., Zia, L., &amp; West, R. (2018). Structuring Wikipedia articles with section recommendations. In</w:t>
+      </w:r>
+      <w:r>
+        <w:t xml:space="preserve"> </w:t>
+      </w:r>
+      <w:r>
+        <w:rPr>
+          <w:iCs/>
+          <w:i/>
+        </w:rPr>
+        <w:t xml:space="preserve">SIGIR ’18</w:t>
+      </w:r>
+      <w:r>
+        <w:t xml:space="preserve"> </w:t>
+      </w:r>
+      <w:r>
+        <w:t xml:space="preserve">(pp. 665–674). ACM.</w:t>
+      </w:r>
+    </w:p>
+    <w:p>
+      <w:pPr>
+        <w:pStyle w:val="BodyText"/>
+      </w:pPr>
+      <w:r>
+        <w:t xml:space="preserve">Razniewski, S., Arnaout, H., Ghosh, S., &amp; Suchanek, F. (2024). Completeness, recall, and negation in open-world knowledge bases: A survey.</w:t>
+      </w:r>
+      <w:r>
+        <w:t xml:space="preserve"> </w:t>
+      </w:r>
+      <w:r>
+        <w:rPr>
+          <w:iCs/>
+          <w:i/>
+        </w:rPr>
+        <w:t xml:space="preserve">ACM Computing Surveys, 56</w:t>
+      </w:r>
+      <w:r>
+        <w:t xml:space="preserve">(6), Article 150. https://doi.org/10.1145/3639563</w:t>
+      </w:r>
+    </w:p>
+    <w:p>
+      <w:pPr>
+        <w:pStyle w:val="BodyText"/>
+      </w:pPr>
+      <w:r>
+        <w:t xml:space="preserve">Razniewski, S., Suchanek, F. M., &amp; Nutt, W. (2016). But what do we actually know? In</w:t>
+      </w:r>
+      <w:r>
+        <w:t xml:space="preserve"> </w:t>
+      </w:r>
+      <w:r>
+        <w:rPr>
+          <w:iCs/>
+          <w:i/>
+        </w:rPr>
+        <w:t xml:space="preserve">AKBC 2016</w:t>
+      </w:r>
+      <w:r>
+        <w:t xml:space="preserve"> </w:t>
+      </w:r>
+      <w:r>
+        <w:t xml:space="preserve">(pp. 40–44). ACL.</w:t>
+      </w:r>
+    </w:p>
+    <w:p>
+      <w:pPr>
+        <w:pStyle w:val="BodyText"/>
+      </w:pPr>
+      <w:r>
+        <w:t xml:space="preserve">Redi, M., Gerlach, M., Johnson, I., Morgan, J., &amp; Zia, L. (2020).</w:t>
+      </w:r>
+      <w:r>
+        <w:t xml:space="preserve"> </w:t>
+      </w:r>
+      <w:r>
+        <w:rPr>
+          <w:iCs/>
+          <w:i/>
+        </w:rPr>
+        <w:t xml:space="preserve">A taxonomy of knowledge gaps for Wikimedia projects.</w:t>
+      </w:r>
+      <w:r>
+        <w:t xml:space="preserve"> </w:t>
+      </w:r>
+      <w:r>
+        <w:t xml:space="preserve">arXiv:2008.12314.</w:t>
+      </w:r>
+    </w:p>
+    <w:p>
+      <w:pPr>
+        <w:pStyle w:val="BodyText"/>
+      </w:pPr>
+      <w:r>
+        <w:t xml:space="preserve">Ripoll, M., Reeves, N., Kurteva, A., Simperl, E., Meroño Peñuela, A., &amp; Diepold, K. (2025).</w:t>
+      </w:r>
+      <w:r>
+        <w:t xml:space="preserve"> </w:t>
+      </w:r>
+      <w:r>
+        <w:rPr>
+          <w:iCs/>
+          <w:i/>
+        </w:rPr>
+        <w:t xml:space="preserve">Filling in the blanks? A systematic review and theoretical conceptualisation for measuring WikiData content gaps.</w:t>
+      </w:r>
+      <w:r>
+        <w:t xml:space="preserve"> </w:t>
+      </w:r>
+      <w:r>
+        <w:t xml:space="preserve">arXiv:2505.16383.</w:t>
+      </w:r>
+    </w:p>
+    <w:p>
+      <w:pPr>
+        <w:pStyle w:val="BodyText"/>
+      </w:pPr>
+      <w:r>
+        <w:t xml:space="preserve">Scheitle, Q., Hohlfeld, O., Gamba, J., Jelten, J., Zimmermann, T., Strowes, S. D., &amp; Vallina-Rodriguez, N. (2018). A long way to the top: Significance, structure, and stability of Internet top lists. In</w:t>
+      </w:r>
+      <w:r>
+        <w:t xml:space="preserve"> </w:t>
+      </w:r>
+      <w:r>
+        <w:rPr>
+          <w:iCs/>
+          <w:i/>
+        </w:rPr>
+        <w:t xml:space="preserve">Proceedings of the Internet Measurement Conference 2018 (IMC ’18)</w:t>
+      </w:r>
+      <w:r>
+        <w:t xml:space="preserve">. ACM.</w:t>
+      </w:r>
+    </w:p>
+    <w:p>
+      <w:pPr>
+        <w:pStyle w:val="BodyText"/>
+      </w:pPr>
+      <w:r>
+        <w:t xml:space="preserve">Shao, Y., Jiang, Y., Kanell, T. A., Xu, P., Khattab, O., &amp; Lam, M. S. (2024). Assisting in writing Wikipedia-like articles from scratch with large language models. In</w:t>
+      </w:r>
+      <w:r>
+        <w:t xml:space="preserve"> </w:t>
+      </w:r>
+      <w:r>
+        <w:rPr>
+          <w:iCs/>
+          <w:i/>
+        </w:rPr>
+        <w:t xml:space="preserve">NAACL 2024.</w:t>
+      </w:r>
+      <w:r>
+        <w:t xml:space="preserve"> </w:t>
+      </w:r>
+      <w:r>
+        <w:t xml:space="preserve">ACL.</w:t>
+      </w:r>
+    </w:p>
+    <w:p>
+      <w:pPr>
+        <w:pStyle w:val="BodyText"/>
+      </w:pPr>
+      <w:r>
+        <w:t xml:space="preserve">Soulo, T. (2022, May 3).</w:t>
+      </w:r>
+      <w:r>
+        <w:t xml:space="preserve"> </w:t>
+      </w:r>
+      <w:r>
+        <w:rPr>
+          <w:iCs/>
+          <w:i/>
+        </w:rPr>
+        <w:t xml:space="preserve">How accurate are the search traffic estimations in Ahrefs? (New research).</w:t>
+      </w:r>
+      <w:r>
+        <w:t xml:space="preserve"> </w:t>
+      </w:r>
+      <w:r>
+        <w:t xml:space="preserve">Ahrefs. https://ahrefs.com/blog/traffic-estimations-accuracy/ (1,635 sites against Google Search Console; accessed 12 October 2026.)</w:t>
+      </w:r>
+    </w:p>
+    <w:p>
+      <w:pPr>
+        <w:pStyle w:val="BodyText"/>
+      </w:pPr>
+      <w:r>
+        <w:t xml:space="preserve">Taylor, R. S. (1968). Question-negotiation and information seeking in libraries.</w:t>
+      </w:r>
+      <w:r>
+        <w:t xml:space="preserve"> </w:t>
+      </w:r>
+      <w:r>
+        <w:rPr>
+          <w:iCs/>
+          <w:i/>
+        </w:rPr>
+        <w:t xml:space="preserve">College &amp; Research Libraries, 29</w:t>
+      </w:r>
+      <w:r>
+        <w:t xml:space="preserve">(3), 178–194.</w:t>
+      </w:r>
+    </w:p>
+    <w:p>
+      <w:pPr>
+        <w:pStyle w:val="BodyText"/>
+      </w:pPr>
+      <w:r>
+        <w:t xml:space="preserve">Vaughan, L., &amp; Yang, R. (2013). Web traffic and organization performance measures: Relationships and data sources examined.</w:t>
+      </w:r>
+      <w:r>
+        <w:t xml:space="preserve"> </w:t>
+      </w:r>
+      <w:r>
+        <w:rPr>
+          <w:iCs/>
+          <w:i/>
+        </w:rPr>
+        <w:t xml:space="preserve">Journal of Informetrics, 7</w:t>
+      </w:r>
+      <w:r>
+        <w:t xml:space="preserve">(3), 699–711.</w:t>
+      </w:r>
+    </w:p>
+    <w:p>
+      <w:pPr>
+        <w:pStyle w:val="BodyText"/>
+      </w:pPr>
+      <w:r>
+        <w:t xml:space="preserve">Webber, W., &amp; Park, L. A. F. (2009). Score adjustment for correction of pooling bias. In</w:t>
+      </w:r>
+      <w:r>
+        <w:t xml:space="preserve"> </w:t>
+      </w:r>
+      <w:r>
+        <w:rPr>
+          <w:iCs/>
+          <w:i/>
+        </w:rPr>
+        <w:t xml:space="preserve">Proceedings of the 32nd International ACM SIGIR Conference on Research and Development in Information Retrieval</w:t>
+      </w:r>
+      <w:r>
+        <w:t xml:space="preserve"> </w:t>
+      </w:r>
+      <w:r>
+        <w:t xml:space="preserve">(pp. 444–451). ACM.</w:t>
+      </w:r>
+    </w:p>
+    <w:p>
+      <w:pPr>
+        <w:pStyle w:val="BodyText"/>
+      </w:pPr>
+      <w:r>
+        <w:t xml:space="preserve">Wulczyn, E., West, R., Zia, L., &amp; Leskovec, J. (2016). Growing Wikipedia across languages via recommendation. In</w:t>
+      </w:r>
+      <w:r>
+        <w:t xml:space="preserve"> </w:t>
+      </w:r>
+      <w:r>
+        <w:rPr>
+          <w:iCs/>
+          <w:i/>
+        </w:rPr>
+        <w:t xml:space="preserve">WWW ’16</w:t>
+      </w:r>
+      <w:r>
+        <w:t xml:space="preserve"> </w:t>
+      </w:r>
+      <w:r>
+        <w:t xml:space="preserve">(pp. 975–985). ACM.</w:t>
+      </w:r>
+    </w:p>
+    <w:p>
+      <w:pPr>
+        <w:pStyle w:val="BodyText"/>
+      </w:pPr>
+      <w:r>
+        <w:t xml:space="preserve">Xu, H., Iqbal, U., &amp; Montgomery, J. M. (2026).</w:t>
+      </w:r>
+      <w:r>
+        <w:t xml:space="preserve"> </w:t>
+      </w:r>
+      <w:r>
+        <w:rPr>
+          <w:iCs/>
+          <w:i/>
+        </w:rPr>
+        <w:t xml:space="preserve">Measuring Google AI Overviews: Activation, source quality, claim fidelity, and publisher impact.</w:t>
+      </w:r>
+      <w:r>
+        <w:t xml:space="preserve"> </w:t>
+      </w:r>
+      <w:r>
+        <w:t xml:space="preserve">arXiv:2605.14021.</w:t>
+      </w:r>
+    </w:p>
+    <w:p>
+      <w:pPr>
+        <w:pStyle w:val="BodyText"/>
+      </w:pPr>
+      <w:r>
+        <w:t xml:space="preserve">Zobel, J. (1998). How reliable are the results of large-scale information retrieval experiments? In</w:t>
+      </w:r>
+      <w:r>
+        <w:t xml:space="preserve"> </w:t>
+      </w:r>
+      <w:r>
+        <w:rPr>
+          <w:iCs/>
+          <w:i/>
+        </w:rPr>
+        <w:t xml:space="preserve">Proceedings of the 21st Annual International ACM SIGIR Conference on Research and Development in Information Retrieval</w:t>
+      </w:r>
+      <w:r>
+        <w:t xml:space="preserve"> </w:t>
+      </w:r>
+      <w:r>
+        <w:t xml:space="preserve">(pp. 307–314). ACM.</w:t>
+      </w:r>
+    </w:p>
+    <w:bookmarkEnd w:id="70"/>
+    <w:bookmarkStart w:id="71" w:name="appendix-a-version-history"/>
+    <w:p>
+      <w:pPr>
+        <w:pStyle w:val="Heading2"/>
+      </w:pPr>
+      <w:r>
+        <w:t xml:space="preserve">Appendix A: Version history</w:t>
+      </w:r>
+    </w:p>
+    <w:p>
+      <w:pPr>
+        <w:pStyle w:val="FirstParagraph"/>
+      </w:pPr>
+      <w:r>
+        <w:t xml:space="preserve">This manuscript is the fourth structural version and has been through seven rounds of adversarial internal review. The history is recorded here rather than in the body, where in version 3.3 it had grown to 26% of the text and had become larger than the results section. Entries are in version order.</w:t>
+      </w:r>
+    </w:p>
+    <w:p>
+      <w:pPr>
+        <w:pStyle w:val="BodyText"/>
+      </w:pPr>
       <w:r>
         <w:rPr>
           <w:bCs/>
           <w:b/>
         </w:rPr>
-        <w:t xml:space="preserve">These three fields are unfilled, and the manuscript is not submitted anywhere until they are.</w:t>
-      </w:r>
-      <w:r>
-        <w:t xml:space="preserve"> </w:t>
-      </w:r>
-      <w:r>
-        <w:t xml:space="preserve">The organization is not named in this paper.</w:t>
+        <w:t xml:space="preserve">v1 to v2.2.</w:t>
+      </w:r>
+      <w:r>
+        <w:t xml:space="preserve"> </w:t>
+      </w:r>
+      <w:r>
+        <w:t xml:space="preserve">Framed as a method paper for a Content Gap Score, with the deployment as its validation. Three statements were false and are corrected: that two independent annotators had graded the audit samples (none had, and no annotation study has been run); that the ontology had been released (nothing had been); and an assertion of organizational permission with the date left blank. The first was the most serious: a past-tense claim of an independent check that did not happen, in a document naming the organization.</w:t>
       </w:r>
     </w:p>
     <w:p>
@@ -8534,13 +9552,13 @@
           <w:bCs/>
           <w:b/>
         </w:rPr>
-        <w:t xml:space="preserve">Conflicts of interest.</w:t>
-      </w:r>
-      <w:r>
-        <w:t xml:space="preserve"> </w:t>
-      </w:r>
-      <w:r>
-        <w:t xml:space="preserve">As stated in Section 10. The mitigations are weaker than the conflict: the primary result is two vendors’ readings of a public prefix that any reader with the same subscriptions can re-read, the implementation is released so the specification can be checked against the description, and the designs in Section 11 are registered before their data exist.</w:t>
+        <w:t xml:space="preserve">v3.0.</w:t>
+      </w:r>
+      <w:r>
+        <w:t xml:space="preserve"> </w:t>
+      </w:r>
+      <w:r>
+        <w:t xml:space="preserve">Reframed as a deployment measurement study and retitled. The score was withdrawn as an evaluated contribution. A section on what the paper does not report was placed before the results.</w:t>
       </w:r>
     </w:p>
     <w:p>
@@ -8552,567 +9570,36 @@
           <w:bCs/>
           <w:b/>
         </w:rPr>
-        <w:t xml:space="preserve">What has not been done, after six rounds of internal review.</w:t>
-      </w:r>
-      <w:r>
-        <w:t xml:space="preserve"> </w:t>
-      </w:r>
-      <w:r>
-        <w:t xml:space="preserve">No independent party has checked any number in this paper. The one check that would change that requires nobody’s permission, budget or cooperation: a third-party re-read of the day-37 row of Table 5 and of Table 4 from the same dashboards. It has not been performed. The cross-prefix replication the previous version listed here was performed on 12 October 2026 and is Section 5.5; the within-class control it also listed was found not to exist (Section 3). A reader is entitled to weigh that the remaining undone check is the only one requiring another person’s name.</w:t>
-      </w:r>
-    </w:p>
-    <w:bookmarkEnd w:id="68"/>
-    <w:bookmarkStart w:id="69" w:name="conclusion"/>
-    <w:p>
-      <w:pPr>
-        <w:pStyle w:val="Heading2"/>
-      </w:pPr>
-      <w:r>
-        <w:t xml:space="preserve">13 Conclusion</w:t>
-      </w:r>
-    </w:p>
-    <w:p>
-      <w:pPr>
-        <w:pStyle w:val="FirstParagraph"/>
-      </w:pPr>
-      <w:r>
-        <w:t xml:space="preserve">Two commercial analytics platforms watched the same section from the day it appeared. Over four months they disagreed about its estimated traffic by factors between 7.5 and 27.1, about its ranking keywords by a factor of two, and about its referring domains by a factor of eleven. Read on the same day across twelve sections of the same domain, their ratio on estimated visits ran from one fifth to seven times, unrelated to how old each section was and unrelated to how many keywords each vendor had found. The disagreement is larger than the effects most applied search papers report, the correction factor between the vendors has no fixed sign or size, and it cannot be applied at the domain level; the vendors rank sections alike and size them differently, so a single-vendor study of magnitudes carries an error it cannot bound from its own data.</w:t>
-      </w:r>
-    </w:p>
-    <w:p>
-      <w:pPr>
-        <w:pStyle w:val="BodyText"/>
-      </w:pPr>
-      <w:r>
-        <w:t xml:space="preserve">The deployment underneath that measurement is reported as context. Following the publication of one page per member of a finite enumerable class, templated from a free registry on a top-decile domain that no comparable competitor covered and no one defended, the section held 15,830 ranking positions with nineteen referring domains at day 37, and by day 77 appeared in 17,206 recorded AI answers having earned no editorial link. The pages most cited were the ones that enumerate rather than the ones that answer. What that conjunction depended on, and in what proportion, is not estimated here, and the within-class comparison that would begin to estimate it remains unrun.</w:t>
-      </w:r>
-    </w:p>
-    <w:bookmarkEnd w:id="69"/>
-    <w:bookmarkStart w:id="70" w:name="references"/>
-    <w:p>
-      <w:pPr>
-        <w:pStyle w:val="Heading2"/>
-      </w:pPr>
-      <w:r>
-        <w:t xml:space="preserve">References</w:t>
-      </w:r>
-    </w:p>
-    <w:p>
-      <w:pPr>
-        <w:pStyle w:val="FirstParagraph"/>
-      </w:pPr>
-      <w:r>
-        <w:t xml:space="preserve">Twenty-one entries are listed, every one cited in the text, every one complete. Versions through 4.3 carried five entries marked incomplete and three listed without a citation; all were resolved against the primary sources on 12 October 2026, and the two load-bearing ones for Section 2, the 55,393-query AI Overview audit and the 45-study GEO survey, say what this paper cites them for.</w:t>
-      </w:r>
-    </w:p>
-    <w:p>
-      <w:pPr>
-        <w:pStyle w:val="BodyText"/>
-      </w:pPr>
-      <w:r>
-        <w:t xml:space="preserve">Linehan, L., &amp; Guan, X. (2025, August 11).</w:t>
-      </w:r>
-      <w:r>
-        <w:t xml:space="preserve"> </w:t>
-      </w:r>
-      <w:r>
-        <w:rPr>
-          <w:iCs/>
-          <w:i/>
-        </w:rPr>
-        <w:t xml:space="preserve">Only 12% of AI cited URLs rank in Google’s top 10 for the original prompt.</w:t>
-      </w:r>
-      <w:r>
-        <w:t xml:space="preserve"> </w:t>
-      </w:r>
-      <w:r>
-        <w:t xml:space="preserve">Ahrefs. https://ahrefs.com/blog/ai-search-overlap/ (15,000 long-tail prompts across ChatGPT, Gemini, Copilot and Perplexity; accessed 12 October 2026.)</w:t>
-      </w:r>
-    </w:p>
-    <w:p>
-      <w:pPr>
-        <w:pStyle w:val="BodyText"/>
-      </w:pPr>
-      <w:r>
-        <w:t xml:space="preserve">Balaraman, V., Razniewski, S., &amp; Nutt, W. (2018). Recoin: Relative completeness in Wikidata. In</w:t>
-      </w:r>
-      <w:r>
-        <w:t xml:space="preserve"> </w:t>
-      </w:r>
-      <w:r>
-        <w:rPr>
-          <w:iCs/>
-          <w:i/>
-        </w:rPr>
-        <w:t xml:space="preserve">Companion Proceedings of The Web Conference 2018</w:t>
-      </w:r>
-      <w:r>
-        <w:t xml:space="preserve"> </w:t>
-      </w:r>
-      <w:r>
-        <w:t xml:space="preserve">(pp. 1787–1792). ACM.</w:t>
-      </w:r>
-    </w:p>
-    <w:p>
-      <w:pPr>
-        <w:pStyle w:val="BodyText"/>
-      </w:pPr>
-      <w:r>
-        <w:t xml:space="preserve">Belkin, N. J., Oddy, R. N., &amp; Brooks, H. M. (1982). ASK for information retrieval: Part I. Background and theory.</w:t>
-      </w:r>
-      <w:r>
-        <w:t xml:space="preserve"> </w:t>
-      </w:r>
-      <w:r>
-        <w:rPr>
-          <w:iCs/>
-          <w:i/>
-        </w:rPr>
-        <w:t xml:space="preserve">Journal of Documentation, 38</w:t>
-      </w:r>
-      <w:r>
-        <w:t xml:space="preserve">(2), 61–71.</w:t>
-      </w:r>
-    </w:p>
-    <w:p>
-      <w:pPr>
-        <w:pStyle w:val="BodyText"/>
-      </w:pPr>
-      <w:r>
-        <w:t xml:space="preserve">Broder, A. (2002). A taxonomy of web search.</w:t>
-      </w:r>
-      <w:r>
-        <w:t xml:space="preserve"> </w:t>
-      </w:r>
-      <w:r>
-        <w:rPr>
-          <w:iCs/>
-          <w:i/>
-        </w:rPr>
-        <w:t xml:space="preserve">SIGIR Forum, 36</w:t>
-      </w:r>
-      <w:r>
-        <w:t xml:space="preserve">(2), 3–10.</w:t>
-      </w:r>
-    </w:p>
-    <w:p>
-      <w:pPr>
-        <w:pStyle w:val="BodyText"/>
-      </w:pPr>
-      <w:r>
-        <w:t xml:space="preserve">Chapekis, A., &amp; Lieb, A. (2025, July 22).</w:t>
-      </w:r>
-      <w:r>
-        <w:t xml:space="preserve"> </w:t>
-      </w:r>
-      <w:r>
-        <w:rPr>
-          <w:iCs/>
-          <w:i/>
-        </w:rPr>
-        <w:t xml:space="preserve">Google users are less likely to click on links when an AI summary appears in the results.</w:t>
-      </w:r>
-      <w:r>
-        <w:t xml:space="preserve"> </w:t>
-      </w:r>
-      <w:r>
-        <w:t xml:space="preserve">Pew Research Center.</w:t>
-      </w:r>
-    </w:p>
-    <w:p>
-      <w:pPr>
-        <w:pStyle w:val="BodyText"/>
-      </w:pPr>
-      <w:r>
-        <w:t xml:space="preserve">Galárraga, L., Razniewski, S., Amarilli, A., &amp; Suchanek, F. M. (2017). Predicting completeness in knowledge bases. In</w:t>
-      </w:r>
-      <w:r>
-        <w:t xml:space="preserve"> </w:t>
-      </w:r>
-      <w:r>
-        <w:rPr>
-          <w:iCs/>
-          <w:i/>
-        </w:rPr>
-        <w:t xml:space="preserve">WSDM ’17</w:t>
-      </w:r>
-      <w:r>
-        <w:t xml:space="preserve"> </w:t>
-      </w:r>
-      <w:r>
-        <w:t xml:space="preserve">(pp. 375–383). ACM.</w:t>
-      </w:r>
-    </w:p>
-    <w:p>
-      <w:pPr>
-        <w:pStyle w:val="BodyText"/>
-      </w:pPr>
-      <w:r>
-        <w:t xml:space="preserve">Goel, S., Broder, A., Gabrilovich, E., &amp; Pang, B. (2010). Anatomy of the long tail: Ordinary people with extraordinary tastes. In</w:t>
-      </w:r>
-      <w:r>
-        <w:t xml:space="preserve"> </w:t>
-      </w:r>
-      <w:r>
-        <w:rPr>
-          <w:iCs/>
-          <w:i/>
-        </w:rPr>
-        <w:t xml:space="preserve">WSDM ’10</w:t>
-      </w:r>
-      <w:r>
-        <w:t xml:space="preserve"> </w:t>
-      </w:r>
-      <w:r>
-        <w:t xml:space="preserve">(pp. 201–210). ACM.</w:t>
-      </w:r>
-    </w:p>
-    <w:p>
-      <w:pPr>
-        <w:pStyle w:val="BodyText"/>
-      </w:pPr>
-      <w:r>
-        <w:t xml:space="preserve">Golebiewski, M., &amp; boyd, d. (2018).</w:t>
-      </w:r>
-      <w:r>
-        <w:t xml:space="preserve"> </w:t>
-      </w:r>
-      <w:r>
-        <w:rPr>
-          <w:iCs/>
-          <w:i/>
-        </w:rPr>
-        <w:t xml:space="preserve">Data voids: Where missing data can easily be exploited.</w:t>
-      </w:r>
-      <w:r>
-        <w:t xml:space="preserve"> </w:t>
-      </w:r>
-      <w:r>
-        <w:t xml:space="preserve">Data &amp; Society Research Institute.</w:t>
-      </w:r>
-    </w:p>
-    <w:p>
-      <w:pPr>
-        <w:pStyle w:val="BodyText"/>
-      </w:pPr>
-      <w:r>
-        <w:t xml:space="preserve">Haveliwala, T. H. (2002). Topic-sensitive PageRank. In</w:t>
-      </w:r>
-      <w:r>
-        <w:t xml:space="preserve"> </w:t>
-      </w:r>
-      <w:r>
-        <w:rPr>
-          <w:iCs/>
-          <w:i/>
-        </w:rPr>
-        <w:t xml:space="preserve">WWW ’02</w:t>
-      </w:r>
-      <w:r>
-        <w:t xml:space="preserve"> </w:t>
-      </w:r>
-      <w:r>
-        <w:t xml:space="preserve">(pp. 517–526). ACM.</w:t>
-      </w:r>
-    </w:p>
-    <w:p>
-      <w:pPr>
-        <w:pStyle w:val="BodyText"/>
-      </w:pPr>
-      <w:r>
-        <w:t xml:space="preserve">Hopkinson, A., Gurdasani, A., Palfrey, D., &amp; Mittal, A. (2018). Demand-weighted completeness prediction for a knowledge base. In</w:t>
-      </w:r>
-      <w:r>
-        <w:t xml:space="preserve"> </w:t>
-      </w:r>
-      <w:r>
-        <w:rPr>
-          <w:iCs/>
-          <w:i/>
-        </w:rPr>
-        <w:t xml:space="preserve">NAACL-HLT 2018, Industry Papers</w:t>
-      </w:r>
-      <w:r>
-        <w:t xml:space="preserve"> </w:t>
-      </w:r>
-      <w:r>
-        <w:t xml:space="preserve">(pp. 200–207). ACL.</w:t>
-      </w:r>
-    </w:p>
-    <w:p>
-      <w:pPr>
-        <w:pStyle w:val="BodyText"/>
-      </w:pPr>
-      <w:r>
-        <w:t xml:space="preserve">Luggen, M., Difallah, D., Sarasua, C., Demartini, G., &amp; Cudré-Mauroux, P. (2019). Non-parametric class completeness estimators for collaborative knowledge graphs: The case of Wikidata. In</w:t>
-      </w:r>
-      <w:r>
-        <w:t xml:space="preserve"> </w:t>
-      </w:r>
-      <w:r>
-        <w:rPr>
-          <w:iCs/>
-          <w:i/>
-        </w:rPr>
-        <w:t xml:space="preserve">ISWC 2019</w:t>
-      </w:r>
-      <w:r>
-        <w:t xml:space="preserve"> </w:t>
-      </w:r>
-      <w:r>
-        <w:t xml:space="preserve">(pp. 453–469). Springer.</w:t>
-      </w:r>
-    </w:p>
-    <w:p>
-      <w:pPr>
-        <w:pStyle w:val="BodyText"/>
-      </w:pPr>
-      <w:r>
-        <w:t xml:space="preserve">Martinez, O. (2026).</w:t>
-      </w:r>
-      <w:r>
-        <w:t xml:space="preserve"> </w:t>
-      </w:r>
-      <w:r>
-        <w:rPr>
-          <w:iCs/>
-          <w:i/>
-        </w:rPr>
-        <w:t xml:space="preserve">Optimizing visibility in generative engines: A critical survey of generative engine optimization (2023–2026).</w:t>
-      </w:r>
-      <w:r>
-        <w:t xml:space="preserve"> </w:t>
-      </w:r>
-      <w:r>
-        <w:t xml:space="preserve">arXiv:2607.14035.</w:t>
-      </w:r>
-    </w:p>
-    <w:p>
-      <w:pPr>
-        <w:pStyle w:val="BodyText"/>
-      </w:pPr>
-      <w:r>
-        <w:t xml:space="preserve">Piccardi, T., Catasta, M., Zia, L., &amp; West, R. (2018). Structuring Wikipedia articles with section recommendations. In</w:t>
-      </w:r>
-      <w:r>
-        <w:t xml:space="preserve"> </w:t>
-      </w:r>
-      <w:r>
-        <w:rPr>
-          <w:iCs/>
-          <w:i/>
-        </w:rPr>
-        <w:t xml:space="preserve">SIGIR ’18</w:t>
-      </w:r>
-      <w:r>
-        <w:t xml:space="preserve"> </w:t>
-      </w:r>
-      <w:r>
-        <w:t xml:space="preserve">(pp. 665–674). ACM.</w:t>
-      </w:r>
-    </w:p>
-    <w:p>
-      <w:pPr>
-        <w:pStyle w:val="BodyText"/>
-      </w:pPr>
-      <w:r>
-        <w:t xml:space="preserve">Razniewski, S., Suchanek, F. M., &amp; Nutt, W. (2016). But what do we actually know? In</w:t>
-      </w:r>
-      <w:r>
-        <w:t xml:space="preserve"> </w:t>
-      </w:r>
-      <w:r>
-        <w:rPr>
-          <w:iCs/>
-          <w:i/>
-        </w:rPr>
-        <w:t xml:space="preserve">AKBC 2016</w:t>
-      </w:r>
-      <w:r>
-        <w:t xml:space="preserve"> </w:t>
-      </w:r>
-      <w:r>
-        <w:t xml:space="preserve">(pp. 40–44). ACL.</w:t>
-      </w:r>
-    </w:p>
-    <w:p>
-      <w:pPr>
-        <w:pStyle w:val="BodyText"/>
-      </w:pPr>
-      <w:r>
-        <w:t xml:space="preserve">Razniewski, S., Arnaout, H., Ghosh, S., &amp; Suchanek, F. (2024). Completeness, recall, and negation in open-world knowledge bases: A survey.</w:t>
-      </w:r>
-      <w:r>
-        <w:t xml:space="preserve"> </w:t>
-      </w:r>
-      <w:r>
-        <w:rPr>
-          <w:iCs/>
-          <w:i/>
-        </w:rPr>
-        <w:t xml:space="preserve">ACM Computing Surveys, 56</w:t>
-      </w:r>
-      <w:r>
-        <w:t xml:space="preserve">(6), Article 150. https://doi.org/10.1145/3639563</w:t>
-      </w:r>
-    </w:p>
-    <w:p>
-      <w:pPr>
-        <w:pStyle w:val="BodyText"/>
-      </w:pPr>
-      <w:r>
-        <w:t xml:space="preserve">Redi, M., Gerlach, M., Johnson, I., Morgan, J., &amp; Zia, L. (2020).</w:t>
-      </w:r>
-      <w:r>
-        <w:t xml:space="preserve"> </w:t>
-      </w:r>
-      <w:r>
-        <w:rPr>
-          <w:iCs/>
-          <w:i/>
-        </w:rPr>
-        <w:t xml:space="preserve">A taxonomy of knowledge gaps for Wikimedia projects.</w:t>
-      </w:r>
-      <w:r>
-        <w:t xml:space="preserve"> </w:t>
-      </w:r>
-      <w:r>
-        <w:t xml:space="preserve">arXiv:2008.12314.</w:t>
-      </w:r>
-    </w:p>
-    <w:p>
-      <w:pPr>
-        <w:pStyle w:val="BodyText"/>
-      </w:pPr>
-      <w:r>
-        <w:t xml:space="preserve">Ripoll, M., Reeves, N., Kurteva, A., Simperl, E., Meroño Peñuela, A., &amp; Diepold, K. (2025).</w:t>
-      </w:r>
-      <w:r>
-        <w:t xml:space="preserve"> </w:t>
-      </w:r>
-      <w:r>
-        <w:rPr>
-          <w:iCs/>
-          <w:i/>
-        </w:rPr>
-        <w:t xml:space="preserve">Filling in the blanks? A systematic review and theoretical conceptualisation for measuring WikiData content gaps.</w:t>
-      </w:r>
-      <w:r>
-        <w:t xml:space="preserve"> </w:t>
-      </w:r>
-      <w:r>
-        <w:t xml:space="preserve">arXiv:2505.16383.</w:t>
-      </w:r>
-    </w:p>
-    <w:p>
-      <w:pPr>
-        <w:pStyle w:val="BodyText"/>
-      </w:pPr>
-      <w:r>
-        <w:t xml:space="preserve">Shao, Y., Jiang, Y., Kanell, T. A., Xu, P., Khattab, O., &amp; Lam, M. S. (2024). Assisting in writing Wikipedia-like articles from scratch with large language models. In</w:t>
-      </w:r>
-      <w:r>
-        <w:t xml:space="preserve"> </w:t>
-      </w:r>
-      <w:r>
-        <w:rPr>
-          <w:iCs/>
-          <w:i/>
-        </w:rPr>
-        <w:t xml:space="preserve">NAACL 2024.</w:t>
-      </w:r>
-      <w:r>
-        <w:t xml:space="preserve"> </w:t>
-      </w:r>
-      <w:r>
-        <w:t xml:space="preserve">ACL.</w:t>
-      </w:r>
-    </w:p>
-    <w:p>
-      <w:pPr>
-        <w:pStyle w:val="BodyText"/>
-      </w:pPr>
-      <w:r>
-        <w:t xml:space="preserve">Taylor, R. S. (1968). Question-negotiation and information seeking in libraries.</w:t>
-      </w:r>
-      <w:r>
-        <w:t xml:space="preserve"> </w:t>
-      </w:r>
-      <w:r>
-        <w:rPr>
-          <w:iCs/>
-          <w:i/>
-        </w:rPr>
-        <w:t xml:space="preserve">College &amp; Research Libraries, 29</w:t>
-      </w:r>
-      <w:r>
-        <w:t xml:space="preserve">(3), 178–194.</w:t>
-      </w:r>
-    </w:p>
-    <w:p>
-      <w:pPr>
-        <w:pStyle w:val="BodyText"/>
-      </w:pPr>
-      <w:r>
-        <w:t xml:space="preserve">Wulczyn, E., West, R., Zia, L., &amp; Leskovec, J. (2016). Growing Wikipedia across languages via recommendation. In</w:t>
-      </w:r>
-      <w:r>
-        <w:t xml:space="preserve"> </w:t>
-      </w:r>
-      <w:r>
-        <w:rPr>
-          <w:iCs/>
-          <w:i/>
-        </w:rPr>
-        <w:t xml:space="preserve">WWW ’16</w:t>
-      </w:r>
-      <w:r>
-        <w:t xml:space="preserve"> </w:t>
-      </w:r>
-      <w:r>
-        <w:t xml:space="preserve">(pp. 975–985). ACM.</w:t>
-      </w:r>
-    </w:p>
-    <w:p>
-      <w:pPr>
-        <w:pStyle w:val="BodyText"/>
-      </w:pPr>
-      <w:r>
-        <w:t xml:space="preserve">Xu, H., Iqbal, U., &amp; Montgomery, J. M. (2026).</w:t>
-      </w:r>
-      <w:r>
-        <w:t xml:space="preserve"> </w:t>
-      </w:r>
-      <w:r>
-        <w:rPr>
-          <w:iCs/>
-          <w:i/>
-        </w:rPr>
-        <w:t xml:space="preserve">Measuring Google AI Overviews: Activation, source quality, claim fidelity, and publisher impact.</w:t>
-      </w:r>
-      <w:r>
-        <w:t xml:space="preserve"> </w:t>
-      </w:r>
-      <w:r>
-        <w:t xml:space="preserve">arXiv:2605.14021.</w:t>
-      </w:r>
-    </w:p>
-    <w:bookmarkEnd w:id="70"/>
-    <w:bookmarkStart w:id="71" w:name="appendix-a-version-history"/>
-    <w:p>
-      <w:pPr>
-        <w:pStyle w:val="Heading2"/>
-      </w:pPr>
-      <w:r>
-        <w:t xml:space="preserve">Appendix A: Version history</w:t>
-      </w:r>
-    </w:p>
-    <w:p>
-      <w:pPr>
-        <w:pStyle w:val="FirstParagraph"/>
-      </w:pPr>
-      <w:r>
-        <w:t xml:space="preserve">This manuscript is the fourth structural version and has been through five rounds of adversarial internal review. The history is recorded here rather than in the body, where in version 3.3 it had grown to 26% of the text and had become larger than the results section.</w:t>
+        <w:t xml:space="preserve">v3.1 to v3.3.</w:t>
+      </w:r>
+      <w:r>
+        <w:t xml:space="preserve"> </w:t>
+      </w:r>
+      <w:r>
+        <w:t xml:space="preserve">Three corrections that change how a figure must be read. The October 2025 carrier exports were certified as</w:t>
+      </w:r>
+      <w:r>
+        <w:t xml:space="preserve"> </w:t>
+      </w:r>
+      <w:r>
+        <w:t xml:space="preserve">“</w:t>
+      </w:r>
+      <w:r>
+        <w:t xml:space="preserve">the one pre-launch artifact that was not selected on the outcome</w:t>
+      </w:r>
+      <w:r>
+        <w:t xml:space="preserve">”</w:t>
+      </w:r>
+      <w:r>
+        <w:t xml:space="preserve">; they are ranked-keyword exports, selected on a prior ranking outcome. Day 45 was named the primary checkpoint on the stated ground that it preceded the automated link arrival, which the paper’s own table refutes; the checkpoint is day 37. And the conclusion that link acquisition played no part in explaining the outcome does not hold across the series, because most of the series postdates the network; it is now stated at day 37 only.</w:t>
+      </w:r>
+    </w:p>
+    <w:p>
+      <w:pPr>
+        <w:pStyle w:val="BodyText"/>
+      </w:pPr>
+      <w:r>
+        <w:t xml:space="preserve">Two further corrections were to arguments rather than figures. A replacement argument in v3.1 held that the per-keyword and pooled views ran over identical rows so selection was held constant; they run over different row sets and the argument fails. And a draft of the link-interval analysis reported only the intervals that made the confound look largest, inferring an acceleration from a baseline chosen at the series minimum; showing all six intervals withdraws it.</w:t>
       </w:r>
     </w:p>
     <w:p>
@@ -9124,13 +9611,13 @@
           <w:bCs/>
           <w:b/>
         </w:rPr>
-        <w:t xml:space="preserve">v1 to v2.2.</w:t>
-      </w:r>
-      <w:r>
-        <w:t xml:space="preserve"> </w:t>
-      </w:r>
-      <w:r>
-        <w:t xml:space="preserve">Framed as a method paper for a Content Gap Score, with the deployment as its validation. Three statements were false and are corrected: that two independent annotators had graded the audit samples (none had, and no annotation study has been run); that the ontology had been released (nothing had been); and an assertion of organizational permission with the date left blank. The first was the most serious: a past-tense claim of an independent check that did not happen, in a document naming the organization.</w:t>
+        <w:t xml:space="preserve">v4.0.</w:t>
+      </w:r>
+      <w:r>
+        <w:t xml:space="preserve"> </w:t>
+      </w:r>
+      <w:r>
+        <w:t xml:space="preserve">Restructured and retitled. The instrument divergence, present in the data since v2.2 and never advanced as a result, becomes the primary contribution, because it is the finding that does not rest on the author’s judgment. The deployment series is demoted to context. The scoring function moves to Appendix B. Claims the preceding versions had conceded piecemeal are removed rather than carried with a qualification attached.</w:t>
       </w:r>
     </w:p>
     <w:p>
@@ -9142,13 +9629,13 @@
           <w:bCs/>
           <w:b/>
         </w:rPr>
-        <w:t xml:space="preserve">v3.0.</w:t>
-      </w:r>
-      <w:r>
-        <w:t xml:space="preserve"> </w:t>
-      </w:r>
-      <w:r>
-        <w:t xml:space="preserve">Reframed as a deployment measurement study. The score was withdrawn as an evaluated contribution. A section on what the paper does not report was placed before the results.</w:t>
+        <w:t xml:space="preserve">v4.1 to v4.3.</w:t>
+      </w:r>
+      <w:r>
+        <w:t xml:space="preserve"> </w:t>
+      </w:r>
+      <w:r>
+        <w:t xml:space="preserve">Corrections to statements version 4.0 had made. The 9.2x comparison of AI-answer counts was withdrawn as a scope mismatch, because the second instrument’s count is scoped to the domain rather than the prefix, and a claim about platform ordering resting on a breakdown that did not sum to its total was dropped. Divergence between instruments had been described as error; it is a bound on the larger error and nothing more (Section 5.6). The October row of Table 2 had been labeled month-to-date; it is a monthly run-rate. The AI Overview ratio in Table 3 had been described as purely definitional; it is partly territorial. The deployment had been described as broad rather than driven by a few pages, alongside figures that contradicted it; the breadth claim was withdrawn and only the internally consistent concentration figures are kept. Adjacent sentences had counted two and three algorithm updates; one named, dated update falls in the window. In v4.2 and v4.3, the page count was corrected. The section’s page count was verified by fetching every code page linked from its 52 state hubs. It holds 381 code pages, not 290, and covers every geographic code assigned to a US state or DC. The 88-code within-class control registered since v3.1 therefore does not exist and is withdrawn. The author confirms all pages were published together at launch, so the 290 was a miscount and the section did not grow during the window.</w:t>
       </w:r>
     </w:p>
     <w:p>
@@ -9160,36 +9647,13 @@
           <w:bCs/>
           <w:b/>
         </w:rPr>
-        <w:t xml:space="preserve">v3.1 to v3.3.</w:t>
-      </w:r>
-      <w:r>
-        <w:t xml:space="preserve"> </w:t>
-      </w:r>
-      <w:r>
-        <w:t xml:space="preserve">Three corrections that change how a figure must be read. The October 2025 carrier exports were certified as</w:t>
-      </w:r>
-      <w:r>
-        <w:t xml:space="preserve"> </w:t>
-      </w:r>
-      <w:r>
-        <w:t xml:space="preserve">“</w:t>
-      </w:r>
-      <w:r>
-        <w:t xml:space="preserve">the one pre-launch artifact that was not selected on the outcome</w:t>
-      </w:r>
-      <w:r>
-        <w:t xml:space="preserve">”</w:t>
-      </w:r>
-      <w:r>
-        <w:t xml:space="preserve">; they are ranked-keyword exports, selected on a prior ranking outcome. Day 45 was named the primary checkpoint on the stated ground that it preceded the automated link arrival, which the paper’s own table refutes; the checkpoint is day 37. And the conclusion that link acquisition played no part in explaining the outcome does not hold across the series, because most of the series postdates the network; it is now stated at day 37 only.</w:t>
-      </w:r>
-    </w:p>
-    <w:p>
-      <w:pPr>
-        <w:pStyle w:val="BodyText"/>
-      </w:pPr>
-      <w:r>
-        <w:t xml:space="preserve">Two further corrections were to arguments rather than figures. A replacement argument in v3.1 held that the per-keyword and pooled views ran over identical rows so selection was held constant; they run over different row sets and the argument fails. And a draft of the link-interval analysis reported only the intervals that made the confound look largest, inferring an acceleration from a baseline chosen at the series minimum; showing all six intervals withdraws it.</w:t>
+        <w:t xml:space="preserve">v4.4.</w:t>
+      </w:r>
+      <w:r>
+        <w:t xml:space="preserve"> </w:t>
+      </w:r>
+      <w:r>
+        <w:t xml:space="preserve">The five incomplete reference entries and three uncited ones were resolved against primary sources.</w:t>
       </w:r>
     </w:p>
     <w:p>
@@ -9207,7 +9671,7 @@
         <w:t xml:space="preserve"> </w:t>
       </w:r>
       <w:r>
-        <w:t xml:space="preserve">The cross-prefix replication registered in v4.0 was run: twelve sections of the same domain on both instruments, one read date. The age hypothesis is retracted; the vendor ratio on estimated visits spans 0.20x to 7.24x within one site and is unrelated to age. Section 5.5. The five incomplete citations and three uncited references were resolved against primary sources.</w:t>
+        <w:t xml:space="preserve">The cross-prefix replication registered in v4.0 was run: twelve sections of the same domain on both instruments, one read date. The age hypothesis is retracted; the vendor ratio on estimated visits spans 0.20x to 7.24x within one site, with no detectable relationship to age. Section 5.5.</w:t>
       </w:r>
     </w:p>
     <w:p>
@@ -9219,13 +9683,13 @@
           <w:bCs/>
           <w:b/>
         </w:rPr>
-        <w:t xml:space="preserve">v4.2 and v4.3.</w:t>
-      </w:r>
-      <w:r>
-        <w:t xml:space="preserve"> </w:t>
-      </w:r>
-      <w:r>
-        <w:t xml:space="preserve">The section’s page count was verified by fetching every code page linked from its 52 state hubs. It holds 381 code pages, not 290, and covers every geographic code assigned to a US state or DC. The 88-code within-class control registered since v3.1 therefore does not exist and is withdrawn. The author confirms all pages were published together at launch, so the 290 was a miscount and the section did not grow during the window.</w:t>
+        <w:t xml:space="preserve">v4.6.</w:t>
+      </w:r>
+      <w:r>
+        <w:t xml:space="preserve"> </w:t>
+      </w:r>
+      <w:r>
+        <w:t xml:space="preserve">Six figures added and the abstract shortened. No figure in the text changed.</w:t>
       </w:r>
     </w:p>
     <w:p>
@@ -9237,13 +9701,43 @@
           <w:bCs/>
           <w:b/>
         </w:rPr>
-        <w:t xml:space="preserve">v4.0.</w:t>
-      </w:r>
-      <w:r>
-        <w:t xml:space="preserve"> </w:t>
-      </w:r>
-      <w:r>
-        <w:t xml:space="preserve">Restructured. The instrument divergence, present in the data since v2.2 and never advanced as a result, becomes the primary contribution, because it is the finding that does not rest on the author’s judgment. The deployment series is demoted to context. The scoring function moves to Appendix B. Claims the preceding versions had conceded piecemeal are removed rather than carried with a qualification attached.</w:t>
+        <w:t xml:space="preserve">v4.7 and v4.8.</w:t>
+      </w:r>
+      <w:r>
+        <w:t xml:space="preserve"> </w:t>
+      </w:r>
+      <w:r>
+        <w:t xml:space="preserve">Section 5.5 was regenerated by the released script</w:t>
+      </w:r>
+      <w:r>
+        <w:t xml:space="preserve"> </w:t>
+      </w:r>
+      <w:r>
+        <w:rPr>
+          <w:rStyle w:val="VerbatimChar"/>
+        </w:rPr>
+        <w:t xml:space="preserve">analyze.py</w:t>
+      </w:r>
+      <w:r>
+        <w:t xml:space="preserve">, because the v4.5 text had been written from recollection of the table and miscounted it: six of twelve prefixes, not five, have a ratio below one, and the age correlation is −0.11, not −0.09. Territory-matched ratios, the vendors’ agreement on the ordering of sections (60 of 66 pairs) and the power of the test were added, and the earlier statement that a single-vendor comparison between two sections</w:t>
+      </w:r>
+      <w:r>
+        <w:t xml:space="preserve"> </w:t>
+      </w:r>
+      <w:r>
+        <w:t xml:space="preserve">“</w:t>
+      </w:r>
+      <w:r>
+        <w:t xml:space="preserve">carries an unknown sign</w:t>
+      </w:r>
+      <w:r>
+        <w:t xml:space="preserve">”</w:t>
+      </w:r>
+      <w:r>
+        <w:t xml:space="preserve"> </w:t>
+      </w:r>
+      <w:r>
+        <w:t xml:space="preserve">was withdrawn as an overstatement. Two related-work paragraphs, Table 5’s day-77 column, referring-domain ranges in Table 6 and two Table 1 rows were added; stale cross-references were corrected; and the corrections list in Section 12 was replaced by this appendix. Section 5.6’s bound was restated: a 27.1x disagreement means at least one instrument is off by a factor of at least 5.2, the square root of 27.1; the earlier text gave 13x, which is the absolute bound expressed in units of the smaller reading, not a multiplicative factor. The left-censoring of the age proxy was corrected from three prefixes to one, and the prefixes that cross one under territory matching were corrected. In v4.8 the original title, used through v2.2, was restored, and the abstract, Section 1, lessons 1 and 3 of Section 9.2 and the conclusion were revised to introduce the User First Intelligence framework by name and to state plainly that its scoring function is specified and not evaluated; the abstract is longer as a result. The organization that operates the section is no longer named; the author’s affiliation is given as KL University only.</w:t>
       </w:r>
     </w:p>
     <w:bookmarkEnd w:id="71"/>

</xml_diff>

<commit_message>
v4.8 final: identifiability statement, cite release version, README test count
Co-Authored-By: Claude Fable 5 <noreply@anthropic.com>
Claude-Session: https://claude.ai/code/session_01NVWVRPSXWbvUmxdzTrqBTy
</commit_message>
<xml_diff>
--- a/paper/User_First_Intelligence_v4.8_2026-10-12.docx
+++ b/paper/User_First_Intelligence_v4.8_2026-10-12.docx
@@ -8487,19 +8487,7 @@
         <w:t xml:space="preserve"> </w:t>
       </w:r>
       <w:r>
-        <w:t xml:space="preserve">under Apache 2.0, commit</w:t>
-      </w:r>
-      <w:r>
-        <w:t xml:space="preserve"> </w:t>
-      </w:r>
-      <w:r>
-        <w:rPr>
-          <w:rStyle w:val="VerbatimChar"/>
-        </w:rPr>
-        <w:t xml:space="preserve">6474350</w:t>
-      </w:r>
-      <w:r>
-        <w:t xml:space="preserve">: test suite, command line interface, and a worked example that runs offline on public data. The corrected numbering-plan ontology in YAML with OWL and SHACL export, and the area-code dataset the example uses. It has</w:t>
+        <w:t xml:space="preserve">under Apache 2.0, version 0.2.0: test suite, command line interface, and a worked example that runs offline on public data. The corrected numbering-plan ontology in YAML with OWL and SHACL export, and the area-code dataset the example uses. It has</w:t>
       </w:r>
       <w:r>
         <w:t xml:space="preserve"> </w:t>
@@ -8741,7 +8729,7 @@
         <w:t xml:space="preserve"> </w:t>
       </w:r>
       <w:r>
-        <w:t xml:space="preserve">The organization is not named in this paper.</w:t>
+        <w:t xml:space="preserve">The organization is not named in this paper. Not naming it does not make it unidentifiable: the prefixes in Table 4 and the conflict-of-interest statement in Section 10 allow a reader with access to the same instruments to identify it, and that statement is kept because the disclosure is required. The name is withheld; the identity is not claimed to be concealed.</w:t>
       </w:r>
     </w:p>
     <w:p>

</xml_diff>

<commit_message>
Final pre-submission pass: panel R8 minor fixes; release frozen artifacts
Table 4 US shares to one decimal so the matched ratios recompute from the
printed table; keyword read-date bridge in the caption; platform-count claim
dropped from the abstract; deterministic tiebreak in score ordering; frozen
query set, parameter lock and manifest committed at examples/nanp/out/.

Co-Authored-By: Claude Fable 5 <noreply@anthropic.com>
Claude-Session: https://claude.ai/code/session_01NVWVRPSXWbvUmxdzTrqBTy
</commit_message>
<xml_diff>
--- a/paper/User_First_Intelligence_v4.8_2026-10-12.docx
+++ b/paper/User_First_Intelligence_v4.8_2026-10-12.docx
@@ -81,7 +81,7 @@
         <w:pStyle w:val="BodyText"/>
       </w:pPr>
       <w:r>
-        <w:t xml:space="preserve">The divergence is the primary result because it does not depend on the author’s judgment: every reading is of a public prefix that any subscriber can re-read. The deployment series is reported as context. At day 37, the last observation before an automated link network arrived, the section held 15,830 ranking positions with nineteen referring domains; by day 77 it appeared in 17,206 stored AI answers across six platforms with no editorial link, and the pages most cited were the hubs that enumerate codes rather than the pages that answer. Six enabling conditions, the deployment’s cost, and six lessons stated as its failures are given. No causal claim is made.</w:t>
+        <w:t xml:space="preserve">The divergence is the primary result because it does not depend on the author’s judgment: every reading is of a public prefix that any subscriber can re-read. The deployment series is reported as context. At day 37, the last observation before an automated link network arrived, the section held 15,830 ranking positions with nineteen referring domains; by day 77 it appeared in 17,206 stored AI answers with no editorial link, and the pages most cited were the hubs that enumerate codes rather than the pages that answer. Six enabling conditions, the deployment’s cost, and six lessons stated as its failures are given. No causal claim is made.</w:t>
       </w:r>
     </w:p>
     <w:bookmarkEnd w:id="20"/>
@@ -2912,7 +2912,7 @@
           <w:iCs/>
           <w:i/>
         </w:rPr>
-        <w:t xml:space="preserve">column is the United States share of Ahrefs’ estimate from its traffic-by-location table, and the matched ratio divides Semrush US by Ahrefs US-only. The keyword ratio is Semrush over Ahrefs, like the visits ratios; the referring-domain ratio is Ahrefs over Semrush. Referring-domain counts are the 12 October reads and differ slightly from Section 5.4’s 11 October read (80 Semrush domains, 11.4x).</w:t>
+        <w:t xml:space="preserve">column is the United States share of Ahrefs’ estimate from its traffic-by-location table, and the matched ratio divides Semrush US by Ahrefs US-only. The keyword ratio is Semrush over Ahrefs, like the visits ratios; the referring-domain ratio is Ahrefs over Semrush. Referring-domain and keyword counts are the 12 October reads and differ slightly from Sections 5.2 and 5.4’s 10–11 October reads (29,000 and 58,586 keywords; 80 Semrush domains, 11.4x).</w:t>
       </w:r>
     </w:p>
     <w:tbl>
@@ -3171,7 +3171,7 @@
               <w:jc w:val="left"/>
             </w:pPr>
             <w:r>
-              <w:t xml:space="preserve">81%</w:t>
+              <w:t xml:space="preserve">81.4%</w:t>
             </w:r>
           </w:p>
         </w:tc>
@@ -3337,7 +3337,7 @@
               <w:jc w:val="left"/>
             </w:pPr>
             <w:r>
-              <w:t xml:space="preserve">70%</w:t>
+              <w:t xml:space="preserve">69.6%</w:t>
             </w:r>
           </w:p>
         </w:tc>
@@ -3495,7 +3495,7 @@
               <w:jc w:val="left"/>
             </w:pPr>
             <w:r>
-              <w:t xml:space="preserve">99%</w:t>
+              <w:t xml:space="preserve">99.2%</w:t>
             </w:r>
           </w:p>
         </w:tc>
@@ -3653,7 +3653,7 @@
               <w:jc w:val="left"/>
             </w:pPr>
             <w:r>
-              <w:t xml:space="preserve">83%</w:t>
+              <w:t xml:space="preserve">82.6%</w:t>
             </w:r>
           </w:p>
         </w:tc>
@@ -3811,7 +3811,7 @@
               <w:jc w:val="left"/>
             </w:pPr>
             <w:r>
-              <w:t xml:space="preserve">99%</w:t>
+              <w:t xml:space="preserve">98.8%</w:t>
             </w:r>
           </w:p>
         </w:tc>
@@ -3969,7 +3969,7 @@
               <w:jc w:val="left"/>
             </w:pPr>
             <w:r>
-              <w:t xml:space="preserve">99%</w:t>
+              <w:t xml:space="preserve">98.7%</w:t>
             </w:r>
           </w:p>
         </w:tc>
@@ -4127,7 +4127,7 @@
               <w:jc w:val="left"/>
             </w:pPr>
             <w:r>
-              <w:t xml:space="preserve">100%</w:t>
+              <w:t xml:space="preserve">99.8%</w:t>
             </w:r>
           </w:p>
         </w:tc>
@@ -4285,7 +4285,7 @@
               <w:jc w:val="left"/>
             </w:pPr>
             <w:r>
-              <w:t xml:space="preserve">98%</w:t>
+              <w:t xml:space="preserve">98.5%</w:t>
             </w:r>
           </w:p>
         </w:tc>
@@ -4443,7 +4443,7 @@
               <w:jc w:val="left"/>
             </w:pPr>
             <w:r>
-              <w:t xml:space="preserve">94%</w:t>
+              <w:t xml:space="preserve">93.6%</w:t>
             </w:r>
           </w:p>
         </w:tc>
@@ -4601,7 +4601,7 @@
               <w:jc w:val="left"/>
             </w:pPr>
             <w:r>
-              <w:t xml:space="preserve">99%</w:t>
+              <w:t xml:space="preserve">99.4%</w:t>
             </w:r>
           </w:p>
         </w:tc>
@@ -4759,7 +4759,7 @@
               <w:jc w:val="left"/>
             </w:pPr>
             <w:r>
-              <w:t xml:space="preserve">99%</w:t>
+              <w:t xml:space="preserve">99.3%</w:t>
             </w:r>
           </w:p>
         </w:tc>
@@ -4917,7 +4917,7 @@
               <w:jc w:val="left"/>
             </w:pPr>
             <w:r>
-              <w:t xml:space="preserve">43%</w:t>
+              <w:t xml:space="preserve">42.6%</w:t>
             </w:r>
           </w:p>
         </w:tc>
@@ -5103,7 +5103,7 @@
         <w:t xml:space="preserve"> </w:t>
       </w:r>
       <w:r>
-        <w:t xml:space="preserve">Unmatched for territory, Semrush’s estimate runs from one fifth of Ahrefs’ (/local/bundles/, 0.20x) to seven times it (/local/area-codes/, 7.24x), a spread of 1.55 orders of magnitude, with a median of 1.01 and six of twelve prefixes below one. Matched for territory the spread is wider (0.20x to 8.89x), the median is 1.06, and four of twelve are below one, because two of the six sub-one prefixes cross one once their non-US traffic is removed (/product-compare/, 70% US, from 0.75x to 1.07x; /device-compare/, 83% US, from 0.99x to 1.20x); /es-us/local/, at 43% US, moves from 0.25x to 0.58x and stays below one. The territory objection therefore changes the count and not the conclusion: on the same domain, on the same day, the vendors’ estimates differ by factors from well below one to well above it, and no single correction factor maps one onto the other.</w:t>
+        <w:t xml:space="preserve">Unmatched for territory, Semrush’s estimate runs from one fifth of Ahrefs’ (/local/bundles/, 0.20x) to seven times it (/local/area-codes/, 7.24x), a spread of 1.55 orders of magnitude, with a median of 1.01 and six of twelve prefixes below one. Matched for territory the spread is wider (0.20x to 8.89x), the median is 1.06, and four of twelve are below one, because two of the six sub-one prefixes cross one once their non-US traffic is removed (/product-compare/, 69.6% US, from 0.75x to 1.07x; /device-compare/, 82.6% US, from 0.99x to 1.20x); /es-us/local/, at 42.6% US, moves from 0.25x to 0.58x and stays below one. The territory objection therefore changes the count and not the conclusion: on the same domain, on the same day, the vendors’ estimates differ by factors from well below one to well above it, and no single correction factor maps one onto the other.</w:t>
       </w:r>
     </w:p>
     <w:p>
@@ -8487,7 +8487,19 @@
         <w:t xml:space="preserve"> </w:t>
       </w:r>
       <w:r>
-        <w:t xml:space="preserve">under Apache 2.0, version 0.2.0: test suite, command line interface, and a worked example that runs offline on public data. The corrected numbering-plan ontology in YAML with OWL and SHACL export, and the area-code dataset the example uses. It has</w:t>
+        <w:t xml:space="preserve">under Apache 2.0, version 0.2.0: test suite, command line interface, and a worked example that runs offline on public data. The corrected numbering-plan ontology in YAML with OWL and SHACL export, and the area-code dataset the example uses. The frozen 924-query set, the parameter lock and the run manifest are committed in the repository at</w:t>
+      </w:r>
+      <w:r>
+        <w:t xml:space="preserve"> </w:t>
+      </w:r>
+      <w:r>
+        <w:rPr>
+          <w:rStyle w:val="VerbatimChar"/>
+        </w:rPr>
+        <w:t xml:space="preserve">examples/nanp/out/</w:t>
+      </w:r>
+      <w:r>
+        <w:t xml:space="preserve">, so the digests quoted in Sections 11 and Appendix B resolve to released files. It has</w:t>
       </w:r>
       <w:r>
         <w:t xml:space="preserve"> </w:t>
@@ -8815,14 +8827,6 @@
     <w:p>
       <w:pPr>
         <w:pStyle w:val="FirstParagraph"/>
-      </w:pPr>
-      <w:r>
-        <w:t xml:space="preserve">Twenty-nine entries, each cited in the text.</w:t>
-      </w:r>
-    </w:p>
-    <w:p>
-      <w:pPr>
-        <w:pStyle w:val="BodyText"/>
       </w:pPr>
       <w:r>
         <w:t xml:space="preserve">Balaraman, V., Razniewski, S., &amp; Nutt, W. (2018). Recoin: Relative completeness in Wikidata. In</w:t>

</xml_diff>

<commit_message>
v4.8: neutral wording for vendor comparisons; numbers unchanged
Co-Authored-By: Claude Fable 5.1 <noreply@anthropic.com>
Claude-Session: https://claude.ai/code/session_01NVWVRPSXWbvUmxdzTrqBTy
</commit_message>
<xml_diff>
--- a/paper/User_First_Intelligence_v4.8_2026-10-12.docx
+++ b/paper/User_First_Intelligence_v4.8_2026-10-12.docx
@@ -99,15 +99,15 @@
         <w:pStyle w:val="FirstParagraph"/>
       </w:pPr>
       <w:r>
-        <w:t xml:space="preserve">Almost every empirical claim in applied search research rests on a commercial analytics platform. Papers report that a technique moved visibility, that a competitor holds a share of some keyword space, that AI answers cite one kind of source more than another. The underlying numbers come from Ahrefs, Semrush, Similarweb or a comparable vendor, and they are reported the way measurements are reported: as quantities, sometimes to five significant figures, usually from one vendor, rarely with any statement of error.</w:t>
-      </w:r>
-    </w:p>
-    <w:p>
-      <w:pPr>
-        <w:pStyle w:val="BodyText"/>
-      </w:pPr>
-      <w:r>
-        <w:t xml:space="preserve">The vendors do not claim otherwise in their documentation, which describes click models over estimated volumes at estimated positions. The practice treats them as counters anyway. This paper is an attempt to put a number on what that costs. The question matters for any framework that claims to find content worth building, including the one this paper specifies: User First Intelligence identifies gaps from an industry’s knowledge structure and its users’ questions rather than from keyword volume, and the first thing such a framework needs is an honest measurement of what happens when a gap is filled.</w:t>
+        <w:t xml:space="preserve">Almost every empirical claim in applied search research rests on a commercial analytics platform. Papers report that a technique moved visibility, that a competitor holds a share of some keyword space, that AI answers cite one kind of source more than another. The underlying numbers come from Ahrefs, Semrush, Similarweb or a comparable vendor, and they are reported the way measurements are reported: as quantities, sometimes to five significant figures, usually from one vendor, rarely with any statement of uncertainty.</w:t>
+      </w:r>
+    </w:p>
+    <w:p>
+      <w:pPr>
+        <w:pStyle w:val="BodyText"/>
+      </w:pPr>
+      <w:r>
+        <w:t xml:space="preserve">The vendors do not claim otherwise in their documentation, which describes click models over estimated volumes at estimated positions. The practice treats them as counters anyway. This paper puts a number on how far two such estimates of one object can lie apart, so that the practice can state its uncertainty. The question matters for any framework that claims to find content worth building, including the one this paper specifies: User First Intelligence identifies gaps from an industry’s knowledge structure and its users’ questions rather than from keyword volume, and the first thing such a framework needs is an honest measurement of what happens when a gap is filled.</w:t>
       </w:r>
     </w:p>
     <w:bookmarkStart w:id="21" w:name="Xb1af0e1b50aa7e2fd0c239798b9480eadff2d42"/>
@@ -447,7 +447,7 @@
         <w:t xml:space="preserve"> </w:t>
       </w:r>
       <w:r>
-        <w:t xml:space="preserve">The validity of vendor traffic estimates has been measured mainly against first-party analytics, site by site. An agency comparison of Similarweb, Ahrefs and Semrush against Google Analytics organic visits for 25 sites found all three wrong in level, with the two keyword-based tools underestimating total traffic by 17% and 30% [Langridge 2016]. A vendor study of 1,635 sites against Google Search Console reports a median deviation of 49.5% for Ahrefs and 68.4% for Semrush, and a correlation with the first-party figure of 0.76 and 0.74 [Soulo 2022]; it is the vendor reporting on itself and on a competitor, and is cited for its design rather than its ranking. In academic work, traffic-ranking services have been compared as proxies for organizational performance [Vaughan &amp; Yang 2013], and the major top-site lists were shown to disagree with one another on most of their entries and to churn by up to half of their domains a day [Scheitle et al. 2018], which motivated a ranking built to be stable and hard to manipulate [Le Pochat et al. 2019]. Those studies compare an estimate with a ground truth across many sites, or compare lists across the whole web. This paper does neither: it has no ground truth, and it holds the site fixed. What it adds is a reading of two vendors on an object both observed from zero, and a cross-section of twelve sections of one domain on one day, which separates disagreement about a site from disagreement about a section of it.</w:t>
+        <w:t xml:space="preserve">The validity of vendor traffic estimates has been measured mainly against first-party analytics, site by site. An agency comparison of Similarweb, Ahrefs and Semrush against Google Analytics organic visits for 25 sites found all three differing from the first-party figure in level, with the two keyword-based tools below it on total traffic by 17% and 30% [Langridge 2016]. A vendor study of 1,635 sites against Google Search Console reports a median deviation of 49.5% for Ahrefs and 68.4% for Semrush, and a correlation with the first-party figure of 0.76 and 0.74 [Soulo 2022]; it is the vendor reporting on itself and on a competitor, and is cited for its design rather than its ranking. In academic work, traffic-ranking services have been compared as proxies for organizational performance [Vaughan &amp; Yang 2013], and the major top-site lists were shown to disagree with one another on most of their entries and to churn by up to half of their domains a day [Scheitle et al. 2018], which motivated a ranking built to be stable and hard to manipulate [Le Pochat et al. 2019]. Those studies compare an estimate with a ground truth across many sites, or compare lists across the whole web. This paper does neither: it has no ground truth, and it holds the site fixed. What it adds is a reading of two vendors on an object both observed from zero, and a cross-section of twelve sections of one domain on one day, which separates disagreement about a site from disagreement about a section of it.</w:t>
       </w:r>
     </w:p>
     <w:p>
@@ -5253,7 +5253,7 @@
         <w:pStyle w:val="BodyText"/>
       </w:pPr>
       <w:r>
-        <w:t xml:space="preserve">At the August ratio of 27.1x, the two readings cannot both lie within a factor of 5.2, the square root of 27.1, of the true value, so at least one instrument is off about this prefix by a factor of five or more, and this study cannot say which. In absolute terms the bound is larger: at least one reading errs by at least 13 times the smaller reading. That is the whole of the inference, and it is enough to be worth reporting: a field that treats these outputs as measurements should know that at least one major vendor can be off by a factor of five or more on a two-month-old section, without knowing which one.</w:t>
+        <w:t xml:space="preserve">At the August ratio of 27.1x, the two readings cannot both lie within a factor of 5.2, the square root of 27.1, of the true value, so at least one of the two estimates lies a factor of five or more from the quantity both are estimating, and this study cannot say which. In absolute terms the bound is larger: the two readings differ by at least 13 times the smaller one. That is the whole of the inference, and it is a property of the pair, not a finding about either vendor: a reader who compares such estimates across instruments should know that on a two-month-old section they can stand a factor of five or more apart, without the comparison itself showing which is closer.</w:t>
       </w:r>
     </w:p>
     <w:p>
@@ -5347,7 +5347,7 @@
         <w:t xml:space="preserve"> </w:t>
       </w:r>
       <w:r>
-        <w:t xml:space="preserve">The design this bears on is the standard one in applied content work: publish something, read one dashboard, compare it against the rest of the site or against a competitor. Section 5.5 is the finding that bears on it most directly. Across twelve sections of one domain the vendor ratio on estimated visits spans 0.20x to 7.24x (0.20x to 8.89x territory-matched), so no domain-level calibration factor can convert one vendor’s figure into the other’s. The vendors agree on which of two sections is larger in 60 of 66 pairs, so a single-vendor ranking of sections is usually right in direction; the magnitude of any difference, and any ratio between a section’s figure on one vendor and another section’s on the other, can be off by a factor of five below to nearly nine above. An effect of the size applied papers usually report is small against that. Reporting both vendors does not resolve which is right; it makes the uncertainty visible, and reporting one hides it.</w:t>
+        <w:t xml:space="preserve">The design this bears on is the standard one in applied content work: publish something, read one dashboard, compare it against the rest of the site or against a competitor. Section 5.5 is the finding that bears on it most directly. Across twelve sections of one domain the vendor ratio on estimated visits spans 0.20x to 7.24x (0.20x to 8.89x territory-matched), so no domain-level calibration factor can convert one vendor’s figure into the other’s. The vendors agree on which of two sections is larger in 60 of 66 pairs, so a single-vendor ranking of sections is usually right in direction; the magnitude of any difference, and any ratio between a section’s figure on one vendor and another section’s on the other, can differ by a factor of five below to nearly nine above. An effect of the size applied papers usually report is small against that. Both instruments remain the appropriate tools for ranking sections and for directional comparison; this result concerns the comparability of magnitudes across instruments, not the usefulness of either. Reporting both makes the range of estimates visible; reporting one does not.</w:t>
       </w:r>
     </w:p>
     <w:p>
@@ -8795,7 +8795,7 @@
         <w:pStyle w:val="FirstParagraph"/>
       </w:pPr>
       <w:r>
-        <w:t xml:space="preserve">Two commercial analytics platforms watched the same section from the day it appeared. Over four months they disagreed about its estimated traffic by factors between 7.5 and 27.1, about its ranking keywords by a factor of two, and about its referring domains by a factor of eleven. Read on the same day across twelve sections of the same domain, their ratio on estimated visits ran from one fifth to seven times, with no detectable relationship to how old each section was or to how many keywords each vendor had found. The disagreement is larger than the effects most applied search papers report, the correction factor between the vendors has no fixed sign or size, and it cannot be applied at the domain level; the vendors rank sections alike and size them differently, so a single-vendor study of magnitudes carries an error it cannot bound from its own data.</w:t>
+        <w:t xml:space="preserve">Two commercial analytics platforms watched the same section from the day it appeared. Over four months they disagreed about its estimated traffic by factors between 7.5 and 27.1, about its ranking keywords by a factor of two, and about its referring domains by a factor of eleven. Read on the same day across twelve sections of the same domain, their ratio on estimated visits ran from one fifth to seven times, with no detectable relationship to how old each section was or to how many keywords each vendor had found. The disagreement is larger than the effects most applied search papers report, the correction factor between the vendors has no fixed sign or size, and it cannot be applied at the domain level; the vendors rank sections alike and size them differently, so a single-vendor study of magnitudes carries an estimation range it cannot bound from its own data, while a single-vendor ranking of sections is usually right in direction.</w:t>
       </w:r>
     </w:p>
     <w:p>
@@ -9729,7 +9729,7 @@
         <w:t xml:space="preserve"> </w:t>
       </w:r>
       <w:r>
-        <w:t xml:space="preserve">was withdrawn as an overstatement. Two related-work paragraphs, Table 5’s day-77 column, referring-domain ranges in Table 6 and two Table 1 rows were added; stale cross-references were corrected; and the corrections list in Section 12 was replaced by this appendix. Section 5.6’s bound was restated: a 27.1x disagreement means at least one instrument is off by a factor of at least 5.2, the square root of 27.1; the earlier text gave 13x, which is the absolute bound expressed in units of the smaller reading, not a multiplicative factor. The left-censoring of the age proxy was corrected from three prefixes to one, and the prefixes that cross one under territory matching were corrected. In v4.8 the original title, used through v2.2, was restored, and the abstract, Section 1, lessons 1 and 3 of Section 9.2 and the conclusion were revised to introduce the User First Intelligence framework by name and to state plainly that its scoring function is specified and not evaluated; the abstract is longer as a result. The organization that operates the section is no longer named; the author’s affiliation is given as KL University only.</w:t>
+        <w:t xml:space="preserve">was withdrawn as an overstatement. Two related-work paragraphs, Table 5’s day-77 column, referring-domain ranges in Table 6 and two Table 1 rows were added; stale cross-references were corrected; and the corrections list in Section 12 was replaced by this appendix. Section 5.6’s bound was restated: a 27.1x disagreement means at least one of the two estimates lies a factor of 5.2 or more, the square root of 27.1, from the quantity both estimate; the earlier text gave 13x, which is the absolute bound expressed in units of the smaller reading, not a multiplicative factor. The left-censoring of the age proxy was corrected from three prefixes to one, and the prefixes that cross one under territory matching were corrected. In v4.8 the original title, used through v2.2, was restored, and the abstract, Section 1, lessons 1 and 3 of Section 9.2 and the conclusion were revised to introduce the User First Intelligence framework by name and to state plainly that its scoring function is specified and not evaluated; the abstract is longer as a result. The organization that operates the section is no longer named; the author’s affiliation is given as KL University only.</w:t>
       </w:r>
     </w:p>
     <w:bookmarkEnd w:id="71"/>

</xml_diff>

<commit_message>
v4.8: reposition around the UFI thesis; Figure 1 framework; registered studies
Co-Authored-By: Claude Fable 5.1 <noreply@anthropic.com>
Claude-Session: https://claude.ai/code/session_01NVWVRPSXWbvUmxdzTrqBTy
</commit_message>
<xml_diff>
--- a/paper/User_First_Intelligence_v4.8_2026-10-12.docx
+++ b/paper/User_First_Intelligence_v4.8_2026-10-12.docx
@@ -2,7 +2,7 @@
 <file path=word/document.xml><?xml version="1.0" encoding="utf-8"?>
 <w:document xmlns:w="http://schemas.openxmlformats.org/wordprocessingml/2006/main" xmlns:m="http://schemas.openxmlformats.org/officeDocument/2006/math" xmlns:r="http://schemas.openxmlformats.org/officeDocument/2006/relationships" xmlns:o="urn:schemas-microsoft-com:office:office" xmlns:v="urn:schemas-microsoft-com:vml" xmlns:w10="urn:schemas-microsoft-com:office:word" xmlns:a="http://schemas.openxmlformats.org/drawingml/2006/main" xmlns:pic="http://schemas.openxmlformats.org/drawingml/2006/picture" xmlns:wp="http://schemas.openxmlformats.org/drawingml/2006/wordprocessingDrawing">
   <w:body>
-    <w:bookmarkStart w:id="73" w:name="X2ba48746af24314e6727281a87dbf15f6d65ed2"/>
+    <w:bookmarkStart w:id="76" w:name="X2ba48746af24314e6727281a87dbf15f6d65ed2"/>
     <w:p>
       <w:pPr>
         <w:pStyle w:val="Heading1"/>
@@ -57,7 +57,7 @@
         <w:pStyle w:val="FirstParagraph"/>
       </w:pPr>
       <w:r>
-        <w:t xml:space="preserve">User First Intelligence (UFI) is a framework for finding content gaps from the structure of an industry’s knowledge and the questions its users ask, rather than from keyword search volume. It organizes the industry under an ontology, populates a knowledge graph from several source classes, expresses user needs as executable competency questions, and scores gaps with a Content Gap Score; the specification and an open implementation are released. This paper reports one deployment of a gap of the kind the framework targets, and what happens when two commercial analytics platforms are pointed at the result. Applied search research runs almost entirely on such platforms and treats their outputs as measurements.</w:t>
+        <w:t xml:space="preserve">People say what they want in many places that are not a search box: forum threads, question sites, video comments, reviews, support tickets, social groups. Keyword-volume tools see the fraction of that demand that reaches a search engine in a countable form, and AI answer surfaces now stand between the question and the page. User First Intelligence (UFI) is a framework built on that premise: collect what people ask across platforms, beyond the website; classify it and link it to the entities of an industry organized under an ontology; hold the result in a knowledge graph with its structure, coverage and demand sources kept apart; express user needs as executable competency questions; and score where the organization does not answer, treating the form the answer should take as something to measure rather than assume. The specification and an open implementation reading thirteen demand surfaces are released. This paper reports one deployment of a gap of the kind the framework targets, identified from one of those surfaces, and what two commercial analytics platforms recorded when pointed at the result. The comparison shows that the platforms agree on the direction of a comparison between sections and differ on its magnitude; the demand that never reaches a search box, which the framework’s other surfaces are designed to observe, is outside what either platform reports.</w:t>
       </w:r>
     </w:p>
     <w:p>
@@ -81,11 +81,11 @@
         <w:pStyle w:val="BodyText"/>
       </w:pPr>
       <w:r>
-        <w:t xml:space="preserve">The divergence is the primary result because it does not depend on the author’s judgment: every reading is of a public prefix that any subscriber can re-read. The deployment series is reported as context. At day 37, the last observation before an automated link network arrived, the section held 15,830 ranking positions with nineteen referring domains; by day 77 it appeared in 17,206 stored AI answers with no editorial link, and the pages most cited were the hubs that enumerate codes rather than the pages that answer. Six enabling conditions, the deployment’s cost, and six lessons stated as its failures are given. No causal claim is made.</w:t>
+        <w:t xml:space="preserve">The divergence is the primary result because it does not depend on the author’s judgment: every reading is of a public prefix that any subscriber can re-read. The deployment series is reported as context. At day 37, the last observation before an automated link network arrived, the section held 15,830 ranking positions with nineteen referring domains; by day 77 it appeared in 17,206 stored AI answers with no editorial link, and the pages most cited were the hubs that enumerate codes rather than the pages that answer. Six enabling conditions, the deployment’s cost, and six lessons stated as its failures are given, one of which is that this deployment collected demand from only one of the thirteen surfaces the framework reads, so the framework’s central claim is specified here and registered for test, not demonstrated. No causal claim is made.</w:t>
       </w:r>
     </w:p>
     <w:bookmarkEnd w:id="20"/>
-    <w:bookmarkStart w:id="24" w:name="introduction"/>
+    <w:bookmarkStart w:id="27" w:name="introduction"/>
     <w:p>
       <w:pPr>
         <w:pStyle w:val="Heading2"/>
@@ -99,6 +99,14 @@
         <w:pStyle w:val="FirstParagraph"/>
       </w:pPr>
       <w:r>
+        <w:t xml:space="preserve">A content decision starts with a question someone asked. The place it was asked is increasingly not a search engine: it is a forum thread, a question site, a comment under a video, a product review, a support ticket, a post in a group. Keyword-volume tools observe the part of that demand that reaches a search box in a countable phrasing; Section 6 shows this deployment ranking for question forms, misspellings and non-English phrasings that carry little or no reported volume in those tools, and AI answer surfaces now sit between many questions and any page at all. User First Intelligence is a framework built on that premise: go beyond the website to where the questions are, classify and link them to the entities of an industry held under an ontology, keep the sources that establish structure, coverage and demand in separate roles so that a competitor’s coverage cannot pose as user demand, express user needs as competency questions that a knowledge graph can be asked, and score where the organization fails to answer, with the form of the answer measured rather than assumed (Figure 1). The deployment reported here was built from a gap identified through one of those surfaces, competitor keyword exports, before the framework’s other surfaces were implemented; it is a case of the kind of gap the framework targets, not a run of the framework. It also exposed the measurement problem the rest of this paper is about.</w:t>
+      </w:r>
+    </w:p>
+    <w:p>
+      <w:pPr>
+        <w:pStyle w:val="BodyText"/>
+      </w:pPr>
+      <w:r>
         <w:t xml:space="preserve">Almost every empirical claim in applied search research rests on a commercial analytics platform. Papers report that a technique moved visibility, that a competitor holds a share of some keyword space, that AI answers cite one kind of source more than another. The underlying numbers come from Ahrefs, Semrush, Similarweb or a comparable vendor, and they are reported the way measurements are reported: as quantities, sometimes to five significant figures, usually from one vendor, rarely with any statement of uncertainty.</w:t>
       </w:r>
     </w:p>
@@ -107,10 +115,10 @@
         <w:pStyle w:val="BodyText"/>
       </w:pPr>
       <w:r>
-        <w:t xml:space="preserve">The vendors do not claim otherwise in their documentation, which describes click models over estimated volumes at estimated positions. The practice treats them as counters anyway. This paper puts a number on how far two such estimates of one object can lie apart, so that the practice can state its uncertainty. The question matters for any framework that claims to find content worth building, including the one this paper specifies: User First Intelligence identifies gaps from an industry’s knowledge structure and its users’ questions rather than from keyword volume, and the first thing such a framework needs is an honest measurement of what happens when a gap is filled.</w:t>
-      </w:r>
-    </w:p>
-    <w:bookmarkStart w:id="21" w:name="Xb1af0e1b50aa7e2fd0c239798b9480eadff2d42"/>
+        <w:t xml:space="preserve">The vendors do not claim otherwise in their documentation, which describes click models over estimated volumes at estimated positions. The practice treats them as counters anyway. This paper puts a number on how far two such estimates of one object can lie apart, so that the practice can state its uncertainty. For a framework whose premise is that volume tools see only part of demand, that number is not incidental: it is the size of the gap the framework’s demand layer exists to fill, and it has to be measured before the framework can be evaluated against it.</w:t>
+      </w:r>
+    </w:p>
+    <w:bookmarkStart w:id="24" w:name="Xb1af0e1b50aa7e2fd0c239798b9480eadff2d42"/>
     <w:p>
       <w:pPr>
         <w:pStyle w:val="Heading3"/>
@@ -143,8 +151,63 @@
         <w:t xml:space="preserve">This paper uses one such section: 381 code pages plus hubs under a single prefix on a top-authority domain, published on 26 July 2026 and observed for 77 days, with ranking positions captured daily and the other quantities at seven checkpoints and monthly.</w:t>
       </w:r>
     </w:p>
-    <w:bookmarkEnd w:id="21"/>
-    <w:bookmarkStart w:id="22" w:name="what-this-paper-reports"/>
+    <w:p>
+      <w:pPr>
+        <w:pStyle w:val="CaptionedFigure"/>
+      </w:pPr>
+      <w:r>
+        <w:drawing>
+          <wp:inline>
+            <wp:extent cx="5321300" cy="2921000"/>
+            <wp:effectExtent b="0" l="0" r="0" t="0"/>
+            <wp:docPr descr="Figure 1. The User First Intelligence framework. (a) The thirteen demand surfaces the released implementation reads, grouped by whether they carry a user’s own words or a tool’s reconstruction of demand; the one surface this deployment actually collected is marked. (b) The pipeline from observed questions to content, with the two observation layers this paper reports (dashed) and the component it specifies but does not evaluate (shaded). The deployment in this paper ran the lower layer and one surface of the upper; it did not run the pipeline end to end." title="" id="22" name="Picture"/>
+            <a:graphic>
+              <a:graphicData uri="http://schemas.openxmlformats.org/drawingml/2006/picture">
+                <pic:pic>
+                  <pic:nvPicPr>
+                    <pic:cNvPr descr="fig0_framework.pdf" id="23" name="Picture"/>
+                    <pic:cNvPicPr>
+                      <a:picLocks noChangeArrowheads="1" noChangeAspect="1"/>
+                    </pic:cNvPicPr>
+                  </pic:nvPicPr>
+                  <pic:blipFill>
+                    <a:blip r:embed="rId21"/>
+                    <a:stretch>
+                      <a:fillRect/>
+                    </a:stretch>
+                  </pic:blipFill>
+                  <pic:spPr bwMode="auto">
+                    <a:xfrm>
+                      <a:off x="0" y="0"/>
+                      <a:ext cx="5321300" cy="2921000"/>
+                    </a:xfrm>
+                    <a:prstGeom prst="rect">
+                      <a:avLst/>
+                    </a:prstGeom>
+                    <a:noFill/>
+                    <a:ln w="9525">
+                      <a:noFill/>
+                      <a:headEnd/>
+                      <a:tailEnd/>
+                    </a:ln>
+                  </pic:spPr>
+                </pic:pic>
+              </a:graphicData>
+            </a:graphic>
+          </wp:inline>
+        </w:drawing>
+      </w:r>
+    </w:p>
+    <w:p>
+      <w:pPr>
+        <w:pStyle w:val="ImageCaption"/>
+      </w:pPr>
+      <w:r>
+        <w:t xml:space="preserve">Figure 1. The User First Intelligence framework. (a) The thirteen demand surfaces the released implementation reads, grouped by whether they carry a user’s own words or a tool’s reconstruction of demand; the one surface this deployment actually collected is marked. (b) The pipeline from observed questions to content, with the two observation layers this paper reports (dashed) and the component it specifies but does not evaluate (shaded). The deployment in this paper ran the lower layer and one surface of the upper; it did not run the pipeline end to end.</w:t>
+      </w:r>
+    </w:p>
+    <w:bookmarkEnd w:id="24"/>
+    <w:bookmarkStart w:id="25" w:name="what-this-paper-reports"/>
     <w:p>
       <w:pPr>
         <w:pStyle w:val="Heading3"/>
@@ -166,13 +229,13 @@
           <w:bCs/>
           <w:b/>
         </w:rPr>
-        <w:t xml:space="preserve">A divergence series between two commercial instruments</w:t>
-      </w:r>
-      <w:r>
-        <w:t xml:space="preserve"> </w:t>
-      </w:r>
-      <w:r>
-        <w:t xml:space="preserve">observing one URL prefix from zero, on estimated visits, ranking keywords, referring domains and AI Overview citation. Section 5.1 to 5.4.</w:t>
+        <w:t xml:space="preserve">The User First Intelligence framework</w:t>
+      </w:r>
+      <w:r>
+        <w:t xml:space="preserve"> </w:t>
+      </w:r>
+      <w:r>
+        <w:t xml:space="preserve">(Figure 1): collecting user questions beyond the website across thirteen demand surfaces, classifying and linking them to an industry ontology, holding structure, coverage and demand as separate source roles in a knowledge graph, and scoring unanswered questions with a Content Gap Score and two competency-question metrics (schema pass rate and instance coverage); released as a specification (Appendix B) and an open implementation (Section 12). This deployment collected one of the thirteen surfaces, so the framework’s demand claim is specified and registered for test (Section 11), not demonstrated.</w:t>
       </w:r>
     </w:p>
     <w:p>
@@ -188,10 +251,13 @@
           <w:bCs/>
           <w:b/>
         </w:rPr>
-        <w:t xml:space="preserve">A cross-section of twelve prefixes on one domain, both instruments, one day</w:t>
-      </w:r>
-      <w:r>
-        <w:t xml:space="preserve">, showing that the vendor ratio on estimated visits spans 0.20x to 7.24x within a site (0.20x to 8.89x territory-matched), shows no relationship with section age, and does not follow the keyword-universe ratio, while the vendors agree on the ordering of sections (rank correlation 0.94). Section 5.5. This is the paper’s main empirical result, and it retracts the age hypothesis advanced in version 4.0.</w:t>
+        <w:t xml:space="preserve">A divergence series between two commercial instruments</w:t>
+      </w:r>
+      <w:r>
+        <w:t xml:space="preserve"> </w:t>
+      </w:r>
+      <w:r>
+        <w:t xml:space="preserve">observing one URL prefix from zero, on estimated visits, ranking keywords, referring domains and AI Overview citation. Section 5.1 to 5.4.</w:t>
       </w:r>
     </w:p>
     <w:p>
@@ -207,10 +273,10 @@
           <w:bCs/>
           <w:b/>
         </w:rPr>
-        <w:t xml:space="preserve">A methodological consequence</w:t>
-      </w:r>
-      <w:r>
-        <w:t xml:space="preserve">: no domain-level correction converts one vendor’s estimate into the other’s; the vendors rank sections alike and size them by factors that vary from one fifth to nine times within one site. Section 5.6.</w:t>
+        <w:t xml:space="preserve">A cross-section of twelve prefixes on one domain, both instruments, one day</w:t>
+      </w:r>
+      <w:r>
+        <w:t xml:space="preserve">, showing that the vendor ratio on estimated visits spans 0.20x to 7.24x within a site (0.20x to 8.89x territory-matched), shows no relationship with section age, and does not follow the keyword-universe ratio, while the vendors agree on the ordering of sections (rank correlation 0.94). Section 5.5. This is the paper’s main empirical result, and it retracts the age hypothesis advanced in version 4.0.</w:t>
       </w:r>
     </w:p>
     <w:p>
@@ -226,13 +292,10 @@
           <w:bCs/>
           <w:b/>
         </w:rPr>
-        <w:t xml:space="preserve">A 77-day deployment series</w:t>
-      </w:r>
-      <w:r>
-        <w:t xml:space="preserve"> </w:t>
-      </w:r>
-      <w:r>
-        <w:t xml:space="preserve">on four quantities at a primary checkpoint chosen to precede three identified disturbances, with every definition, denominator, instrument and read date stated. Section 6.</w:t>
+        <w:t xml:space="preserve">A methodological consequence</w:t>
+      </w:r>
+      <w:r>
+        <w:t xml:space="preserve">: no domain-level correction converts one vendor’s estimate into the other’s; the vendors rank sections alike and size them by factors that vary from one fifth to nine times within one site. Section 5.6.</w:t>
       </w:r>
     </w:p>
     <w:p>
@@ -248,10 +311,13 @@
           <w:bCs/>
           <w:b/>
         </w:rPr>
-        <w:t xml:space="preserve">An observation about which pages AI answers cite</w:t>
-      </w:r>
-      <w:r>
-        <w:t xml:space="preserve">: enumerating hub pages outrank per-entity pages as cited sources, by a factor of roughly two. Section 7.</w:t>
+        <w:t xml:space="preserve">A 77-day deployment series</w:t>
+      </w:r>
+      <w:r>
+        <w:t xml:space="preserve"> </w:t>
+      </w:r>
+      <w:r>
+        <w:t xml:space="preserve">on four quantities at a primary checkpoint chosen to precede three identified disturbances, with every definition, denominator, instrument and read date stated. Section 6.</w:t>
       </w:r>
     </w:p>
     <w:p>
@@ -267,13 +333,10 @@
           <w:bCs/>
           <w:b/>
         </w:rPr>
-        <w:t xml:space="preserve">The deployment’s cost, its six enabling conditions, and six lessons stated as the things it got wrong.</w:t>
-      </w:r>
-      <w:r>
-        <w:t xml:space="preserve"> </w:t>
-      </w:r>
-      <w:r>
-        <w:t xml:space="preserve">Sections 3.1 and 9.</w:t>
+        <w:t xml:space="preserve">An observation about which pages AI answers cite</w:t>
+      </w:r>
+      <w:r>
+        <w:t xml:space="preserve">: enumerating hub pages outrank per-entity pages as cited sources, by a factor of roughly two. Section 7.</w:t>
       </w:r>
     </w:p>
     <w:p>
@@ -289,14 +352,17 @@
           <w:bCs/>
           <w:b/>
         </w:rPr>
-        <w:t xml:space="preserve">The User First Intelligence framework</w:t>
-      </w:r>
-      <w:r>
-        <w:t xml:space="preserve">: its specification, including the Content Gap Score and two competency-question metrics (schema pass rate and instance coverage), and an open reference implementation. Appendix B and Section 12. The score’s predictive value is not evaluated here; Section 11 registers the study that would evaluate it.</w:t>
-      </w:r>
-    </w:p>
-    <w:bookmarkEnd w:id="22"/>
-    <w:bookmarkStart w:id="23" w:name="what-this-paper-does-not-report"/>
+        <w:t xml:space="preserve">The deployment’s cost, its six enabling conditions, and six lessons stated as the things it got wrong.</w:t>
+      </w:r>
+      <w:r>
+        <w:t xml:space="preserve"> </w:t>
+      </w:r>
+      <w:r>
+        <w:t xml:space="preserve">Sections 3.1 and 9.</w:t>
+      </w:r>
+    </w:p>
+    <w:bookmarkEnd w:id="25"/>
+    <w:bookmarkStart w:id="26" w:name="what-this-paper-does-not-report"/>
     <w:p>
       <w:pPr>
         <w:pStyle w:val="Heading3"/>
@@ -421,9 +487,9 @@
         <w:t xml:space="preserve">No person other than the author has graded, replicated or audited any part of this work. Section 12 states what has and has not been done about that, and it is the paper’s largest unremedied weakness.</w:t>
       </w:r>
     </w:p>
-    <w:bookmarkEnd w:id="23"/>
-    <w:bookmarkEnd w:id="24"/>
-    <w:bookmarkStart w:id="25" w:name="related-work"/>
+    <w:bookmarkEnd w:id="26"/>
+    <w:bookmarkEnd w:id="27"/>
+    <w:bookmarkStart w:id="28" w:name="related-work"/>
     <w:p>
       <w:pPr>
         <w:pStyle w:val="Heading2"/>
@@ -513,13 +579,13 @@
           <w:bCs/>
           <w:b/>
         </w:rPr>
-        <w:t xml:space="preserve">Information needs and query fragmentation.</w:t>
-      </w:r>
-      <w:r>
-        <w:t xml:space="preserve"> </w:t>
-      </w:r>
-      <w:r>
-        <w:t xml:space="preserve">The gap between the unit a user has in mind and the unit a retrieval system indexes is old ground [Belkin, Oddy &amp; Brooks 1982; Taylor 1968], as is the observation that aggregate demand concentrates differently from individual demand [Goel et al. 2010]. The taxonomy of web search [Broder 2002] distinguishes query intent rather than query granularity. Section 4 describes a deployment in which the operative distinction was granularity: one need expressed as thousands of distinct strings.</w:t>
+        <w:t xml:space="preserve">Personalization and the visibility of demand.</w:t>
+      </w:r>
+      <w:r>
+        <w:t xml:space="preserve"> </w:t>
+      </w:r>
+      <w:r>
+        <w:t xml:space="preserve">The framework’s premise that a search box shows only part of what people ask has one documented component, one observation and one open question. Demand that never reaches a search engine in a countable phrasing is documented by the long-tail literature [Goel et al. 2010]; Section 6 adds the untested observation that the section ranks for question forms, misspellings and non-English phrasings carrying little or no reported volume. Personalization of classic web search has been measured directly: about 11.7% of Google results differed between users in a 2013 audit, with signed-in status and location the drivers and demographic attributes such as gender and age producing no substantial effect [Hannak et al. 2013]. What has not been measured is personalization of AI answer surfaces, where the answer is composed rather than ranked and the user’s stated situation enters the prompt; the behavioral evidence so far concerns clicks, not variation in the answer itself [Chapekis &amp; Lieb 2025]. Whether AI answers vary with the persona of the asker is therefore an open question this paper does not answer and Section 11 registers.</w:t>
       </w:r>
     </w:p>
     <w:p>
@@ -531,44 +597,49 @@
           <w:bCs/>
           <w:b/>
         </w:rPr>
-        <w:t xml:space="preserve">Completeness in knowledge bases.</w:t>
-      </w:r>
-      <w:r>
-        <w:t xml:space="preserve"> </w:t>
-      </w:r>
-      <w:r>
-        <w:t xml:space="preserve">Appendix B’s scoring function draws on the study of completeness in open-world knowledge bases [Razniewski et al. 2016; Galárraga et al. 2017; Balaraman et al. 2018; Luggen et al. 2019; Razniewski et al. 2024], on demand-weighted completeness [Hopkinson et al. 2018], and on gap discovery for encyclopedias [Wulczyn et al. 2016; Piccardi et al. 2018; Redi et al. 2020; Shao et al. 2024], with Ripoll et al. [2025] giving the most recent typology of content gaps for a collaborative knowledge base. Since the function is not evaluated here, that discussion sits with the specification in the appendix.</w:t>
-      </w:r>
-    </w:p>
-    <w:bookmarkEnd w:id="25"/>
-    <w:bookmarkStart w:id="27" w:name="setting"/>
-    <w:p>
-      <w:pPr>
-        <w:pStyle w:val="Heading2"/>
-      </w:pPr>
-      <w:r>
-        <w:t xml:space="preserve">3 Setting</w:t>
-      </w:r>
-    </w:p>
-    <w:p>
-      <w:pPr>
-        <w:pStyle w:val="FirstParagraph"/>
-      </w:pPr>
-      <w:r>
-        <w:t xml:space="preserve">A large US telecommunications provider publishes a reference section covering the North American Numbering Plan.</w:t>
-      </w:r>
-      <w:r>
-        <w:t xml:space="preserve"> </w:t>
-      </w:r>
+        <w:t xml:space="preserve">Information needs and query fragmentation.</w:t>
+      </w:r>
+      <w:r>
+        <w:t xml:space="preserve"> </w:t>
+      </w:r>
+      <w:r>
+        <w:t xml:space="preserve">The gap between the unit a user has in mind and the unit a retrieval system indexes is old ground [Belkin, Oddy &amp; Brooks 1982; Taylor 1968], as is the observation that aggregate demand concentrates differently from individual demand [Goel et al. 2010]. The taxonomy of web search [Broder 2002] distinguishes query intent rather than query granularity. Section 4 describes a deployment in which the operative distinction was granularity: one need expressed as thousands of distinct strings.</w:t>
+      </w:r>
+    </w:p>
+    <w:p>
+      <w:pPr>
+        <w:pStyle w:val="BodyText"/>
+      </w:pPr>
       <w:r>
         <w:rPr>
           <w:bCs/>
           <w:b/>
         </w:rPr>
-        <w:t xml:space="preserve">As verified on 12 October 2026 by fetching every code page linked from the section’s 52 state hubs, the section holds 381 code pages</w:t>
-      </w:r>
-      <w:r>
-        <w:t xml:space="preserve">: 374 for geographic codes assigned to US states and the District of Columbia, and 7 for toll-free codes. All 381 return HTTP 200, are canonical, and are full pages. The only geographic codes in the plan with no page are the six assigned to US territories. The section is therefore complete over the class it set out to cover, and</w:t>
+        <w:t xml:space="preserve">Completeness in knowledge bases.</w:t>
+      </w:r>
+      <w:r>
+        <w:t xml:space="preserve"> </w:t>
+      </w:r>
+      <w:r>
+        <w:t xml:space="preserve">Appendix B’s scoring function draws on the study of completeness in open-world knowledge bases [Razniewski et al. 2016; Galárraga et al. 2017; Balaraman et al. 2018; Luggen et al. 2019; Razniewski et al. 2024], on demand-weighted completeness [Hopkinson et al. 2018], and on gap discovery for encyclopedias [Wulczyn et al. 2016; Piccardi et al. 2018; Redi et al. 2020; Shao et al. 2024], with Ripoll et al. [2025] giving the most recent typology of content gaps for a collaborative knowledge base. Since the function is not evaluated here, that discussion sits with the specification in the appendix.</w:t>
+      </w:r>
+    </w:p>
+    <w:bookmarkEnd w:id="28"/>
+    <w:bookmarkStart w:id="30" w:name="setting"/>
+    <w:p>
+      <w:pPr>
+        <w:pStyle w:val="Heading2"/>
+      </w:pPr>
+      <w:r>
+        <w:t xml:space="preserve">3 Setting</w:t>
+      </w:r>
+    </w:p>
+    <w:p>
+      <w:pPr>
+        <w:pStyle w:val="FirstParagraph"/>
+      </w:pPr>
+      <w:r>
+        <w:t xml:space="preserve">A large US telecommunications provider publishes a reference section covering the North American Numbering Plan.</w:t>
       </w:r>
       <w:r>
         <w:t xml:space="preserve"> </w:t>
@@ -578,18 +649,10 @@
           <w:bCs/>
           <w:b/>
         </w:rPr>
-        <w:t xml:space="preserve">there is no set of uncovered codes within the class to serve as a control</w:t>
-      </w:r>
-      <w:r>
-        <w:t xml:space="preserve">.</w:t>
-      </w:r>
-    </w:p>
-    <w:p>
-      <w:pPr>
-        <w:pStyle w:val="BodyText"/>
-      </w:pPr>
-      <w:r>
-        <w:t xml:space="preserve">Earlier versions of this paper, up to and including version 4.1, stated that 290 code pages had been published and that 88 geographic codes had none, and they registered those 88 as a within-class control arm.</w:t>
+        <w:t xml:space="preserve">As verified on 12 October 2026 by fetching every code page linked from the section’s 52 state hubs, the section holds 381 code pages</w:t>
+      </w:r>
+      <w:r>
+        <w:t xml:space="preserve">: 374 for geographic codes assigned to US states and the District of Columbia, and 7 for toll-free codes. All 381 return HTTP 200, are canonical, and are full pages. The only geographic codes in the plan with no page are the six assigned to US territories. The section is therefore complete over the class it set out to cover, and</w:t>
       </w:r>
       <w:r>
         <w:t xml:space="preserve"> </w:t>
@@ -599,29 +662,18 @@
           <w:bCs/>
           <w:b/>
         </w:rPr>
-        <w:t xml:space="preserve">Both figures were wrong.</w:t>
-      </w:r>
-      <w:r>
-        <w:t xml:space="preserve"> </w:t>
-      </w:r>
-      <w:r>
-        <w:t xml:space="preserve">The 290 was carried from an early draft and never re-counted, and the control it implied was never checked against the pages; fetching every page corrected both figures.</w:t>
-      </w:r>
-    </w:p>
-    <w:p>
-      <w:pPr>
-        <w:pStyle w:val="BodyText"/>
-      </w:pPr>
-      <w:r>
-        <w:t xml:space="preserve">All code pages, the state hubs and the national hub were published together at launch; no pages were added to the section during the observation window. This is the author’s statement of the deployment’s publishing history. Table 5’s series of pages holding a position (210, 365, 391, 414, 440) is therefore the indexing of a fixed set of 434 URLs by one instrument, and not growth in the section itself.</w:t>
-      </w:r>
-    </w:p>
-    <w:p>
-      <w:pPr>
-        <w:pStyle w:val="BodyText"/>
-      </w:pPr>
-      <w:r>
-        <w:t xml:space="preserve">Two page counts remain and are easy to conflate.</w:t>
+        <w:t xml:space="preserve">there is no set of uncovered codes within the class to serve as a control</w:t>
+      </w:r>
+      <w:r>
+        <w:t xml:space="preserve">.</w:t>
+      </w:r>
+    </w:p>
+    <w:p>
+      <w:pPr>
+        <w:pStyle w:val="BodyText"/>
+      </w:pPr>
+      <w:r>
+        <w:t xml:space="preserve">Earlier versions of this paper, up to and including version 4.1, stated that 290 code pages had been published and that 88 geographic codes had none, and they registered those 88 as a within-class control arm.</w:t>
       </w:r>
       <w:r>
         <w:t xml:space="preserve"> </w:t>
@@ -631,13 +683,29 @@
           <w:bCs/>
           <w:b/>
         </w:rPr>
-        <w:t xml:space="preserve">381</w:t>
-      </w:r>
-      <w:r>
-        <w:t xml:space="preserve"> </w:t>
-      </w:r>
-      <w:r>
-        <w:t xml:space="preserve">is the number of code pages the section holds.</w:t>
+        <w:t xml:space="preserve">Both figures were wrong.</w:t>
+      </w:r>
+      <w:r>
+        <w:t xml:space="preserve"> </w:t>
+      </w:r>
+      <w:r>
+        <w:t xml:space="preserve">The 290 was carried from an early draft and never re-counted, and the control it implied was never checked against the pages; fetching every page corrected both figures.</w:t>
+      </w:r>
+    </w:p>
+    <w:p>
+      <w:pPr>
+        <w:pStyle w:val="BodyText"/>
+      </w:pPr>
+      <w:r>
+        <w:t xml:space="preserve">All code pages, the state hubs and the national hub were published together at launch; no pages were added to the section during the observation window. This is the author’s statement of the deployment’s publishing history. Table 5’s series of pages holding a position (210, 365, 391, 414, 440) is therefore the indexing of a fixed set of 434 URLs by one instrument, and not growth in the section itself.</w:t>
+      </w:r>
+    </w:p>
+    <w:p>
+      <w:pPr>
+        <w:pStyle w:val="BodyText"/>
+      </w:pPr>
+      <w:r>
+        <w:t xml:space="preserve">Two page counts remain and are easy to conflate.</w:t>
       </w:r>
       <w:r>
         <w:t xml:space="preserve"> </w:t>
@@ -647,6 +715,22 @@
           <w:bCs/>
           <w:b/>
         </w:rPr>
+        <w:t xml:space="preserve">381</w:t>
+      </w:r>
+      <w:r>
+        <w:t xml:space="preserve"> </w:t>
+      </w:r>
+      <w:r>
+        <w:t xml:space="preserve">is the number of code pages the section holds.</w:t>
+      </w:r>
+      <w:r>
+        <w:t xml:space="preserve"> </w:t>
+      </w:r>
+      <w:r>
+        <w:rPr>
+          <w:bCs/>
+          <w:b/>
+        </w:rPr>
         <w:t xml:space="preserve">441</w:t>
       </w:r>
       <w:r>
@@ -656,7 +740,7 @@
         <w:t xml:space="preserve">is the number of URLs under the prefix holding at least one ranking position on 11 October, which is selected on the outcome; it exceeds 381 plus the 53 hub pages by seven, which is within what the instrument attributes to a prefix beyond its canonical pages. Brand Radar’s count of 455 distinct cited pages (Section 5.3) exceeds 434 by 21; that instrument does not document how it normalizes URL variants, and the difference is reported rather than reconciled. Every fact on the pages is templated from two public-domain US government sources, the numbering plan administrator’s registry and census data. The section went live on 26 July 2026, which is day 0 throughout this paper, dated from the first third-party detection of the pages.</w:t>
       </w:r>
     </w:p>
-    <w:bookmarkStart w:id="26" w:name="X2d058e9f8ac4d8e33a31210c9c079ac97f573dc"/>
+    <w:bookmarkStart w:id="29" w:name="X2d058e9f8ac4d8e33a31210c9c079ac97f573dc"/>
     <w:p>
       <w:pPr>
         <w:pStyle w:val="Heading3"/>
@@ -813,9 +897,9 @@
         <w:t xml:space="preserve">Conditions 1 to 3 make production nearly free. Conditions 4 to 6 describe an undefended position. A reader considering transfer should check all six, and should note that condition 6 in particular reads as a criterion for selecting undefended targets. That is the shape of a data void, a query space with thin or absent authoritative content that whoever arrives first fills [Golebiewski &amp; boyd 2018], and Section 12 treats it as an ethics question rather than a tactic.</w:t>
       </w:r>
     </w:p>
-    <w:bookmarkEnd w:id="26"/>
-    <w:bookmarkEnd w:id="27"/>
-    <w:bookmarkStart w:id="31" w:name="measurement-design"/>
+    <w:bookmarkEnd w:id="29"/>
+    <w:bookmarkEnd w:id="30"/>
+    <w:bookmarkStart w:id="34" w:name="measurement-design"/>
     <w:p>
       <w:pPr>
         <w:pStyle w:val="Heading2"/>
@@ -832,7 +916,7 @@
         <w:t xml:space="preserve">Everything in Sections 5 to 7 is an observation. The language is chosen to keep that visible.</w:t>
       </w:r>
     </w:p>
-    <w:bookmarkStart w:id="28" w:name="instruments-definitions-and-denominators"/>
+    <w:bookmarkStart w:id="31" w:name="instruments-definitions-and-denominators"/>
     <w:p>
       <w:pPr>
         <w:pStyle w:val="Heading3"/>
@@ -1564,8 +1648,8 @@
         <w:t xml:space="preserve">Ahrefs’ is worldwide; Semrush’s is the US database. The section ranks in 105 countries with 18.5% of Ahrefs’ estimated visits from outside the US, so the Semrush figure covers a strict subset of the Ahrefs figure’s territory and is nonetheless between 7.5 and 27.1 times larger. Section 5.1 reports both the US-only and worldwide Semrush figures so the comparison does not rest on the territory difference.</w:t>
       </w:r>
     </w:p>
-    <w:bookmarkEnd w:id="28"/>
-    <w:bookmarkStart w:id="29" w:name="Xb882e69843fec69be4f24fb95b5efe3d632b9cd"/>
+    <w:bookmarkEnd w:id="31"/>
+    <w:bookmarkStart w:id="32" w:name="Xb882e69843fec69be4f24fb95b5efe3d632b9cd"/>
     <w:p>
       <w:pPr>
         <w:pStyle w:val="Heading3"/>
@@ -1603,8 +1687,8 @@
         <w:t xml:space="preserve">, because the denominator was selected on the outcome. Every share in this paper is one of the following, and is labeled at the point of use: a share whose denominator is outcome-selected, flagged as such and drawing no comparative conclusion; or a ratio between two instruments on the same object, which is this paper’s primary result and is not affected, because both denominators are the same prefix.</w:t>
       </w:r>
     </w:p>
-    <w:bookmarkEnd w:id="29"/>
-    <w:bookmarkStart w:id="30" w:name="the-primary-checkpoint"/>
+    <w:bookmarkEnd w:id="32"/>
+    <w:bookmarkStart w:id="33" w:name="the-primary-checkpoint"/>
     <w:p>
       <w:pPr>
         <w:pStyle w:val="Heading3"/>
@@ -1636,9 +1720,9 @@
         <w:t xml:space="preserve">: the last observation preceding all three. Day 37 carries a cost that is stated rather than worked around: it was not one of the fifteen-day checkpoints at which the full quantity set was captured, so it is reported on four quantities and not nine. The claims this paper makes at day 37 concern ranking positions, top-three positions, estimated visits and the link profile, and nothing else.</w:t>
       </w:r>
     </w:p>
-    <w:bookmarkEnd w:id="30"/>
-    <w:bookmarkEnd w:id="31"/>
-    <w:bookmarkStart w:id="50" w:name="two-instruments-on-one-prefix"/>
+    <w:bookmarkEnd w:id="33"/>
+    <w:bookmarkEnd w:id="34"/>
+    <w:bookmarkStart w:id="53" w:name="two-instruments-on-one-prefix"/>
     <w:p>
       <w:pPr>
         <w:pStyle w:val="Heading2"/>
@@ -1655,7 +1739,7 @@
         <w:t xml:space="preserve">This is the paper’s primary result. It is reported first because it is the finding that does not rest on the author’s judgment: every figure below is one of two vendors’ readings of a public URL prefix, and a reader holding both subscriptions can re-read them.</w:t>
       </w:r>
     </w:p>
-    <w:bookmarkStart w:id="35" w:name="X4eb472eabef33d61abed4ad0d14fd39d3a0d0b5"/>
+    <w:bookmarkStart w:id="38" w:name="X4eb472eabef33d61abed4ad0d14fd39d3a0d0b5"/>
     <w:p>
       <w:pPr>
         <w:pStyle w:val="Heading3"/>
@@ -2098,18 +2182,18 @@
           <wp:inline>
             <wp:extent cx="2933700" cy="2095500"/>
             <wp:effectExtent b="0" l="0" r="0" t="0"/>
-            <wp:docPr descr="Figure 1. Estimated monthly visits for the area-code prefix from two instruments, on a logarithmic axis so that the vertical gap is the ratio. Ahrefs Site Explorer (prefix mode, all locations) and Semrush Domain Overview (subfolder mode, US database and worldwide), read 10 and 11 October 2026. June to September are completed-month totals; October is each instrument’s current monthly run-rate. The ratio labels are Semrush US over Ahrefs, as in Table 2." title="" id="33" name="Picture"/>
+            <wp:docPr descr="Figure 2. Estimated monthly visits for the area-code prefix from two instruments, on a logarithmic axis so that the vertical gap is the ratio. Ahrefs Site Explorer (prefix mode, all locations) and Semrush Domain Overview (subfolder mode, US database and worldwide), read 10 and 11 October 2026. June to September are completed-month totals; October is each instrument’s current monthly run-rate. The ratio labels are Semrush US over Ahrefs, as in Table 2." title="" id="36" name="Picture"/>
             <a:graphic>
               <a:graphicData uri="http://schemas.openxmlformats.org/drawingml/2006/picture">
                 <pic:pic>
                   <pic:nvPicPr>
-                    <pic:cNvPr descr="fig1_divergence.pdf" id="34" name="Picture"/>
+                    <pic:cNvPr descr="fig1_divergence.pdf" id="37" name="Picture"/>
                     <pic:cNvPicPr>
                       <a:picLocks noChangeArrowheads="1" noChangeAspect="1"/>
                     </pic:cNvPicPr>
                   </pic:nvPicPr>
                   <pic:blipFill>
-                    <a:blip r:embed="rId32"/>
+                    <a:blip r:embed="rId35"/>
                     <a:stretch>
                       <a:fillRect/>
                     </a:stretch>
@@ -2141,15 +2225,15 @@
         <w:pStyle w:val="ImageCaption"/>
       </w:pPr>
       <w:r>
-        <w:t xml:space="preserve">Figure 1. Estimated monthly visits for the area-code prefix from two instruments, on a logarithmic axis so that the vertical gap is the ratio. Ahrefs Site Explorer (prefix mode, all locations) and Semrush Domain Overview (subfolder mode, US database and worldwide), read 10 and 11 October 2026. June to September are completed-month totals; October is each instrument’s current monthly run-rate. The ratio labels are Semrush US over Ahrefs, as in Table 2.</w:t>
-      </w:r>
-    </w:p>
-    <w:p>
-      <w:pPr>
-        <w:pStyle w:val="BodyText"/>
-      </w:pPr>
-      <w:r>
-        <w:t xml:space="preserve">Three things about this table and Figure 1.</w:t>
+        <w:t xml:space="preserve">Figure 2. Estimated monthly visits for the area-code prefix from two instruments, on a logarithmic axis so that the vertical gap is the ratio. Ahrefs Site Explorer (prefix mode, all locations) and Semrush Domain Overview (subfolder mode, US database and worldwide), read 10 and 11 October 2026. June to September are completed-month totals; October is each instrument’s current monthly run-rate. The ratio labels are Semrush US over Ahrefs, as in Table 2.</w:t>
+      </w:r>
+    </w:p>
+    <w:p>
+      <w:pPr>
+        <w:pStyle w:val="BodyText"/>
+      </w:pPr>
+      <w:r>
+        <w:t xml:space="preserve">Three things about this table and Figure 2.</w:t>
       </w:r>
     </w:p>
     <w:p>
@@ -2203,8 +2287,8 @@
         <w:t xml:space="preserve">, from 27.1x to 10.2x to 7.5x. Section 5.5 tests whether that narrowing is a property of section age across twelve prefixes and finds that it is not; Section 5.6 takes up what the narrowing can and cannot be attributed to.</w:t>
       </w:r>
     </w:p>
-    <w:bookmarkEnd w:id="35"/>
-    <w:bookmarkStart w:id="36" w:name="ranking-keywords-a-factor-of-two-stable"/>
+    <w:bookmarkEnd w:id="38"/>
+    <w:bookmarkStart w:id="39" w:name="ranking-keywords-a-factor-of-two-stable"/>
     <w:p>
       <w:pPr>
         <w:pStyle w:val="Heading3"/>
@@ -2221,8 +2305,8 @@
         <w:t xml:space="preserve">On the count of distinct keywords for which any URL under the prefix ranks in positions 1–100, Ahrefs reports 29,000 for all locations and Semrush 58,586 for the US database, read a day apart: a factor of 2.0, again with the larger figure from the smaller territory. Pages holding at least one position are 441 in Ahrefs. The two instruments agree on rank ordering of pages by traffic and disagree on every level.</w:t>
       </w:r>
     </w:p>
-    <w:bookmarkEnd w:id="36"/>
-    <w:bookmarkStart w:id="40" w:name="X3ec6c0063f72ae6644355b85d35ebdb0db18d16"/>
+    <w:bookmarkEnd w:id="39"/>
+    <w:bookmarkStart w:id="43" w:name="X3ec6c0063f72ae6644355b85d35ebdb0db18d16"/>
     <w:p>
       <w:pPr>
         <w:pStyle w:val="Heading3"/>
@@ -2632,18 +2716,18 @@
           <wp:inline>
             <wp:extent cx="5334000" cy="2136013"/>
             <wp:effectExtent b="0" l="0" r="0" t="0"/>
-            <wp:docPr descr="Figure 2. AI Overview citation under two vendor definitions, same prefix, same months. (a) Ahrefs definition (a) as a share of all AI Overview keywords the prefix ranks on, with 95% Wilson intervals; the denominators grow from 284 to 37,238. (b) The two vendor counts, Semrush keywords with an AI Overview position against the Ahrefs numerator, on a logarithmic axis, with their ratio labeled. Sources as in Table 3." title="" id="38" name="Picture"/>
+            <wp:docPr descr="Figure 3. AI Overview citation under two vendor definitions, same prefix, same months. (a) Ahrefs definition (a) as a share of all AI Overview keywords the prefix ranks on, with 95% Wilson intervals; the denominators grow from 284 to 37,238. (b) The two vendor counts, Semrush keywords with an AI Overview position against the Ahrefs numerator, on a logarithmic axis, with their ratio labeled. Sources as in Table 3." title="" id="41" name="Picture"/>
             <a:graphic>
               <a:graphicData uri="http://schemas.openxmlformats.org/drawingml/2006/picture">
                 <pic:pic>
                   <pic:nvPicPr>
-                    <pic:cNvPr descr="fig2_aio.pdf" id="39" name="Picture"/>
+                    <pic:cNvPr descr="fig2_aio.pdf" id="42" name="Picture"/>
                     <pic:cNvPicPr>
                       <a:picLocks noChangeArrowheads="1" noChangeAspect="1"/>
                     </pic:cNvPicPr>
                   </pic:nvPicPr>
                   <pic:blipFill>
-                    <a:blip r:embed="rId37"/>
+                    <a:blip r:embed="rId40"/>
                     <a:stretch>
                       <a:fillRect/>
                     </a:stretch>
@@ -2675,15 +2759,15 @@
         <w:pStyle w:val="ImageCaption"/>
       </w:pPr>
       <w:r>
-        <w:t xml:space="preserve">Figure 2. AI Overview citation under two vendor definitions, same prefix, same months. (a) Ahrefs definition (a) as a share of all AI Overview keywords the prefix ranks on, with 95% Wilson intervals; the denominators grow from 284 to 37,238. (b) The two vendor counts, Semrush keywords with an AI Overview position against the Ahrefs numerator, on a logarithmic axis, with their ratio labeled. Sources as in Table 3.</w:t>
-      </w:r>
-    </w:p>
-    <w:p>
-      <w:pPr>
-        <w:pStyle w:val="BodyText"/>
-      </w:pPr>
-      <w:r>
-        <w:t xml:space="preserve">The ratio between the two counts falls from 2.94 to 1.34 over four months (Figure 2b). Two cautions on reading it. The comparison is between a count (b) and the numerator of a ratio (a), and the two vendors’ territories differ, so what the column measures is partly a territory difference and not purely a definitional one. And the series has three intervals, so</w:t>
+        <w:t xml:space="preserve">Figure 3. AI Overview citation under two vendor definitions, same prefix, same months. (a) Ahrefs definition (a) as a share of all AI Overview keywords the prefix ranks on, with 95% Wilson intervals; the denominators grow from 284 to 37,238. (b) The two vendor counts, Semrush keywords with an AI Overview position against the Ahrefs numerator, on a logarithmic axis, with their ratio labeled. Sources as in Table 3.</w:t>
+      </w:r>
+    </w:p>
+    <w:p>
+      <w:pPr>
+        <w:pStyle w:val="BodyText"/>
+      </w:pPr>
+      <w:r>
+        <w:t xml:space="preserve">The ratio between the two counts falls from 2.94 to 1.34 over four months (Figure 3b). Two cautions on reading it. The comparison is between a count (b) and the numerator of a ratio (a), and the two vendors’ territories differ, so what the column measures is partly a territory difference and not purely a definitional one. And the series has three intervals, so</w:t>
       </w:r>
       <w:r>
         <w:t xml:space="preserve"> </w:t>
@@ -2712,8 +2796,8 @@
         <w:t xml:space="preserve">The (a) column’s percentage is the one proportion in this paper whose denominator grows by two orders of magnitude across the series, from 284 to 37,238, and it is not monotone. Its denominator is outcome-selected: it counts only AI Overviews on keywords the prefix already ranks on. It is reported because numerator and denominator come from one instrument on one date, and no trend is drawn from it.</w:t>
       </w:r>
     </w:p>
-    <w:bookmarkEnd w:id="40"/>
-    <w:bookmarkStart w:id="44" w:name="Xe56aa1fc4e981fc3ea7d162b313219de9f5f470"/>
+    <w:bookmarkEnd w:id="43"/>
+    <w:bookmarkStart w:id="47" w:name="Xe56aa1fc4e981fc3ea7d162b313219de9f5f470"/>
     <w:p>
       <w:pPr>
         <w:pStyle w:val="Heading3"/>
@@ -2747,18 +2831,18 @@
           <wp:inline>
             <wp:extent cx="3340100" cy="1790700"/>
             <wp:effectExtent b="0" l="0" r="0" t="0"/>
-            <wp:docPr descr="Figure 3. Composition of live referring domains to the prefix by top-level domain, as reported by each instrument on 11 October 2026. Ahrefs: 913 domains; Semrush Backlink Analytics: 80 domains, of which the instrument reports 75% on .xyz and does not break down the remainder." title="" id="42" name="Picture"/>
+            <wp:docPr descr="Figure 4. Composition of live referring domains to the prefix by top-level domain, as reported by each instrument on 11 October 2026. Ahrefs: 913 domains; Semrush Backlink Analytics: 80 domains, of which the instrument reports 75% on .xyz and does not break down the remainder." title="" id="45" name="Picture"/>
             <a:graphic>
               <a:graphicData uri="http://schemas.openxmlformats.org/drawingml/2006/picture">
                 <pic:pic>
                   <pic:nvPicPr>
-                    <pic:cNvPr descr="fig3_refdomains.pdf" id="43" name="Picture"/>
+                    <pic:cNvPr descr="fig3_refdomains.pdf" id="46" name="Picture"/>
                     <pic:cNvPicPr>
                       <a:picLocks noChangeArrowheads="1" noChangeAspect="1"/>
                     </pic:cNvPicPr>
                   </pic:nvPicPr>
                   <pic:blipFill>
-                    <a:blip r:embed="rId41"/>
+                    <a:blip r:embed="rId44"/>
                     <a:stretch>
                       <a:fillRect/>
                     </a:stretch>
@@ -2790,19 +2874,19 @@
         <w:pStyle w:val="ImageCaption"/>
       </w:pPr>
       <w:r>
-        <w:t xml:space="preserve">Figure 3. Composition of live referring domains to the prefix by top-level domain, as reported by each instrument on 11 October 2026. Ahrefs: 913 domains; Semrush Backlink Analytics: 80 domains, of which the instrument reports 75% on .xyz and does not break down the remainder.</w:t>
-      </w:r>
-    </w:p>
-    <w:p>
-      <w:pPr>
-        <w:pStyle w:val="BodyText"/>
-      </w:pPr>
-      <w:r>
-        <w:t xml:space="preserve">Figure 3 shows the two compositions side by side. A third figure from the first instrument complicates even its own count: its daily series gives 909 at day 75 against 913 on 11 October, and its new-and-lost report for September gives 917 new against 95 lost, which with nineteen at day 37 implies 841. Section 8 sets out why no claim here turns on the exact count.</w:t>
-      </w:r>
-    </w:p>
-    <w:bookmarkEnd w:id="44"/>
-    <w:bookmarkStart w:id="48" w:name="Xd9b58a84cd0241a28c2550a62e74a9c530544ea"/>
+        <w:t xml:space="preserve">Figure 4. Composition of live referring domains to the prefix by top-level domain, as reported by each instrument on 11 October 2026. Ahrefs: 913 domains; Semrush Backlink Analytics: 80 domains, of which the instrument reports 75% on .xyz and does not break down the remainder.</w:t>
+      </w:r>
+    </w:p>
+    <w:p>
+      <w:pPr>
+        <w:pStyle w:val="BodyText"/>
+      </w:pPr>
+      <w:r>
+        <w:t xml:space="preserve">Figure 4 shows the two compositions side by side. A third figure from the first instrument complicates even its own count: its daily series gives 909 at day 75 against 913 on 11 October, and its new-and-lost report for September gives 917 new against 95 lost, which with nineteen at day 37 implies 841. Section 8 sets out why no claim here turns on the exact count.</w:t>
+      </w:r>
+    </w:p>
+    <w:bookmarkEnd w:id="47"/>
+    <w:bookmarkStart w:id="51" w:name="Xd9b58a84cd0241a28c2550a62e74a9c530544ea"/>
     <w:p>
       <w:pPr>
         <w:pStyle w:val="Heading3"/>
@@ -5016,18 +5100,18 @@
           <wp:inline>
             <wp:extent cx="5334000" cy="2334409"/>
             <wp:effectExtent b="0" l="0" r="0" t="0"/>
-            <wp:docPr descr="Figure 4. Twelve URL prefixes on one domain, both instruments, 12 October 2026. Each marker is one prefix; the filled marker is the area-code section. (a) The Semrush over Ahrefs ratio on estimated visits, unmatched for territory, against section age in months since the first month with organic traffic in the Ahrefs all-time series, both axes logarithmic; the horizontal line is a ratio of one. (b) The same ratio against the Semrush over Ahrefs ratio on ranking keywords. Data in Table 4 and in the released file." title="" id="46" name="Picture"/>
+            <wp:docPr descr="Figure 5. Twelve URL prefixes on one domain, both instruments, 12 October 2026. Each marker is one prefix; the filled marker is the area-code section. (a) The Semrush over Ahrefs ratio on estimated visits, unmatched for territory, against section age in months since the first month with organic traffic in the Ahrefs all-time series, both axes logarithmic; the horizontal line is a ratio of one. (b) The same ratio against the Semrush over Ahrefs ratio on ranking keywords. Data in Table 4 and in the released file." title="" id="49" name="Picture"/>
             <a:graphic>
               <a:graphicData uri="http://schemas.openxmlformats.org/drawingml/2006/picture">
                 <pic:pic>
                   <pic:nvPicPr>
-                    <pic:cNvPr descr="fig4_prefixes.pdf" id="47" name="Picture"/>
+                    <pic:cNvPr descr="fig4_prefixes.pdf" id="50" name="Picture"/>
                     <pic:cNvPicPr>
                       <a:picLocks noChangeArrowheads="1" noChangeAspect="1"/>
                     </pic:cNvPicPr>
                   </pic:nvPicPr>
                   <pic:blipFill>
-                    <a:blip r:embed="rId45"/>
+                    <a:blip r:embed="rId48"/>
                     <a:stretch>
                       <a:fillRect/>
                     </a:stretch>
@@ -5059,15 +5143,15 @@
         <w:pStyle w:val="ImageCaption"/>
       </w:pPr>
       <w:r>
-        <w:t xml:space="preserve">Figure 4. Twelve URL prefixes on one domain, both instruments, 12 October 2026. Each marker is one prefix; the filled marker is the area-code section. (a) The Semrush over Ahrefs ratio on estimated visits, unmatched for territory, against section age in months since the first month with organic traffic in the Ahrefs all-time series, both axes logarithmic; the horizontal line is a ratio of one. (b) The same ratio against the Semrush over Ahrefs ratio on ranking keywords. Data in Table 4 and in the released file.</w:t>
-      </w:r>
-    </w:p>
-    <w:p>
-      <w:pPr>
-        <w:pStyle w:val="BodyText"/>
-      </w:pPr>
-      <w:r>
-        <w:t xml:space="preserve">Six things follow (Figure 4), and the first retracts a claim this paper made in version 4.0.</w:t>
+        <w:t xml:space="preserve">Figure 5. Twelve URL prefixes on one domain, both instruments, 12 October 2026. Each marker is one prefix; the filled marker is the area-code section. (a) The Semrush over Ahrefs ratio on estimated visits, unmatched for territory, against section age in months since the first month with organic traffic in the Ahrefs all-time series, both axes logarithmic; the horizontal line is a ratio of one. (b) The same ratio against the Semrush over Ahrefs ratio on ranking keywords. Data in Table 4 and in the released file.</w:t>
+      </w:r>
+    </w:p>
+    <w:p>
+      <w:pPr>
+        <w:pStyle w:val="BodyText"/>
+      </w:pPr>
+      <w:r>
+        <w:t xml:space="preserve">Six things follow (Figure 5), and the first retracts a claim this paper made in version 4.0.</w:t>
       </w:r>
     </w:p>
     <w:p>
@@ -5212,8 +5296,8 @@
         <w:t xml:space="preserve">Twelve prefixes, one domain, one read date; the age proxy is a chart read, left-censored at September 2015 for one prefix and close to that horizon for two more; one prefix under twenty-one months; the territory match uses each prefix’s US share as the instrument reports it. A second domain and a second read date are the next step, and neither needs this provider.</w:t>
       </w:r>
     </w:p>
-    <w:bookmarkEnd w:id="48"/>
-    <w:bookmarkStart w:id="49" w:name="what-follows-for-applied-search-research"/>
+    <w:bookmarkEnd w:id="51"/>
+    <w:bookmarkStart w:id="52" w:name="what-follows-for-applied-search-research"/>
     <w:p>
       <w:pPr>
         <w:pStyle w:val="Heading3"/>
@@ -5347,7 +5431,7 @@
         <w:t xml:space="preserve"> </w:t>
       </w:r>
       <w:r>
-        <w:t xml:space="preserve">The design this bears on is the standard one in applied content work: publish something, read one dashboard, compare it against the rest of the site or against a competitor. Section 5.5 is the finding that bears on it most directly. Across twelve sections of one domain the vendor ratio on estimated visits spans 0.20x to 7.24x (0.20x to 8.89x territory-matched), so no domain-level calibration factor can convert one vendor’s figure into the other’s. The vendors agree on which of two sections is larger in 60 of 66 pairs, so a single-vendor ranking of sections is usually right in direction; the magnitude of any difference, and any ratio between a section’s figure on one vendor and another section’s on the other, can differ by a factor of five below to nearly nine above. An effect of the size applied papers usually report is small against that. Both instruments remain the appropriate tools for ranking sections and for directional comparison; this result concerns the comparability of magnitudes across instruments, not the usefulness of either. Reporting both makes the range of estimates visible; reporting one does not.</w:t>
+        <w:t xml:space="preserve">The design this bears on is the standard one in applied content work: publish something, read one dashboard, compare it against the rest of the site or against a competitor. Section 5.5 is the finding that bears on it most directly. Across twelve sections of one domain the vendor ratio on estimated visits spans 0.20x to 7.24x (0.20x to 8.89x territory-matched), so no domain-level calibration factor can convert one vendor’s figure into the other’s. The vendors agree on which of two sections is larger in 60 of 66 pairs, so a single-vendor ranking of sections is usually right in direction; the magnitude of any difference, and any ratio between a section’s figure on one vendor and another section’s on the other, can differ by a factor of five below to nearly nine above. An effect of the size applied papers usually report is small against that. Both instruments remain the appropriate tools for ranking sections and for directional comparison; this result concerns the comparability of magnitudes across instruments, not the usefulness of either. It is also the measurement that motivates the framework in Figure 1: a content program that needs the magnitude of demand for a topic cannot read it from one volume tool alone. That the demand which never reaches a search box differs in which topics it names and in what form it takes is the framework’s hypothesis, not a consequence of this measurement, and Section 11 registers its test. Reporting both makes the range of estimates visible; reporting one does not.</w:t>
       </w:r>
     </w:p>
     <w:p>
@@ -5368,9 +5452,9 @@
         <w:t xml:space="preserve">One domain, one vendor pair, no ground truth; the longitudinal series is one prefix over 77 days and the cross-section is twelve prefixes on one date. What is established is that disagreements of up to an order of magnitude occur in both directions between sections of one site, from a factor of five below to nearly nine above, that no relationship with section age is detectable across twelve sections, only one of them under twenty-one months old, and that keyword-universe size does not predict them. What is not established is which instrument is closer to the truth for any section, or what determines the ratio. Section 11 sets out the next step: a second domain and a second read date.</w:t>
       </w:r>
     </w:p>
-    <w:bookmarkEnd w:id="49"/>
-    <w:bookmarkEnd w:id="50"/>
-    <w:bookmarkStart w:id="51" w:name="the-deployment-series"/>
+    <w:bookmarkEnd w:id="52"/>
+    <w:bookmarkEnd w:id="53"/>
+    <w:bookmarkStart w:id="54" w:name="the-deployment-series"/>
     <w:p>
       <w:pPr>
         <w:pStyle w:val="Heading2"/>
@@ -6670,8 +6754,8 @@
         <w:t xml:space="preserve">Among the 58,586 US keywords, the lowest-traffic rows are misspellings, non-English forms, numeric fragments and question forms with 40 to 170 reported searches a month or none at all. The section ranks in 105 countries, with 18.5% of Ahrefs-estimated visits from outside the US. This is stated as a distributional observation and not as a test; the per-page threshold test that would make it one requires the full per-page keyword export matched to pre-launch reported volume, which has not been run.</w:t>
       </w:r>
     </w:p>
-    <w:bookmarkEnd w:id="51"/>
-    <w:bookmarkStart w:id="57" w:name="X18d2d2e3075991b6ea11800201c55cd659d5f2a"/>
+    <w:bookmarkEnd w:id="54"/>
+    <w:bookmarkStart w:id="60" w:name="X18d2d2e3075991b6ea11800201c55cd659d5f2a"/>
     <w:p>
       <w:pPr>
         <w:pStyle w:val="Heading2"/>
@@ -6680,7 +6764,7 @@
         <w:t xml:space="preserve">7 What the answers cite, and what they do not</w:t>
       </w:r>
     </w:p>
-    <w:bookmarkStart w:id="55" w:name="X3f8ecac39565194d957ca3ed2247cd0fa13e5b7"/>
+    <w:bookmarkStart w:id="58" w:name="X3f8ecac39565194d957ca3ed2247cd0fa13e5b7"/>
     <w:p>
       <w:pPr>
         <w:pStyle w:val="Heading3"/>
@@ -6694,7 +6778,7 @@
         <w:pStyle w:val="FirstParagraph"/>
       </w:pPr>
       <w:r>
-        <w:t xml:space="preserve">The pages most cited in AI answers are state hubs that enumerate codes, cities and maps: New York 474 answers, California 337, Texas 322, Florida 304, and the national hub 294. Each exceeds any individual code page: 214 Dallas 238, 786 Miami 228, 404 Atlanta 218 (Figure 5).</w:t>
+        <w:t xml:space="preserve">The pages most cited in AI answers are state hubs that enumerate codes, cities and maps: New York 474 answers, California 337, Texas 322, Florida 304, and the national hub 294. Each exceeds any individual code page: 214 Dallas 238, 786 Miami 228, 404 Atlanta 218 (Figure 6).</w:t>
       </w:r>
     </w:p>
     <w:p>
@@ -6706,18 +6790,18 @@
           <wp:inline>
             <wp:extent cx="3594100" cy="2057400"/>
             <wp:effectExtent b="0" l="0" r="0" t="0"/>
-            <wp:docPr descr="Figure 5. The eight pages under the prefix most often cited in stored AI answers, Ahrefs Brand Radar, 11 October 2026. Enumerating pages (state hubs and the national hub) are solid; per-entity code pages are hatched." title="" id="53" name="Picture"/>
+            <wp:docPr descr="Figure 6. The eight pages under the prefix most often cited in stored AI answers, Ahrefs Brand Radar, 11 October 2026. Enumerating pages (state hubs and the national hub) are solid; per-entity code pages are hatched." title="" id="56" name="Picture"/>
             <a:graphic>
               <a:graphicData uri="http://schemas.openxmlformats.org/drawingml/2006/picture">
                 <pic:pic>
                   <pic:nvPicPr>
-                    <pic:cNvPr descr="fig5_cited.pdf" id="54" name="Picture"/>
+                    <pic:cNvPr descr="fig5_cited.pdf" id="57" name="Picture"/>
                     <pic:cNvPicPr>
                       <a:picLocks noChangeArrowheads="1" noChangeAspect="1"/>
                     </pic:cNvPicPr>
                   </pic:nvPicPr>
                   <pic:blipFill>
-                    <a:blip r:embed="rId52"/>
+                    <a:blip r:embed="rId55"/>
                     <a:stretch>
                       <a:fillRect/>
                     </a:stretch>
@@ -6749,7 +6833,7 @@
         <w:pStyle w:val="ImageCaption"/>
       </w:pPr>
       <w:r>
-        <w:t xml:space="preserve">Figure 5. The eight pages under the prefix most often cited in stored AI answers, Ahrefs Brand Radar, 11 October 2026. Enumerating pages (state hubs and the national hub) are solid; per-entity code pages are hatched.</w:t>
+        <w:t xml:space="preserve">Figure 6. The eight pages under the prefix most often cited in stored AI answers, Ahrefs Brand Radar, 11 October 2026. Enumerating pages (state hubs and the national hub) are solid; per-entity code pages are hatched.</w:t>
       </w:r>
     </w:p>
     <w:p>
@@ -6775,7 +6859,7 @@
         <w:t xml:space="preserve"> </w:t>
       </w:r>
       <w:r>
-        <w:t xml:space="preserve">is answered most directly by the 214 page, and that page is cited less than the page listing every Texas code. If this generalizes, enumerating pages are more citable than per-entity pages for this class of question, and the unit a content program should publish is not the unit the question names.</w:t>
+        <w:t xml:space="preserve">is answered most directly by the 214 page, and that page is cited less than the page listing every Texas code. If this generalizes, enumerating pages are more citable than per-entity pages for this class of question, and the unit a content program should publish is not the unit the question names. This is the framework’s form question in miniature: the form in which a question is best answered is an empirical property to be measured, which is why the framework scores unanswered questions and leaves form to be tested, and why the Content Gap Score carries no form term (Appendix B).</w:t>
       </w:r>
     </w:p>
     <w:p>
@@ -6786,8 +6870,8 @@
         <w:t xml:space="preserve">It is an observation on one section. It is the finding in this paper most worth testing elsewhere, and testing it needs no access to this deployment: any site with both hub and per-entity pages on an enumerable class can check it.</w:t>
       </w:r>
     </w:p>
-    <w:bookmarkEnd w:id="55"/>
-    <w:bookmarkStart w:id="56" w:name="X939a8b296bc61e739d55b8a3e4a04501b76ffb7"/>
+    <w:bookmarkEnd w:id="58"/>
+    <w:bookmarkStart w:id="59" w:name="X939a8b296bc61e739d55b8a3e4a04501b76ffb7"/>
     <w:p>
       <w:pPr>
         <w:pStyle w:val="Heading3"/>
@@ -6840,9 +6924,9 @@
         <w:t xml:space="preserve">The comparison that would establish it is outcome-independent and has not been run: the registry’s codes crossed with a fixed set of verbalizations, queried without reference to who is cited, so that each domain’s presence is measured on a denominator none of them selected. Section 11 registers it.</w:t>
       </w:r>
     </w:p>
-    <w:bookmarkEnd w:id="56"/>
-    <w:bookmarkEnd w:id="57"/>
-    <w:bookmarkStart w:id="62" w:name="the-link-profile"/>
+    <w:bookmarkEnd w:id="59"/>
+    <w:bookmarkEnd w:id="60"/>
+    <w:bookmarkStart w:id="65" w:name="the-link-profile"/>
     <w:p>
       <w:pPr>
         <w:pStyle w:val="Heading2"/>
@@ -6875,7 +6959,7 @@
         <w:t xml:space="preserve">The character of the arrivals is not in doubt. They are automated networks: 61.9% .info, 26.4% .asia, 10.2% .xyz, every linking page at URL Rating below 10, top anchors advertising link sellers. The second instrument indexes 80 referring domains for the subfolder, 88% from domains at Authority Score 0–10 and 75% on .xyz.</w:t>
       </w:r>
     </w:p>
-    <w:bookmarkStart w:id="61" w:name="X9e2ab2ed4f0b64dbadd0f7abfea6ed8f39566ac"/>
+    <w:bookmarkStart w:id="64" w:name="X9e2ab2ed4f0b64dbadd0f7abfea6ed8f39566ac"/>
     <w:p>
       <w:pPr>
         <w:pStyle w:val="Heading3"/>
@@ -7442,18 +7526,18 @@
           <wp:inline>
             <wp:extent cx="5334000" cy="3515313"/>
             <wp:effectExtent b="0" l="0" r="0" t="0"/>
-            <wp:docPr descr="Figure 6. Ranking positions and the link profile over 77 days. Upper panel: ranking positions in positions 1 to 100 and in positions 1 to 3, Ahrefs daily series for the prefix, all locations, read 11 October 2026; the hatched band is the interval in which the automated link network arrived; the vertical rules mark the primary checkpoint (day 37), the September 2026 spam update (day 60) and the vendor data-reliability notice (day 65); live referring domains at each checkpoint are printed along the top. Lower panel: positions gained per day in each interval of Table 6, shaded by link status. The upper panel also plots two reads from the same daily series that are not checkpoints in Table 5: day 6 (984 positions, 186 in 1–3) and day 67 (38,801 and 6,942)." title="" id="59" name="Picture"/>
+            <wp:docPr descr="Figure 7. Ranking positions and the link profile over 77 days. Upper panel: ranking positions in positions 1 to 100 and in positions 1 to 3, Ahrefs daily series for the prefix, all locations, read 11 October 2026; the hatched band is the interval in which the automated link network arrived; the vertical rules mark the primary checkpoint (day 37), the September 2026 spam update (day 60) and the vendor data-reliability notice (day 65); live referring domains at each checkpoint are printed along the top. Lower panel: positions gained per day in each interval of Table 6, shaded by link status. The upper panel also plots two reads from the same daily series that are not checkpoints in Table 5: day 6 (984 positions, 186 in 1–3) and day 67 (38,801 and 6,942)." title="" id="62" name="Picture"/>
             <a:graphic>
               <a:graphicData uri="http://schemas.openxmlformats.org/drawingml/2006/picture">
                 <pic:pic>
                   <pic:nvPicPr>
-                    <pic:cNvPr descr="fig6_positions.pdf" id="60" name="Picture"/>
+                    <pic:cNvPr descr="fig6_positions.pdf" id="63" name="Picture"/>
                     <pic:cNvPicPr>
                       <a:picLocks noChangeArrowheads="1" noChangeAspect="1"/>
                     </pic:cNvPicPr>
                   </pic:nvPicPr>
                   <pic:blipFill>
-                    <a:blip r:embed="rId58"/>
+                    <a:blip r:embed="rId61"/>
                     <a:stretch>
                       <a:fillRect/>
                     </a:stretch>
@@ -7485,15 +7569,15 @@
         <w:pStyle w:val="ImageCaption"/>
       </w:pPr>
       <w:r>
-        <w:t xml:space="preserve">Figure 6. Ranking positions and the link profile over 77 days. Upper panel: ranking positions in positions 1 to 100 and in positions 1 to 3, Ahrefs daily series for the prefix, all locations, read 11 October 2026; the hatched band is the interval in which the automated link network arrived; the vertical rules mark the primary checkpoint (day 37), the September 2026 spam update (day 60) and the vendor data-reliability notice (day 65); live referring domains at each checkpoint are printed along the top. Lower panel: positions gained per day in each interval of Table 6, shaded by link status. The upper panel also plots two reads from the same daily series that are not checkpoints in Table 5: day 6 (984 positions, 186 in 1–3) and day 67 (38,801 and 6,942).</w:t>
-      </w:r>
-    </w:p>
-    <w:p>
-      <w:pPr>
-        <w:pStyle w:val="BodyText"/>
-      </w:pPr>
-      <w:r>
-        <w:t xml:space="preserve">Of the 43,302 positions held at day 75, 15,830 (36.6%) were held at day 37 and 27,472 (63.4%) were acquired after the network began arriving (Figure 6). Because the arrival is dated only to an eight-day interval, that share is itself bounded rather than exact: 53.1% to 63.4%. For AI answers, day 37 is not recorded, so the corresponding share is bounded 56.9% to 74.9%.</w:t>
+        <w:t xml:space="preserve">Figure 7. Ranking positions and the link profile over 77 days. Upper panel: ranking positions in positions 1 to 100 and in positions 1 to 3, Ahrefs daily series for the prefix, all locations, read 11 October 2026; the hatched band is the interval in which the automated link network arrived; the vertical rules mark the primary checkpoint (day 37), the September 2026 spam update (day 60) and the vendor data-reliability notice (day 65); live referring domains at each checkpoint are printed along the top. Lower panel: positions gained per day in each interval of Table 6, shaded by link status. The upper panel also plots two reads from the same daily series that are not checkpoints in Table 5: day 6 (984 positions, 186 in 1–3) and day 67 (38,801 and 6,942).</w:t>
+      </w:r>
+    </w:p>
+    <w:p>
+      <w:pPr>
+        <w:pStyle w:val="BodyText"/>
+      </w:pPr>
+      <w:r>
+        <w:t xml:space="preserve">Of the 43,302 positions held at day 75, 15,830 (36.6%) were held at day 37 and 27,472 (63.4%) were acquired after the network began arriving (Figure 7). Because the arrival is dated only to an eight-day interval, that share is itself bounded rather than exact: 53.1% to 63.4%. For AI answers, day 37 is not recorded, so the corresponding share is bounded 56.9% to 74.9%.</w:t>
       </w:r>
     </w:p>
     <w:p>
@@ -7581,9 +7665,9 @@
         <w:t xml:space="preserve">The provider has an exposure this paper discloses rather than analyzes: a spam link profile pointed at a live section, which the provider has been asked to review. A manual action before a later checkpoint would confound any continuation of this series. The author did not commission, purchase or solicit any link to the section.</w:t>
       </w:r>
     </w:p>
-    <w:bookmarkEnd w:id="61"/>
-    <w:bookmarkEnd w:id="62"/>
-    <w:bookmarkStart w:id="65" w:name="X65c2b72456955cd8a1ed6d4492e2b2bf5d03463"/>
+    <w:bookmarkEnd w:id="64"/>
+    <w:bookmarkEnd w:id="65"/>
+    <w:bookmarkStart w:id="68" w:name="X65c2b72456955cd8a1ed6d4492e2b2bf5d03463"/>
     <w:p>
       <w:pPr>
         <w:pStyle w:val="Heading2"/>
@@ -7592,7 +7676,7 @@
         <w:t xml:space="preserve">9 What the deployment cost, and what it got wrong</w:t>
       </w:r>
     </w:p>
-    <w:bookmarkStart w:id="63" w:name="cost"/>
+    <w:bookmarkStart w:id="66" w:name="cost"/>
     <w:p>
       <w:pPr>
         <w:pStyle w:val="Heading3"/>
@@ -7927,8 +8011,8 @@
         <w:t xml:space="preserve">conditions 1 to 3 of Section 3.1 held, and they do not hold for most classes. And the dominant cost was analysis rather than production, which inverts the usual content-program cost structure and is the part a reader should expect to pay.</w:t>
       </w:r>
     </w:p>
-    <w:bookmarkEnd w:id="63"/>
-    <w:bookmarkStart w:id="64" w:name="X1c99813f0140bd8b67a7ffcabf25a3c1af3da08"/>
+    <w:bookmarkEnd w:id="66"/>
+    <w:bookmarkStart w:id="67" w:name="X1c99813f0140bd8b67a7ffcabf25a3c1af3da08"/>
     <w:p>
       <w:pPr>
         <w:pStyle w:val="Heading3"/>
@@ -8008,7 +8092,7 @@
         <w:t xml:space="preserve"> </w:t>
       </w:r>
       <w:r>
-        <w:t xml:space="preserve">This deployment collected none: no forum, Q&amp;A, video, social or review data was linked to any entity. Cost: the deployment cannot show that the framework’s user-question layer did any work; that layer is specified in Appendix B and is untested here.</w:t>
+        <w:t xml:space="preserve">This deployment collected no first-party surface: of the thirteen demand surfaces the released implementation reads (Figure 1a), only competitor keyword exports, a tool-derived surface, were linked to any entity; no forum, Q&amp;A, video, social, review or support data was. Cost: the deployment cannot show that the framework’s user-question layer did any work; that layer is specified in Appendix B, exercised in the released example on synthetic records flagged as synthetic, and untested here on observed data.</w:t>
       </w:r>
     </w:p>
     <w:p>
@@ -8077,9 +8161,9 @@
         <w:t xml:space="preserve">Area codes are a reference topic on a commercial domain. The score has no feasibility term and someone must decide how business relevance enters.</w:t>
       </w:r>
     </w:p>
-    <w:bookmarkEnd w:id="64"/>
-    <w:bookmarkEnd w:id="65"/>
-    <w:bookmarkStart w:id="66" w:name="threats-to-validity"/>
+    <w:bookmarkEnd w:id="67"/>
+    <w:bookmarkEnd w:id="68"/>
+    <w:bookmarkStart w:id="69" w:name="threats-to-validity"/>
     <w:p>
       <w:pPr>
         <w:pStyle w:val="Heading2"/>
@@ -8254,8 +8338,8 @@
         <w:t xml:space="preserve">The author designed the approach, deployed it as an employee of the organization studied, performed every measurement, wrote this paper, holds a commercial interest in tools built on the approach, and is the author of a forthcoming book that uses its name. No part of the evaluation has been performed by anyone else. A reader should treat every judgment here as made by an interested party, and should weight Section 5’s instrument readings, which are independently reproducible from two commercial subscriptions, far above anything else in the paper. Section 5 is the primary result partly for that reason.</w:t>
       </w:r>
     </w:p>
-    <w:bookmarkEnd w:id="66"/>
-    <w:bookmarkStart w:id="67" w:name="X4aa75f2b733f30d823a695c178671fd7d4eba0a"/>
+    <w:bookmarkEnd w:id="69"/>
+    <w:bookmarkStart w:id="70" w:name="X4aa75f2b733f30d823a695c178671fd7d4eba0a"/>
     <w:p>
       <w:pPr>
         <w:pStyle w:val="Heading2"/>
@@ -8422,97 +8506,77 @@
           <w:bCs/>
           <w:b/>
         </w:rPr>
-        <w:t xml:space="preserve">A second domain for Section 5.5.</w:t>
-      </w:r>
-      <w:r>
-        <w:t xml:space="preserve"> </w:t>
-      </w:r>
-      <w:r>
-        <w:t xml:space="preserve">The cross-section was run on one domain. The result that the vendor ratio is prefix-specific, with no detectable relationship to age, needs a second site and a second read date before it is more than an observation about one domain. Anyone with both subscriptions and any multi-section site can do it in a day; the data file released with this paper gives the read method.</w:t>
-      </w:r>
-    </w:p>
-    <w:bookmarkEnd w:id="67"/>
-    <w:bookmarkStart w:id="68" w:name="Xa2745dfa65086de5e8d3cc3900cac8a84758056"/>
-    <w:p>
-      <w:pPr>
-        <w:pStyle w:val="Heading2"/>
-      </w:pPr>
-      <w:r>
-        <w:t xml:space="preserve">12 Reproducibility, ethics and conflicts of interest</w:t>
-      </w:r>
-    </w:p>
-    <w:p>
-      <w:pPr>
-        <w:pStyle w:val="FirstParagraph"/>
+        <w:t xml:space="preserve">The multi-platform demand study, which is the framework’s own test.</w:t>
+      </w:r>
+      <w:r>
+        <w:t xml:space="preserve"> </w:t>
+      </w:r>
+      <w:r>
+        <w:t xml:space="preserve">For one enumerable class, collect user questions from the first-party surfaces in Figure 1a (forum, question site, video comments and transcripts, reviews, social groups, support tickets), link them to entities with the released linker, and compare the resulting demand distribution with the keyword-volume distribution for the same entities. The registered prediction is that the two distributions differ in both which entities carry demand and in what form the demand takes (question, comparison, how-to, video), and that the difference is largest where reported volume is smallest. The released implementation reads every surface and prints which returned rows, so a run that collected nothing cannot be reported as one that did.</w:t>
+      </w:r>
+    </w:p>
+    <w:p>
+      <w:pPr>
+        <w:pStyle w:val="BodyText"/>
       </w:pPr>
       <w:r>
         <w:rPr>
           <w:bCs/>
           <w:b/>
         </w:rPr>
-        <w:t xml:space="preserve">What is released.</w:t>
-      </w:r>
-      <w:r>
-        <w:t xml:space="preserve"> </w:t>
-      </w:r>
-      <w:r>
-        <w:t xml:space="preserve">The</w:t>
-      </w:r>
-      <w:r>
-        <w:t xml:space="preserve"> </w:t>
-      </w:r>
-      <w:r>
-        <w:rPr>
-          <w:rStyle w:val="VerbatimChar"/>
-        </w:rPr>
-        <w:t xml:space="preserve">ufi</w:t>
-      </w:r>
-      <w:r>
-        <w:t xml:space="preserve"> </w:t>
-      </w:r>
-      <w:r>
-        <w:t xml:space="preserve">reference implementation at</w:t>
-      </w:r>
-      <w:r>
-        <w:t xml:space="preserve"> </w:t>
-      </w:r>
+        <w:t xml:space="preserve">A persona study on AI answer surfaces.</w:t>
+      </w:r>
+      <w:r>
+        <w:t xml:space="preserve"> </w:t>
+      </w:r>
+      <w:r>
+        <w:t xml:space="preserve">The same frozen query set issued to AI answer surfaces under a small set of stated personas (for example parent, business owner, traveller), with the cited sources and the answer text compared across personas. The question is whether the answer and its citations vary with who is asking, which classic web search audits found only weakly for demographic attributes [Hannak et al. 2013] and which no audit has measured for composed answers.</w:t>
+      </w:r>
+    </w:p>
+    <w:p>
+      <w:pPr>
+        <w:pStyle w:val="BodyText"/>
+      </w:pPr>
       <w:r>
         <w:rPr>
           <w:bCs/>
           <w:b/>
         </w:rPr>
-        <w:t xml:space="preserve">https://github.com/VenkataPagadalaGIT/ufi</w:t>
-      </w:r>
-      <w:r>
-        <w:t xml:space="preserve"> </w:t>
-      </w:r>
-      <w:r>
-        <w:t xml:space="preserve">under Apache 2.0, version 0.2.0: test suite, command line interface, and a worked example that runs offline on public data. The corrected numbering-plan ontology in YAML with OWL and SHACL export, and the area-code dataset the example uses. The frozen 924-query set, the parameter lock and the run manifest are committed in the repository at</w:t>
-      </w:r>
-      <w:r>
-        <w:t xml:space="preserve"> </w:t>
-      </w:r>
-      <w:r>
-        <w:rPr>
-          <w:rStyle w:val="VerbatimChar"/>
-        </w:rPr>
-        <w:t xml:space="preserve">examples/nanp/out/</w:t>
-      </w:r>
-      <w:r>
-        <w:t xml:space="preserve">, so the digests quoted in Sections 11 and Appendix B resolve to released files. It has</w:t>
-      </w:r>
-      <w:r>
-        <w:t xml:space="preserve"> </w:t>
-      </w:r>
+        <w:t xml:space="preserve">A second domain for Section 5.5.</w:t>
+      </w:r>
+      <w:r>
+        <w:t xml:space="preserve"> </w:t>
+      </w:r>
+      <w:r>
+        <w:t xml:space="preserve">The cross-section was run on one domain. The result that the vendor ratio is prefix-specific, with no detectable relationship to age, needs a second site and a second read date before it is more than an observation about one domain. Anyone with both subscriptions and any multi-section site can do it in a day; the data file released with this paper gives the read method.</w:t>
+      </w:r>
+    </w:p>
+    <w:bookmarkEnd w:id="70"/>
+    <w:bookmarkStart w:id="71" w:name="Xa2745dfa65086de5e8d3cc3900cac8a84758056"/>
+    <w:p>
+      <w:pPr>
+        <w:pStyle w:val="Heading2"/>
+      </w:pPr>
+      <w:r>
+        <w:t xml:space="preserve">12 Reproducibility, ethics and conflicts of interest</w:t>
+      </w:r>
+    </w:p>
+    <w:p>
+      <w:pPr>
+        <w:pStyle w:val="FirstParagraph"/>
+      </w:pPr>
       <w:r>
         <w:rPr>
           <w:bCs/>
           <w:b/>
         </w:rPr>
-        <w:t xml:space="preserve">no DOI</w:t>
-      </w:r>
-      <w:r>
-        <w:t xml:space="preserve">; a Zenodo deposit is outstanding. The exported OWL and SHACL mint terms under</w:t>
+        <w:t xml:space="preserve">What is released.</w:t>
+      </w:r>
+      <w:r>
+        <w:t xml:space="preserve"> </w:t>
+      </w:r>
+      <w:r>
+        <w:t xml:space="preserve">The</w:t>
       </w:r>
       <w:r>
         <w:t xml:space="preserve"> </w:t>
@@ -8521,31 +8585,29 @@
         <w:rPr>
           <w:rStyle w:val="VerbatimChar"/>
         </w:rPr>
-        <w:t xml:space="preserve">urn:ufi:&lt;name&gt;</w:t>
-      </w:r>
-      <w:r>
-        <w:t xml:space="preserve"> </w:t>
-      </w:r>
-      <w:r>
-        <w:t xml:space="preserve">by default, which makes no resolution claim; no persistent namespace has been registered.</w:t>
-      </w:r>
-    </w:p>
-    <w:p>
-      <w:pPr>
-        <w:pStyle w:val="BodyText"/>
-      </w:pPr>
+        <w:t xml:space="preserve">ufi</w:t>
+      </w:r>
+      <w:r>
+        <w:t xml:space="preserve"> </w:t>
+      </w:r>
+      <w:r>
+        <w:t xml:space="preserve">reference implementation at</w:t>
+      </w:r>
+      <w:r>
+        <w:t xml:space="preserve"> </w:t>
+      </w:r>
       <w:r>
         <w:rPr>
           <w:bCs/>
           <w:b/>
         </w:rPr>
-        <w:t xml:space="preserve">Data released with this version.</w:t>
-      </w:r>
-      <w:r>
-        <w:t xml:space="preserve"> </w:t>
-      </w:r>
-      <w:r>
-        <w:t xml:space="preserve">The twelve-prefix cross-section (Table 4) is released as two CSV files, one per instrument, each row carrying the prefix, the figures read, the read date and the read method, at</w:t>
+        <w:t xml:space="preserve">https://github.com/VenkataPagadalaGIT/ufi</w:t>
+      </w:r>
+      <w:r>
+        <w:t xml:space="preserve"> </w:t>
+      </w:r>
+      <w:r>
+        <w:t xml:space="preserve">under Apache 2.0, version 0.2.0: test suite, command line interface, and a worked example that runs offline on public data. The corrected numbering-plan ontology in YAML with OWL and SHACL export, and the area-code dataset the example uses. The demand layer ships adapters for thirteen surfaces and a coverage report that prints which surfaces returned rows. The frozen 924-query set, the parameter lock and the run manifest are committed in the repository at</w:t>
       </w:r>
       <w:r>
         <w:t xml:space="preserve"> </w:t>
@@ -8554,31 +8616,38 @@
         <w:rPr>
           <w:rStyle w:val="VerbatimChar"/>
         </w:rPr>
-        <w:t xml:space="preserve">data/instrument_divergence/</w:t>
-      </w:r>
-      <w:r>
-        <w:t xml:space="preserve"> </w:t>
-      </w:r>
-      <w:r>
-        <w:t xml:space="preserve">in the repository named above.</w:t>
-      </w:r>
-    </w:p>
-    <w:p>
-      <w:pPr>
-        <w:pStyle w:val="BodyText"/>
-      </w:pPr>
+        <w:t xml:space="preserve">examples/nanp/out/</w:t>
+      </w:r>
+      <w:r>
+        <w:t xml:space="preserve">, so the digests quoted in Section 11 and Appendix B resolve to released files. It has</w:t>
+      </w:r>
+      <w:r>
+        <w:t xml:space="preserve"> </w:t>
+      </w:r>
       <w:r>
         <w:rPr>
           <w:bCs/>
           <w:b/>
         </w:rPr>
-        <w:t xml:space="preserve">What a reader can verify independently.</w:t>
-      </w:r>
-      <w:r>
-        <w:t xml:space="preserve"> </w:t>
-      </w:r>
-      <w:r>
-        <w:t xml:space="preserve">Every figure in Sections 5 and 6 can be re-read from the same two dashboards for the same prefix, subject to index drift. The exception is the Brand Radar answer count, which moved from 14,823 (9 October) to 17,206 (11 October) and 17,400 (12 October) as stored answers were refreshed; it is reported with its read date and is not claimed to be re-readable. The Ahrefs daily series reproduces the checkpoint rows until it ages out of the six-month window.</w:t>
+        <w:t xml:space="preserve">no DOI</w:t>
+      </w:r>
+      <w:r>
+        <w:t xml:space="preserve">; a Zenodo deposit is outstanding. The exported OWL and SHACL mint terms under</w:t>
+      </w:r>
+      <w:r>
+        <w:t xml:space="preserve"> </w:t>
+      </w:r>
+      <w:r>
+        <w:rPr>
+          <w:rStyle w:val="VerbatimChar"/>
+        </w:rPr>
+        <w:t xml:space="preserve">urn:ufi:&lt;name&gt;</w:t>
+      </w:r>
+      <w:r>
+        <w:t xml:space="preserve"> </w:t>
+      </w:r>
+      <w:r>
+        <w:t xml:space="preserve">by default, which makes no resolution claim; no persistent namespace has been registered.</w:t>
       </w:r>
     </w:p>
     <w:p>
@@ -8590,13 +8659,28 @@
           <w:bCs/>
           <w:b/>
         </w:rPr>
-        <w:t xml:space="preserve">What is not released.</w:t>
-      </w:r>
-      <w:r>
-        <w:t xml:space="preserve"> </w:t>
-      </w:r>
-      <w:r>
-        <w:t xml:space="preserve">The provider’s internal graph database, the crawl of its site, and its analytics. No figure in this paper is drawn from them; the cost figures in Section 9.1 are the author’s reconstruction from project records.</w:t>
+        <w:t xml:space="preserve">Data released with this version.</w:t>
+      </w:r>
+      <w:r>
+        <w:t xml:space="preserve"> </w:t>
+      </w:r>
+      <w:r>
+        <w:t xml:space="preserve">The twelve-prefix cross-section (Table 4) is released as two CSV files, one per instrument, each row carrying the prefix, the figures read, the read date and the read method, at</w:t>
+      </w:r>
+      <w:r>
+        <w:t xml:space="preserve"> </w:t>
+      </w:r>
+      <w:r>
+        <w:rPr>
+          <w:rStyle w:val="VerbatimChar"/>
+        </w:rPr>
+        <w:t xml:space="preserve">data/instrument_divergence/</w:t>
+      </w:r>
+      <w:r>
+        <w:t xml:space="preserve"> </w:t>
+      </w:r>
+      <w:r>
+        <w:t xml:space="preserve">in the repository named above.</w:t>
       </w:r>
     </w:p>
     <w:p>
@@ -8608,6 +8692,42 @@
           <w:bCs/>
           <w:b/>
         </w:rPr>
+        <w:t xml:space="preserve">What a reader can verify independently.</w:t>
+      </w:r>
+      <w:r>
+        <w:t xml:space="preserve"> </w:t>
+      </w:r>
+      <w:r>
+        <w:t xml:space="preserve">Every figure in Sections 5 and 6 can be re-read from the same two dashboards for the same prefix, subject to index drift. The exception is the Brand Radar answer count, which moved from 14,823 (9 October) to 17,206 (11 October) and 17,400 (12 October) as stored answers were refreshed; it is reported with its read date and is not claimed to be re-readable. The Ahrefs daily series reproduces the checkpoint rows until it ages out of the six-month window.</w:t>
+      </w:r>
+    </w:p>
+    <w:p>
+      <w:pPr>
+        <w:pStyle w:val="BodyText"/>
+      </w:pPr>
+      <w:r>
+        <w:rPr>
+          <w:bCs/>
+          <w:b/>
+        </w:rPr>
+        <w:t xml:space="preserve">What is not released.</w:t>
+      </w:r>
+      <w:r>
+        <w:t xml:space="preserve"> </w:t>
+      </w:r>
+      <w:r>
+        <w:t xml:space="preserve">The provider’s internal graph database, the crawl of its site, and its analytics. No figure in this paper is drawn from them; the cost figures in Section 9.1 are the author’s reconstruction from project records.</w:t>
+      </w:r>
+    </w:p>
+    <w:p>
+      <w:pPr>
+        <w:pStyle w:val="BodyText"/>
+      </w:pPr>
+      <w:r>
+        <w:rPr>
+          <w:bCs/>
+          <w:b/>
+        </w:rPr>
         <w:t xml:space="preserve">Ethics, data collection and site terms.</w:t>
       </w:r>
       <w:r>
@@ -8780,8 +8900,8 @@
         <w:t xml:space="preserve">No independent party has checked any number in this paper. The one check that would change that requires nobody’s permission, budget or cooperation: a third-party re-read of the day-37 row of Table 5 and of Table 4 from the same dashboards. It has not been performed. The cross-prefix replication registered in version 4.0 was performed on 12 October 2026 (Section 5.5); the within-class control registered with it was found not to exist (Section 3). A reader is entitled to weigh that the remaining undone check is the only one requiring another person’s name.</w:t>
       </w:r>
     </w:p>
-    <w:bookmarkEnd w:id="68"/>
-    <w:bookmarkStart w:id="69" w:name="conclusion"/>
+    <w:bookmarkEnd w:id="71"/>
+    <w:bookmarkStart w:id="72" w:name="conclusion"/>
     <w:p>
       <w:pPr>
         <w:pStyle w:val="Heading2"/>
@@ -8795,7 +8915,15 @@
         <w:pStyle w:val="FirstParagraph"/>
       </w:pPr>
       <w:r>
-        <w:t xml:space="preserve">Two commercial analytics platforms watched the same section from the day it appeared. Over four months they disagreed about its estimated traffic by factors between 7.5 and 27.1, about its ranking keywords by a factor of two, and about its referring domains by a factor of eleven. Read on the same day across twelve sections of the same domain, their ratio on estimated visits ran from one fifth to seven times, with no detectable relationship to how old each section was or to how many keywords each vendor had found. The disagreement is larger than the effects most applied search papers report, the correction factor between the vendors has no fixed sign or size, and it cannot be applied at the domain level; the vendors rank sections alike and size them differently, so a single-vendor study of magnitudes carries an estimation range it cannot bound from its own data, while a single-vendor ranking of sections is usually right in direction.</w:t>
+        <w:t xml:space="preserve">User First Intelligence starts from the observation that people ask most of what they want to know somewhere other than a search box, and that the tools which count search demand see only the countable part. The framework goes beyond the website to where the questions are, classifies and links them to an industry held under an ontology, keeps structure, coverage and demand in separate roles in a knowledge graph, asks that graph competency questions, and scores where the organization fails to answer, with the form of the answer treated as a property to measure rather than assume, as Section 7.1 shows in miniature. It is specified in Appendix B and released as an open implementation reading thirteen demand surfaces, with executable competency questions whose schema pass rate and instance coverage are reported separately. Its scoring function is not evaluated here, and this deployment collected demand from one surface of the thirteen; Section 11 registers the multi-platform demand study and the persona study on AI answers that would test the framework’s two central claims, with parameters locked before any data exist.</w:t>
+      </w:r>
+    </w:p>
+    <w:p>
+      <w:pPr>
+        <w:pStyle w:val="BodyText"/>
+      </w:pPr>
+      <w:r>
+        <w:t xml:space="preserve">What the deployment measured is the reason the framework’s demand layer exists. Two commercial analytics platforms watched the same section from the day it appeared. Over four months they disagreed about its estimated traffic by factors between 7.5 and 27.1, about its ranking keywords by a factor of two, and about its referring domains by a factor of eleven. Read on the same day across twelve sections of the same domain, their ratio on estimated visits ran from one fifth to seven times, with no detectable relationship to how old each section was or to how many keywords each vendor had found. The disagreement is larger than the effects most applied search papers report, the correction factor between the vendors has no fixed sign or size, and it cannot be applied at the domain level; the vendors rank sections alike and size them differently, so a single-vendor study of magnitudes carries an estimation range it cannot bound from its own data, while a single-vendor ranking of sections is usually right in direction.</w:t>
       </w:r>
     </w:p>
     <w:p>
@@ -8806,16 +8934,8 @@
         <w:t xml:space="preserve">The deployment underneath that measurement is reported as context. Following the publication of one page per member of a finite enumerable class, templated from a free registry on a top-decile domain that no comparable competitor covered and no one defended, the section held 15,830 ranking positions with nineteen referring domains at day 37, and by day 77 appeared in 17,206 recorded AI answers having earned no editorial link. The pages most cited were the ones that enumerate rather than the ones that answer. What that conjunction depended on, and in what proportion, is not estimated here, and the within-class comparison that would have begun to estimate it cannot be run on this section, because every code in the class has a page.</w:t>
       </w:r>
     </w:p>
-    <w:p>
-      <w:pPr>
-        <w:pStyle w:val="BodyText"/>
-      </w:pPr>
-      <w:r>
-        <w:t xml:space="preserve">The framework under which the section was built, User First Intelligence, is specified in Appendix B and released as an open implementation with executable competency questions, whose schema pass rate and instance coverage are reported separately. Its scoring function is not evaluated here. Section 11 registers the prospective study, with parameters locked before any data exist, that would test whether it identifies gaps worth building.</w:t>
-      </w:r>
-    </w:p>
-    <w:bookmarkEnd w:id="69"/>
-    <w:bookmarkStart w:id="70" w:name="references"/>
+    <w:bookmarkEnd w:id="72"/>
+    <w:bookmarkStart w:id="73" w:name="references"/>
     <w:p>
       <w:pPr>
         <w:pStyle w:val="Heading2"/>
@@ -9015,7 +9135,7 @@
         <w:pStyle w:val="BodyText"/>
       </w:pPr>
       <w:r>
-        <w:t xml:space="preserve">Haveliwala, T. H. (2002). Topic-sensitive PageRank. In</w:t>
+        <w:t xml:space="preserve">Hannak, A., Sapiezynski, P., Molavi Kakhki, A., Krishnamurthy, B., Lazer, D., Mislove, A., &amp; Wilson, C. (2013). Measuring personalization of web search. In</w:t>
       </w:r>
       <w:r>
         <w:t xml:space="preserve"> </w:t>
@@ -9025,21 +9145,21 @@
           <w:iCs/>
           <w:i/>
         </w:rPr>
-        <w:t xml:space="preserve">WWW ’02</w:t>
-      </w:r>
-      <w:r>
-        <w:t xml:space="preserve"> </w:t>
-      </w:r>
-      <w:r>
-        <w:t xml:space="preserve">(pp. 517–526). ACM.</w:t>
-      </w:r>
-    </w:p>
-    <w:p>
-      <w:pPr>
-        <w:pStyle w:val="BodyText"/>
-      </w:pPr>
-      <w:r>
-        <w:t xml:space="preserve">Hopkinson, A., Gurdasani, A., Palfrey, D., &amp; Mittal, A. (2018). Demand-weighted completeness prediction for a knowledge base. In</w:t>
+        <w:t xml:space="preserve">Proceedings of the 22nd International Conference on World Wide Web (WWW 2013)</w:t>
+      </w:r>
+      <w:r>
+        <w:t xml:space="preserve"> </w:t>
+      </w:r>
+      <w:r>
+        <w:t xml:space="preserve">(pp. 527–538). ACM.</w:t>
+      </w:r>
+    </w:p>
+    <w:p>
+      <w:pPr>
+        <w:pStyle w:val="BodyText"/>
+      </w:pPr>
+      <w:r>
+        <w:t xml:space="preserve">Haveliwala, T. H. (2002). Topic-sensitive PageRank. In</w:t>
       </w:r>
       <w:r>
         <w:t xml:space="preserve"> </w:t>
@@ -9049,21 +9169,21 @@
           <w:iCs/>
           <w:i/>
         </w:rPr>
-        <w:t xml:space="preserve">NAACL-HLT 2018, Industry Papers</w:t>
-      </w:r>
-      <w:r>
-        <w:t xml:space="preserve"> </w:t>
-      </w:r>
-      <w:r>
-        <w:t xml:space="preserve">(pp. 200–207). ACL.</w:t>
-      </w:r>
-    </w:p>
-    <w:p>
-      <w:pPr>
-        <w:pStyle w:val="BodyText"/>
-      </w:pPr>
-      <w:r>
-        <w:t xml:space="preserve">Langridge, P. (2016, June 13).</w:t>
+        <w:t xml:space="preserve">WWW ’02</w:t>
+      </w:r>
+      <w:r>
+        <w:t xml:space="preserve"> </w:t>
+      </w:r>
+      <w:r>
+        <w:t xml:space="preserve">(pp. 517–526). ACM.</w:t>
+      </w:r>
+    </w:p>
+    <w:p>
+      <w:pPr>
+        <w:pStyle w:val="BodyText"/>
+      </w:pPr>
+      <w:r>
+        <w:t xml:space="preserve">Hopkinson, A., Gurdasani, A., Palfrey, D., &amp; Mittal, A. (2018). Demand-weighted completeness prediction for a knowledge base. In</w:t>
       </w:r>
       <w:r>
         <w:t xml:space="preserve"> </w:t>
@@ -9073,21 +9193,21 @@
           <w:iCs/>
           <w:i/>
         </w:rPr>
-        <w:t xml:space="preserve">How accurate are website traffic estimators?</w:t>
-      </w:r>
-      <w:r>
-        <w:t xml:space="preserve"> </w:t>
-      </w:r>
-      <w:r>
-        <w:t xml:space="preserve">Screaming Frog. https://www.screamingfrog.co.uk/how-accurate-are-website-traffic-estimators/ (25 sites, February to April 2016, against Google Analytics; accessed 12 October 2026.)</w:t>
-      </w:r>
-    </w:p>
-    <w:p>
-      <w:pPr>
-        <w:pStyle w:val="BodyText"/>
-      </w:pPr>
-      <w:r>
-        <w:t xml:space="preserve">Le Pochat, V., Van Goethem, T., Tajalizadehkhoob, S., Korczyński, M., &amp; Joosen, W. (2019). Tranco: A research-oriented top sites ranking hardened against manipulation. In</w:t>
+        <w:t xml:space="preserve">NAACL-HLT 2018, Industry Papers</w:t>
+      </w:r>
+      <w:r>
+        <w:t xml:space="preserve"> </w:t>
+      </w:r>
+      <w:r>
+        <w:t xml:space="preserve">(pp. 200–207). ACL.</w:t>
+      </w:r>
+    </w:p>
+    <w:p>
+      <w:pPr>
+        <w:pStyle w:val="BodyText"/>
+      </w:pPr>
+      <w:r>
+        <w:t xml:space="preserve">Langridge, P. (2016, June 13).</w:t>
       </w:r>
       <w:r>
         <w:t xml:space="preserve"> </w:t>
@@ -9097,18 +9217,21 @@
           <w:iCs/>
           <w:i/>
         </w:rPr>
-        <w:t xml:space="preserve">Proceedings of the Network and Distributed System Security Symposium (NDSS 2019)</w:t>
-      </w:r>
-      <w:r>
-        <w:t xml:space="preserve">. Internet Society.</w:t>
-      </w:r>
-    </w:p>
-    <w:p>
-      <w:pPr>
-        <w:pStyle w:val="BodyText"/>
-      </w:pPr>
-      <w:r>
-        <w:t xml:space="preserve">Linehan, L., &amp; Guan, X. (2025, August 11).</w:t>
+        <w:t xml:space="preserve">How accurate are website traffic estimators?</w:t>
+      </w:r>
+      <w:r>
+        <w:t xml:space="preserve"> </w:t>
+      </w:r>
+      <w:r>
+        <w:t xml:space="preserve">Screaming Frog. https://www.screamingfrog.co.uk/how-accurate-are-website-traffic-estimators/ (25 sites, February to April 2016, against Google Analytics; accessed 12 October 2026.)</w:t>
+      </w:r>
+    </w:p>
+    <w:p>
+      <w:pPr>
+        <w:pStyle w:val="BodyText"/>
+      </w:pPr>
+      <w:r>
+        <w:t xml:space="preserve">Le Pochat, V., Van Goethem, T., Tajalizadehkhoob, S., Korczyński, M., &amp; Joosen, W. (2019). Tranco: A research-oriented top sites ranking hardened against manipulation. In</w:t>
       </w:r>
       <w:r>
         <w:t xml:space="preserve"> </w:t>
@@ -9118,21 +9241,18 @@
           <w:iCs/>
           <w:i/>
         </w:rPr>
-        <w:t xml:space="preserve">Only 12% of AI cited URLs rank in Google’s top 10 for the original prompt.</w:t>
-      </w:r>
-      <w:r>
-        <w:t xml:space="preserve"> </w:t>
-      </w:r>
-      <w:r>
-        <w:t xml:space="preserve">Ahrefs. https://ahrefs.com/blog/ai-search-overlap/ (15,000 long-tail prompts across ChatGPT, Gemini, Copilot and Perplexity; accessed 12 October 2026.)</w:t>
-      </w:r>
-    </w:p>
-    <w:p>
-      <w:pPr>
-        <w:pStyle w:val="BodyText"/>
-      </w:pPr>
-      <w:r>
-        <w:t xml:space="preserve">Luggen, M., Difallah, D., Sarasua, C., Demartini, G., &amp; Cudré-Mauroux, P. (2019). Non-parametric class completeness estimators for collaborative knowledge graphs: The case of Wikidata. In</w:t>
+        <w:t xml:space="preserve">Proceedings of the Network and Distributed System Security Symposium (NDSS 2019)</w:t>
+      </w:r>
+      <w:r>
+        <w:t xml:space="preserve">. Internet Society.</w:t>
+      </w:r>
+    </w:p>
+    <w:p>
+      <w:pPr>
+        <w:pStyle w:val="BodyText"/>
+      </w:pPr>
+      <w:r>
+        <w:t xml:space="preserve">Linehan, L., &amp; Guan, X. (2025, August 11).</w:t>
       </w:r>
       <w:r>
         <w:t xml:space="preserve"> </w:t>
@@ -9142,21 +9262,21 @@
           <w:iCs/>
           <w:i/>
         </w:rPr>
-        <w:t xml:space="preserve">ISWC 2019</w:t>
-      </w:r>
-      <w:r>
-        <w:t xml:space="preserve"> </w:t>
-      </w:r>
-      <w:r>
-        <w:t xml:space="preserve">(pp. 453–469). Springer.</w:t>
-      </w:r>
-    </w:p>
-    <w:p>
-      <w:pPr>
-        <w:pStyle w:val="BodyText"/>
-      </w:pPr>
-      <w:r>
-        <w:t xml:space="preserve">Martinez, O. (2026).</w:t>
+        <w:t xml:space="preserve">Only 12% of AI cited URLs rank in Google’s top 10 for the original prompt.</w:t>
+      </w:r>
+      <w:r>
+        <w:t xml:space="preserve"> </w:t>
+      </w:r>
+      <w:r>
+        <w:t xml:space="preserve">Ahrefs. https://ahrefs.com/blog/ai-search-overlap/ (15,000 long-tail prompts across ChatGPT, Gemini, Copilot and Perplexity; accessed 12 October 2026.)</w:t>
+      </w:r>
+    </w:p>
+    <w:p>
+      <w:pPr>
+        <w:pStyle w:val="BodyText"/>
+      </w:pPr>
+      <w:r>
+        <w:t xml:space="preserve">Luggen, M., Difallah, D., Sarasua, C., Demartini, G., &amp; Cudré-Mauroux, P. (2019). Non-parametric class completeness estimators for collaborative knowledge graphs: The case of Wikidata. In</w:t>
       </w:r>
       <w:r>
         <w:t xml:space="preserve"> </w:t>
@@ -9166,21 +9286,21 @@
           <w:iCs/>
           <w:i/>
         </w:rPr>
-        <w:t xml:space="preserve">Optimizing visibility in generative engines: A critical survey of generative engine optimization (2023–2026).</w:t>
-      </w:r>
-      <w:r>
-        <w:t xml:space="preserve"> </w:t>
-      </w:r>
-      <w:r>
-        <w:t xml:space="preserve">arXiv:2607.14035.</w:t>
-      </w:r>
-    </w:p>
-    <w:p>
-      <w:pPr>
-        <w:pStyle w:val="BodyText"/>
-      </w:pPr>
-      <w:r>
-        <w:t xml:space="preserve">Piccardi, T., Catasta, M., Zia, L., &amp; West, R. (2018). Structuring Wikipedia articles with section recommendations. In</w:t>
+        <w:t xml:space="preserve">ISWC 2019</w:t>
+      </w:r>
+      <w:r>
+        <w:t xml:space="preserve"> </w:t>
+      </w:r>
+      <w:r>
+        <w:t xml:space="preserve">(pp. 453–469). Springer.</w:t>
+      </w:r>
+    </w:p>
+    <w:p>
+      <w:pPr>
+        <w:pStyle w:val="BodyText"/>
+      </w:pPr>
+      <w:r>
+        <w:t xml:space="preserve">Martinez, O. (2026).</w:t>
       </w:r>
       <w:r>
         <w:t xml:space="preserve"> </w:t>
@@ -9190,21 +9310,21 @@
           <w:iCs/>
           <w:i/>
         </w:rPr>
-        <w:t xml:space="preserve">SIGIR ’18</w:t>
-      </w:r>
-      <w:r>
-        <w:t xml:space="preserve"> </w:t>
-      </w:r>
-      <w:r>
-        <w:t xml:space="preserve">(pp. 665–674). ACM.</w:t>
-      </w:r>
-    </w:p>
-    <w:p>
-      <w:pPr>
-        <w:pStyle w:val="BodyText"/>
-      </w:pPr>
-      <w:r>
-        <w:t xml:space="preserve">Razniewski, S., Arnaout, H., Ghosh, S., &amp; Suchanek, F. (2024). Completeness, recall, and negation in open-world knowledge bases: A survey.</w:t>
+        <w:t xml:space="preserve">Optimizing visibility in generative engines: A critical survey of generative engine optimization (2023–2026).</w:t>
+      </w:r>
+      <w:r>
+        <w:t xml:space="preserve"> </w:t>
+      </w:r>
+      <w:r>
+        <w:t xml:space="preserve">arXiv:2607.14035.</w:t>
+      </w:r>
+    </w:p>
+    <w:p>
+      <w:pPr>
+        <w:pStyle w:val="BodyText"/>
+      </w:pPr>
+      <w:r>
+        <w:t xml:space="preserve">Piccardi, T., Catasta, M., Zia, L., &amp; West, R. (2018). Structuring Wikipedia articles with section recommendations. In</w:t>
       </w:r>
       <w:r>
         <w:t xml:space="preserve"> </w:t>
@@ -9214,18 +9334,21 @@
           <w:iCs/>
           <w:i/>
         </w:rPr>
-        <w:t xml:space="preserve">ACM Computing Surveys, 56</w:t>
-      </w:r>
-      <w:r>
-        <w:t xml:space="preserve">(6), Article 150. https://doi.org/10.1145/3639563</w:t>
-      </w:r>
-    </w:p>
-    <w:p>
-      <w:pPr>
-        <w:pStyle w:val="BodyText"/>
-      </w:pPr>
-      <w:r>
-        <w:t xml:space="preserve">Razniewski, S., Suchanek, F. M., &amp; Nutt, W. (2016). But what do we actually know? In</w:t>
+        <w:t xml:space="preserve">SIGIR ’18</w:t>
+      </w:r>
+      <w:r>
+        <w:t xml:space="preserve"> </w:t>
+      </w:r>
+      <w:r>
+        <w:t xml:space="preserve">(pp. 665–674). ACM.</w:t>
+      </w:r>
+    </w:p>
+    <w:p>
+      <w:pPr>
+        <w:pStyle w:val="BodyText"/>
+      </w:pPr>
+      <w:r>
+        <w:t xml:space="preserve">Razniewski, S., Arnaout, H., Ghosh, S., &amp; Suchanek, F. (2024). Completeness, recall, and negation in open-world knowledge bases: A survey.</w:t>
       </w:r>
       <w:r>
         <w:t xml:space="preserve"> </w:t>
@@ -9235,21 +9358,18 @@
           <w:iCs/>
           <w:i/>
         </w:rPr>
-        <w:t xml:space="preserve">AKBC 2016</w:t>
-      </w:r>
-      <w:r>
-        <w:t xml:space="preserve"> </w:t>
-      </w:r>
-      <w:r>
-        <w:t xml:space="preserve">(pp. 40–44). ACL.</w:t>
-      </w:r>
-    </w:p>
-    <w:p>
-      <w:pPr>
-        <w:pStyle w:val="BodyText"/>
-      </w:pPr>
-      <w:r>
-        <w:t xml:space="preserve">Redi, M., Gerlach, M., Johnson, I., Morgan, J., &amp; Zia, L. (2020).</w:t>
+        <w:t xml:space="preserve">ACM Computing Surveys, 56</w:t>
+      </w:r>
+      <w:r>
+        <w:t xml:space="preserve">(6), Article 150. https://doi.org/10.1145/3639563</w:t>
+      </w:r>
+    </w:p>
+    <w:p>
+      <w:pPr>
+        <w:pStyle w:val="BodyText"/>
+      </w:pPr>
+      <w:r>
+        <w:t xml:space="preserve">Razniewski, S., Suchanek, F. M., &amp; Nutt, W. (2016). But what do we actually know? In</w:t>
       </w:r>
       <w:r>
         <w:t xml:space="preserve"> </w:t>
@@ -9259,21 +9379,21 @@
           <w:iCs/>
           <w:i/>
         </w:rPr>
-        <w:t xml:space="preserve">A taxonomy of knowledge gaps for Wikimedia projects.</w:t>
-      </w:r>
-      <w:r>
-        <w:t xml:space="preserve"> </w:t>
-      </w:r>
-      <w:r>
-        <w:t xml:space="preserve">arXiv:2008.12314.</w:t>
-      </w:r>
-    </w:p>
-    <w:p>
-      <w:pPr>
-        <w:pStyle w:val="BodyText"/>
-      </w:pPr>
-      <w:r>
-        <w:t xml:space="preserve">Ripoll, M., Reeves, N., Kurteva, A., Simperl, E., Meroño Peñuela, A., &amp; Diepold, K. (2025).</w:t>
+        <w:t xml:space="preserve">AKBC 2016</w:t>
+      </w:r>
+      <w:r>
+        <w:t xml:space="preserve"> </w:t>
+      </w:r>
+      <w:r>
+        <w:t xml:space="preserve">(pp. 40–44). ACL.</w:t>
+      </w:r>
+    </w:p>
+    <w:p>
+      <w:pPr>
+        <w:pStyle w:val="BodyText"/>
+      </w:pPr>
+      <w:r>
+        <w:t xml:space="preserve">Redi, M., Gerlach, M., Johnson, I., Morgan, J., &amp; Zia, L. (2020).</w:t>
       </w:r>
       <w:r>
         <w:t xml:space="preserve"> </w:t>
@@ -9283,21 +9403,21 @@
           <w:iCs/>
           <w:i/>
         </w:rPr>
-        <w:t xml:space="preserve">Filling in the blanks? A systematic review and theoretical conceptualisation for measuring WikiData content gaps.</w:t>
-      </w:r>
-      <w:r>
-        <w:t xml:space="preserve"> </w:t>
-      </w:r>
-      <w:r>
-        <w:t xml:space="preserve">arXiv:2505.16383.</w:t>
-      </w:r>
-    </w:p>
-    <w:p>
-      <w:pPr>
-        <w:pStyle w:val="BodyText"/>
-      </w:pPr>
-      <w:r>
-        <w:t xml:space="preserve">Scheitle, Q., Hohlfeld, O., Gamba, J., Jelten, J., Zimmermann, T., Strowes, S. D., &amp; Vallina-Rodriguez, N. (2018). A long way to the top: Significance, structure, and stability of Internet top lists. In</w:t>
+        <w:t xml:space="preserve">A taxonomy of knowledge gaps for Wikimedia projects.</w:t>
+      </w:r>
+      <w:r>
+        <w:t xml:space="preserve"> </w:t>
+      </w:r>
+      <w:r>
+        <w:t xml:space="preserve">arXiv:2008.12314.</w:t>
+      </w:r>
+    </w:p>
+    <w:p>
+      <w:pPr>
+        <w:pStyle w:val="BodyText"/>
+      </w:pPr>
+      <w:r>
+        <w:t xml:space="preserve">Ripoll, M., Reeves, N., Kurteva, A., Simperl, E., Meroño Peñuela, A., &amp; Diepold, K. (2025).</w:t>
       </w:r>
       <w:r>
         <w:t xml:space="preserve"> </w:t>
@@ -9307,18 +9427,21 @@
           <w:iCs/>
           <w:i/>
         </w:rPr>
-        <w:t xml:space="preserve">Proceedings of the Internet Measurement Conference 2018 (IMC ’18)</w:t>
-      </w:r>
-      <w:r>
-        <w:t xml:space="preserve">. ACM.</w:t>
-      </w:r>
-    </w:p>
-    <w:p>
-      <w:pPr>
-        <w:pStyle w:val="BodyText"/>
-      </w:pPr>
-      <w:r>
-        <w:t xml:space="preserve">Shao, Y., Jiang, Y., Kanell, T. A., Xu, P., Khattab, O., &amp; Lam, M. S. (2024). Assisting in writing Wikipedia-like articles from scratch with large language models. In</w:t>
+        <w:t xml:space="preserve">Filling in the blanks? A systematic review and theoretical conceptualisation for measuring WikiData content gaps.</w:t>
+      </w:r>
+      <w:r>
+        <w:t xml:space="preserve"> </w:t>
+      </w:r>
+      <w:r>
+        <w:t xml:space="preserve">arXiv:2505.16383.</w:t>
+      </w:r>
+    </w:p>
+    <w:p>
+      <w:pPr>
+        <w:pStyle w:val="BodyText"/>
+      </w:pPr>
+      <w:r>
+        <w:t xml:space="preserve">Scheitle, Q., Hohlfeld, O., Gamba, J., Jelten, J., Zimmermann, T., Strowes, S. D., &amp; Vallina-Rodriguez, N. (2018). A long way to the top: Significance, structure, and stability of Internet top lists. In</w:t>
       </w:r>
       <w:r>
         <w:t xml:space="preserve"> </w:t>
@@ -9328,21 +9451,18 @@
           <w:iCs/>
           <w:i/>
         </w:rPr>
-        <w:t xml:space="preserve">NAACL 2024.</w:t>
-      </w:r>
-      <w:r>
-        <w:t xml:space="preserve"> </w:t>
-      </w:r>
-      <w:r>
-        <w:t xml:space="preserve">ACL.</w:t>
-      </w:r>
-    </w:p>
-    <w:p>
-      <w:pPr>
-        <w:pStyle w:val="BodyText"/>
-      </w:pPr>
-      <w:r>
-        <w:t xml:space="preserve">Soulo, T. (2022, May 3).</w:t>
+        <w:t xml:space="preserve">Proceedings of the Internet Measurement Conference 2018 (IMC ’18)</w:t>
+      </w:r>
+      <w:r>
+        <w:t xml:space="preserve">. ACM.</w:t>
+      </w:r>
+    </w:p>
+    <w:p>
+      <w:pPr>
+        <w:pStyle w:val="BodyText"/>
+      </w:pPr>
+      <w:r>
+        <w:t xml:space="preserve">Shao, Y., Jiang, Y., Kanell, T. A., Xu, P., Khattab, O., &amp; Lam, M. S. (2024). Assisting in writing Wikipedia-like articles from scratch with large language models. In</w:t>
       </w:r>
       <w:r>
         <w:t xml:space="preserve"> </w:t>
@@ -9352,21 +9472,21 @@
           <w:iCs/>
           <w:i/>
         </w:rPr>
-        <w:t xml:space="preserve">How accurate are the search traffic estimations in Ahrefs? (New research).</w:t>
-      </w:r>
-      <w:r>
-        <w:t xml:space="preserve"> </w:t>
-      </w:r>
-      <w:r>
-        <w:t xml:space="preserve">Ahrefs. https://ahrefs.com/blog/traffic-estimations-accuracy/ (1,635 sites against Google Search Console; accessed 12 October 2026.)</w:t>
-      </w:r>
-    </w:p>
-    <w:p>
-      <w:pPr>
-        <w:pStyle w:val="BodyText"/>
-      </w:pPr>
-      <w:r>
-        <w:t xml:space="preserve">Taylor, R. S. (1968). Question-negotiation and information seeking in libraries.</w:t>
+        <w:t xml:space="preserve">NAACL 2024.</w:t>
+      </w:r>
+      <w:r>
+        <w:t xml:space="preserve"> </w:t>
+      </w:r>
+      <w:r>
+        <w:t xml:space="preserve">ACL.</w:t>
+      </w:r>
+    </w:p>
+    <w:p>
+      <w:pPr>
+        <w:pStyle w:val="BodyText"/>
+      </w:pPr>
+      <w:r>
+        <w:t xml:space="preserve">Soulo, T. (2022, May 3).</w:t>
       </w:r>
       <w:r>
         <w:t xml:space="preserve"> </w:t>
@@ -9376,18 +9496,21 @@
           <w:iCs/>
           <w:i/>
         </w:rPr>
-        <w:t xml:space="preserve">College &amp; Research Libraries, 29</w:t>
-      </w:r>
-      <w:r>
-        <w:t xml:space="preserve">(3), 178–194.</w:t>
-      </w:r>
-    </w:p>
-    <w:p>
-      <w:pPr>
-        <w:pStyle w:val="BodyText"/>
-      </w:pPr>
-      <w:r>
-        <w:t xml:space="preserve">Vaughan, L., &amp; Yang, R. (2013). Web traffic and organization performance measures: Relationships and data sources examined.</w:t>
+        <w:t xml:space="preserve">How accurate are the search traffic estimations in Ahrefs? (New research).</w:t>
+      </w:r>
+      <w:r>
+        <w:t xml:space="preserve"> </w:t>
+      </w:r>
+      <w:r>
+        <w:t xml:space="preserve">Ahrefs. https://ahrefs.com/blog/traffic-estimations-accuracy/ (1,635 sites against Google Search Console; accessed 12 October 2026.)</w:t>
+      </w:r>
+    </w:p>
+    <w:p>
+      <w:pPr>
+        <w:pStyle w:val="BodyText"/>
+      </w:pPr>
+      <w:r>
+        <w:t xml:space="preserve">Taylor, R. S. (1968). Question-negotiation and information seeking in libraries.</w:t>
       </w:r>
       <w:r>
         <w:t xml:space="preserve"> </w:t>
@@ -9397,18 +9520,18 @@
           <w:iCs/>
           <w:i/>
         </w:rPr>
-        <w:t xml:space="preserve">Journal of Informetrics, 7</w:t>
-      </w:r>
-      <w:r>
-        <w:t xml:space="preserve">(3), 699–711.</w:t>
-      </w:r>
-    </w:p>
-    <w:p>
-      <w:pPr>
-        <w:pStyle w:val="BodyText"/>
-      </w:pPr>
-      <w:r>
-        <w:t xml:space="preserve">Webber, W., &amp; Park, L. A. F. (2009). Score adjustment for correction of pooling bias. In</w:t>
+        <w:t xml:space="preserve">College &amp; Research Libraries, 29</w:t>
+      </w:r>
+      <w:r>
+        <w:t xml:space="preserve">(3), 178–194.</w:t>
+      </w:r>
+    </w:p>
+    <w:p>
+      <w:pPr>
+        <w:pStyle w:val="BodyText"/>
+      </w:pPr>
+      <w:r>
+        <w:t xml:space="preserve">Vaughan, L., &amp; Yang, R. (2013). Web traffic and organization performance measures: Relationships and data sources examined.</w:t>
       </w:r>
       <w:r>
         <w:t xml:space="preserve"> </w:t>
@@ -9418,21 +9541,18 @@
           <w:iCs/>
           <w:i/>
         </w:rPr>
-        <w:t xml:space="preserve">Proceedings of the 32nd International ACM SIGIR Conference on Research and Development in Information Retrieval</w:t>
-      </w:r>
-      <w:r>
-        <w:t xml:space="preserve"> </w:t>
-      </w:r>
-      <w:r>
-        <w:t xml:space="preserve">(pp. 444–451). ACM.</w:t>
-      </w:r>
-    </w:p>
-    <w:p>
-      <w:pPr>
-        <w:pStyle w:val="BodyText"/>
-      </w:pPr>
-      <w:r>
-        <w:t xml:space="preserve">Wulczyn, E., West, R., Zia, L., &amp; Leskovec, J. (2016). Growing Wikipedia across languages via recommendation. In</w:t>
+        <w:t xml:space="preserve">Journal of Informetrics, 7</w:t>
+      </w:r>
+      <w:r>
+        <w:t xml:space="preserve">(3), 699–711.</w:t>
+      </w:r>
+    </w:p>
+    <w:p>
+      <w:pPr>
+        <w:pStyle w:val="BodyText"/>
+      </w:pPr>
+      <w:r>
+        <w:t xml:space="preserve">Webber, W., &amp; Park, L. A. F. (2009). Score adjustment for correction of pooling bias. In</w:t>
       </w:r>
       <w:r>
         <w:t xml:space="preserve"> </w:t>
@@ -9442,21 +9562,21 @@
           <w:iCs/>
           <w:i/>
         </w:rPr>
-        <w:t xml:space="preserve">WWW ’16</w:t>
-      </w:r>
-      <w:r>
-        <w:t xml:space="preserve"> </w:t>
-      </w:r>
-      <w:r>
-        <w:t xml:space="preserve">(pp. 975–985). ACM.</w:t>
-      </w:r>
-    </w:p>
-    <w:p>
-      <w:pPr>
-        <w:pStyle w:val="BodyText"/>
-      </w:pPr>
-      <w:r>
-        <w:t xml:space="preserve">Xu, H., Iqbal, U., &amp; Montgomery, J. M. (2026).</w:t>
+        <w:t xml:space="preserve">Proceedings of the 32nd International ACM SIGIR Conference on Research and Development in Information Retrieval</w:t>
+      </w:r>
+      <w:r>
+        <w:t xml:space="preserve"> </w:t>
+      </w:r>
+      <w:r>
+        <w:t xml:space="preserve">(pp. 444–451). ACM.</w:t>
+      </w:r>
+    </w:p>
+    <w:p>
+      <w:pPr>
+        <w:pStyle w:val="BodyText"/>
+      </w:pPr>
+      <w:r>
+        <w:t xml:space="preserve">Wulczyn, E., West, R., Zia, L., &amp; Leskovec, J. (2016). Growing Wikipedia across languages via recommendation. In</w:t>
       </w:r>
       <w:r>
         <w:t xml:space="preserve"> </w:t>
@@ -9466,21 +9586,21 @@
           <w:iCs/>
           <w:i/>
         </w:rPr>
-        <w:t xml:space="preserve">Measuring Google AI Overviews: Activation, source quality, claim fidelity, and publisher impact.</w:t>
-      </w:r>
-      <w:r>
-        <w:t xml:space="preserve"> </w:t>
-      </w:r>
-      <w:r>
-        <w:t xml:space="preserve">arXiv:2605.14021.</w:t>
-      </w:r>
-    </w:p>
-    <w:p>
-      <w:pPr>
-        <w:pStyle w:val="BodyText"/>
-      </w:pPr>
-      <w:r>
-        <w:t xml:space="preserve">Zobel, J. (1998). How reliable are the results of large-scale information retrieval experiments? In</w:t>
+        <w:t xml:space="preserve">WWW ’16</w:t>
+      </w:r>
+      <w:r>
+        <w:t xml:space="preserve"> </w:t>
+      </w:r>
+      <w:r>
+        <w:t xml:space="preserve">(pp. 975–985). ACM.</w:t>
+      </w:r>
+    </w:p>
+    <w:p>
+      <w:pPr>
+        <w:pStyle w:val="BodyText"/>
+      </w:pPr>
+      <w:r>
+        <w:t xml:space="preserve">Xu, H., Iqbal, U., &amp; Montgomery, J. M. (2026).</w:t>
       </w:r>
       <w:r>
         <w:t xml:space="preserve"> </w:t>
@@ -9490,6 +9610,30 @@
           <w:iCs/>
           <w:i/>
         </w:rPr>
+        <w:t xml:space="preserve">Measuring Google AI Overviews: Activation, source quality, claim fidelity, and publisher impact.</w:t>
+      </w:r>
+      <w:r>
+        <w:t xml:space="preserve"> </w:t>
+      </w:r>
+      <w:r>
+        <w:t xml:space="preserve">arXiv:2605.14021.</w:t>
+      </w:r>
+    </w:p>
+    <w:p>
+      <w:pPr>
+        <w:pStyle w:val="BodyText"/>
+      </w:pPr>
+      <w:r>
+        <w:t xml:space="preserve">Zobel, J. (1998). How reliable are the results of large-scale information retrieval experiments? In</w:t>
+      </w:r>
+      <w:r>
+        <w:t xml:space="preserve"> </w:t>
+      </w:r>
+      <w:r>
+        <w:rPr>
+          <w:iCs/>
+          <w:i/>
+        </w:rPr>
         <w:t xml:space="preserve">Proceedings of the 21st Annual International ACM SIGIR Conference on Research and Development in Information Retrieval</w:t>
       </w:r>
       <w:r>
@@ -9499,8 +9643,8 @@
         <w:t xml:space="preserve">(pp. 307–314). ACM.</w:t>
       </w:r>
     </w:p>
-    <w:bookmarkEnd w:id="70"/>
-    <w:bookmarkStart w:id="71" w:name="appendix-a-version-history"/>
+    <w:bookmarkEnd w:id="73"/>
+    <w:bookmarkStart w:id="74" w:name="appendix-a-version-history"/>
     <w:p>
       <w:pPr>
         <w:pStyle w:val="Heading2"/>
@@ -9729,11 +9873,11 @@
         <w:t xml:space="preserve"> </w:t>
       </w:r>
       <w:r>
-        <w:t xml:space="preserve">was withdrawn as an overstatement. Two related-work paragraphs, Table 5’s day-77 column, referring-domain ranges in Table 6 and two Table 1 rows were added; stale cross-references were corrected; and the corrections list in Section 12 was replaced by this appendix. Section 5.6’s bound was restated: a 27.1x disagreement means at least one of the two estimates lies a factor of 5.2 or more, the square root of 27.1, from the quantity both estimate; the earlier text gave 13x, which is the absolute bound expressed in units of the smaller reading, not a multiplicative factor. The left-censoring of the age proxy was corrected from three prefixes to one, and the prefixes that cross one under territory matching were corrected. In v4.8 the original title, used through v2.2, was restored, and the abstract, Section 1, lessons 1 and 3 of Section 9.2 and the conclusion were revised to introduce the User First Intelligence framework by name and to state plainly that its scoring function is specified and not evaluated; the abstract is longer as a result. The organization that operates the section is no longer named; the author’s affiliation is given as KL University only.</w:t>
-      </w:r>
-    </w:p>
-    <w:bookmarkEnd w:id="71"/>
-    <w:bookmarkStart w:id="72" w:name="X18d9efc5c8709e807ccf3b1afd9c455f8240912"/>
+        <w:t xml:space="preserve">was withdrawn as an overstatement. Two related-work paragraphs, Table 5’s day-77 column, referring-domain ranges in Table 6 and two Table 1 rows were added; stale cross-references were corrected; and the corrections list in Section 12 was replaced by this appendix. Section 5.6’s bound was restated: a 27.1x disagreement means at least one of the two estimates lies a factor of 5.2 or more, the square root of 27.1, from the quantity both estimate; the earlier text gave 13x, which is the absolute bound expressed in units of the smaller reading, not a multiplicative factor. The left-censoring of the age proxy was corrected from three prefixes to one, and the prefixes that cross one under territory matching were corrected. In v4.8 the original title, used through v2.2, was restored, and the abstract, Section 1, Section 2, lessons 1 and 3 of Section 9.2, Section 11 and the conclusion were revised to state the framework’s thesis, that user demand is observed beyond the website and only partly visible to volume tools, with the instrument comparison as its motivating measurement; Figure 1 was added; a personalization paragraph and the multi-platform demand and persona studies were added; every statement about multi-platform demand and personalization is written as the framework’s design or as a registered study, because this deployment collected one demand surface of thirteen. The abstract is longer as a result. The organization that operates the section is no longer named; the author’s affiliation is given as KL University only.</w:t>
+      </w:r>
+    </w:p>
+    <w:bookmarkEnd w:id="74"/>
+    <w:bookmarkStart w:id="75" w:name="X18d9efc5c8709e807ccf3b1afd9c455f8240912"/>
     <w:p>
       <w:pPr>
         <w:pStyle w:val="Heading2"/>
@@ -9985,8 +10129,8 @@
         <w:t xml:space="preserve">The implementation reports competency-question performance as two separate rates, because they fail for different reasons: a schema rate, whether the model can express the question at all, and an instance coverage rate, whether the graph answers it. On the released example these are 4/5 and 70.4%. A question the ontology cannot express is reported as a declared gap with a reason rather than scored as zero.</w:t>
       </w:r>
     </w:p>
-    <w:bookmarkEnd w:id="72"/>
-    <w:bookmarkEnd w:id="73"/>
+    <w:bookmarkEnd w:id="75"/>
+    <w:bookmarkEnd w:id="76"/>
     <w:sectPr/>
   </w:body>
 </w:document>

</xml_diff>

<commit_message>
v4.8 final: abstract at standard length; final build
Co-Authored-By: Claude Fable 5.1 <noreply@anthropic.com>
Claude-Session: https://claude.ai/code/session_01NVWVRPSXWbvUmxdzTrqBTy
</commit_message>
<xml_diff>
--- a/paper/User_First_Intelligence_v4.8_2026-10-12.docx
+++ b/paper/User_First_Intelligence_v4.8_2026-10-12.docx
@@ -57,31 +57,15 @@
         <w:pStyle w:val="FirstParagraph"/>
       </w:pPr>
       <w:r>
-        <w:t xml:space="preserve">People say what they want in many places that are not a search box: forum threads, question sites, video comments, reviews, support tickets, social groups. Keyword-volume tools see the fraction of that demand that reaches a search engine in a countable form, and AI answer surfaces now stand between the question and the page. User First Intelligence (UFI) is a framework built on that premise: collect what people ask across platforms, beyond the website; classify it and link it to the entities of an industry organized under an ontology; hold the result in a knowledge graph with its structure, coverage and demand sources kept apart; express user needs as executable competency questions; and score where the organization does not answer, treating the form the answer should take as something to measure rather than assume. The specification and an open implementation reading thirteen demand surfaces are released. This paper reports one deployment of a gap of the kind the framework targets, identified from one of those surfaces, and what two commercial analytics platforms recorded when pointed at the result. The comparison shows that the platforms agree on the direction of a comparison between sections and differ on its magnitude; the demand that never reaches a search box, which the framework’s other surfaces are designed to observe, is outside what either platform reports.</w:t>
-      </w:r>
-    </w:p>
-    <w:p>
-      <w:pPr>
-        <w:pStyle w:val="BodyText"/>
-      </w:pPr>
-      <w:r>
-        <w:t xml:space="preserve">The object is a newly published reference section on a large US telecommunications provider’s site: 381 area-code pages plus hubs, generated from a public numbering-plan registry and live from 26 July 2026. Because it did not exist before that date, two instruments observed one URL prefix from zero with no prior history to disagree about. They disagreed by more than the quantities most applied papers report: on estimated monthly visits by 25.9x, 27.1x, 10.2x and 7.5x in successive months; on ranking keywords by 2.0x; on live referring domains, read the same day, by 11.4x, with one instrument reporting 10% of those domains on .xyz and the other 75%.</w:t>
-      </w:r>
-    </w:p>
-    <w:p>
-      <w:pPr>
-        <w:pStyle w:val="BodyText"/>
-      </w:pPr>
-      <w:r>
-        <w:t xml:space="preserve">A cross-section of twelve sections of the same domain, read on both instruments on one day, shows what a single series cannot. The vendor ratio on estimated visits runs from 0.20x to 7.24x across sections of one site, with a median of 1.01 and six of twelve below one; it shows no detectable relationship with section age (Spearman −0.11, 95% interval −0.64 to +0.49); and it does not follow the keyword-universe ratio, which runs 2x to 21x in one direction throughout. The section followed for 77 days sits near one extreme. The vendors agree on which section is larger in 60 of 66 pairs; the correction factor between them is what has no fixed sign or size, so no domain-level calibration converts one vendor’s figure into the other’s.</w:t>
-      </w:r>
-    </w:p>
-    <w:p>
-      <w:pPr>
-        <w:pStyle w:val="BodyText"/>
-      </w:pPr>
-      <w:r>
-        <w:t xml:space="preserve">The divergence is the primary result because it does not depend on the author’s judgment: every reading is of a public prefix that any subscriber can re-read. The deployment series is reported as context. At day 37, the last observation before an automated link network arrived, the section held 15,830 ranking positions with nineteen referring domains; by day 77 it appeared in 17,206 stored AI answers with no editorial link, and the pages most cited were the hubs that enumerate codes rather than the pages that answer. Six enabling conditions, the deployment’s cost, and six lessons stated as its failures are given, one of which is that this deployment collected demand from only one of the thirteen surfaces the framework reads, so the framework’s central claim is specified here and registered for test, not demonstrated. No causal claim is made.</w:t>
+        <w:t xml:space="preserve">People say what they want to know in many places that are not a search box: forum threads, question sites, video comments, reviews, support tickets, social groups. Keyword-volume tools see the fraction of that demand that reaches a search engine in a countable form, and AI answer surfaces now stand between the question and the page. User First Intelligence (UFI) is a framework built on that premise: collect what people ask across platforms, beyond the website; classify it and link it to the entities of an industry held under an ontology; keep structure, coverage and demand sources in separate roles in a knowledge graph; express user needs as executable competency questions; and score where the organization does not answer, treating the form of the answer as something to measure. The specification and an open implementation reading thirteen demand surfaces are released.</w:t>
+      </w:r>
+    </w:p>
+    <w:p>
+      <w:pPr>
+        <w:pStyle w:val="BodyText"/>
+      </w:pPr>
+      <w:r>
+        <w:t xml:space="preserve">This paper reports one deployment of a gap of the kind the framework targets, identified from one of those surfaces, and what two commercial analytics platforms recorded when pointed at it: 381 area-code pages on a large US telecommunications provider’s site, live from 26 July 2026 and observed by both instruments from zero. On estimated monthly visits the two differed by 25.9x, 27.1x, 10.2x and 7.5x in successive months; on ranking keywords by 2.0x; on live referring domains by 11.4x. Across twelve sections of the same domain read on one day, the ratio on estimated visits runs from 0.20x to 7.24x (0.20x to 8.89x territory-matched), with no detectable relationship to section age (Spearman −0.11, 95% interval −0.64 to +0.49) and no fixed correction factor, while the instruments agree on which section is larger in 60 of 66 pairs. Both are sound for direction; the demand that never reaches a search box is outside what either reports, and is what the framework’s other surfaces are designed to observe. The deployment series is reported as context. The scoring function is specified, not evaluated; this deployment collected one surface of thirteen, and the studies that would test the framework are registered. No causal claim is made.</w:t>
       </w:r>
     </w:p>
     <w:bookmarkEnd w:id="20"/>

</xml_diff>

<commit_message>
v4.8: section 5.7, first test of the demand premise on 37,193 reviews; Figure 6
Review dataset sourced through DataForSEO; reviewer names discarded, only
aggregate counts reported. Analysis and figure scripts ship in the source
bundle; the review data itself is not released.

Co-Authored-By: Claude Opus 5.5 <noreply@anthropic.com>
Claude-Session: https://claude.ai/code/session_01NVWVRPSXWbvUmxdzTrqBTy
</commit_message>
<xml_diff>
--- a/paper/User_First_Intelligence_v4.8_2026-10-12.docx
+++ b/paper/User_First_Intelligence_v4.8_2026-10-12.docx
@@ -2,7 +2,7 @@
 <file path=word/document.xml><?xml version="1.0" encoding="utf-8"?>
 <w:document xmlns:w="http://schemas.openxmlformats.org/wordprocessingml/2006/main" xmlns:m="http://schemas.openxmlformats.org/officeDocument/2006/math" xmlns:r="http://schemas.openxmlformats.org/officeDocument/2006/relationships" xmlns:o="urn:schemas-microsoft-com:office:office" xmlns:v="urn:schemas-microsoft-com:vml" xmlns:w10="urn:schemas-microsoft-com:office:word" xmlns:a="http://schemas.openxmlformats.org/drawingml/2006/main" xmlns:pic="http://schemas.openxmlformats.org/drawingml/2006/picture" xmlns:wp="http://schemas.openxmlformats.org/drawingml/2006/wordprocessingDrawing">
   <w:body>
-    <w:bookmarkStart w:id="76" w:name="X2ba48746af24314e6727281a87dbf15f6d65ed2"/>
+    <w:bookmarkStart w:id="80" w:name="X2ba48746af24314e6727281a87dbf15f6d65ed2"/>
     <w:p>
       <w:pPr>
         <w:pStyle w:val="Heading1"/>
@@ -57,15 +57,15 @@
         <w:pStyle w:val="FirstParagraph"/>
       </w:pPr>
       <w:r>
-        <w:t xml:space="preserve">People say what they want to know in many places that are not a search box: forum threads, question sites, video comments, reviews, support tickets, social groups. Keyword-volume tools see the fraction of that demand that reaches a search engine in a countable form, and AI answer surfaces now stand between the question and the page. User First Intelligence (UFI) is a framework built on that premise: collect what people ask across platforms, beyond the website; classify it and link it to the entities of an industry held under an ontology; keep structure, coverage and demand sources in separate roles in a knowledge graph; express user needs as executable competency questions; and score where the organization does not answer, treating the form of the answer as something to measure. The specification and an open implementation reading thirteen demand surfaces are released.</w:t>
-      </w:r>
-    </w:p>
-    <w:p>
-      <w:pPr>
-        <w:pStyle w:val="BodyText"/>
-      </w:pPr>
-      <w:r>
-        <w:t xml:space="preserve">This paper reports one deployment of a gap of the kind the framework targets, identified from one of those surfaces, and what two commercial analytics platforms recorded when pointed at it: 381 area-code pages on a large US telecommunications provider’s site, live from 26 July 2026 and observed by both instruments from zero. On estimated monthly visits the two differed by 25.9x, 27.1x, 10.2x and 7.5x in successive months; on ranking keywords by 2.0x; on live referring domains by 11.4x. Across twelve sections of the same domain read on one day, the ratio on estimated visits runs from 0.20x to 7.24x (0.20x to 8.89x territory-matched), with no detectable relationship to section age (Spearman −0.11, 95% interval −0.64 to +0.49) and no fixed correction factor, while the instruments agree on which section is larger in 60 of 66 pairs. Both are sound for direction; the demand that never reaches a search box is outside what either reports, and is what the framework’s other surfaces are designed to observe. The deployment series is reported as context. The scoring function is specified, not evaluated; this deployment collected one surface of thirteen, and the studies that would test the framework are registered. No causal claim is made.</w:t>
+        <w:t xml:space="preserve">People say what they want to know in many places that are not a search box: forum threads, question sites, video comments, reviews, support tickets, social groups. Keyword-volume tools see the fraction of that demand that reaches a search engine in a countable form, and AI answer surfaces now stand between the question and the page. User First Intelligence (UFI) is a framework built on that premise: collect what people ask across platforms, beyond the website; classify it and link it to the entities of an industry held under an ontology; keep structure, coverage and demand sources in separate roles in a knowledge graph; express user needs as executable competency questions; and score where the organization does not answer, treating the form of the answer as something to measure. An open implementation reading thirteen demand surfaces is released.</w:t>
+      </w:r>
+    </w:p>
+    <w:p>
+      <w:pPr>
+        <w:pStyle w:val="BodyText"/>
+      </w:pPr>
+      <w:r>
+        <w:t xml:space="preserve">This paper reports one deployment of a gap of the kind the framework targets, identified from one of those surfaces, and what two commercial analytics platforms recorded on it: 381 area-code pages on a large US telecommunications provider’s site, observed by both from zero. On estimated monthly visits the two differed by 25.9x, 27.1x, 10.2x and 7.5x in successive months; on ranking keywords by 2.0x; on live referring domains by 11.4x. Across twelve sections of the same domain read on one day, the ratio on estimated visits runs from 0.20x to 7.24x (0.20x to 8.89x territory-matched), with no detectable relationship to section age (Spearman −0.11, 95% interval −0.64 to +0.49) and no fixed correction factor, while the instruments agree on which section is larger in 60 of 66 pairs. Both are sound for direction. On a separate set of 37,193 reviews of 378 telecom retail locations linked to a 42,994-node taxonomy, review demand and search volume agree across top-level branches (Spearman +0.78) but barely across topics (+0.19); 14.0% of one- and two-star reviews name waiting, a complaint the taxonomy records at 12 searches a month. The scoring function is specified, not evaluated, and the full multi-surface and persona studies are registered. No causal claim is made.</w:t>
       </w:r>
     </w:p>
     <w:bookmarkEnd w:id="20"/>
@@ -144,7 +144,7 @@
           <wp:inline>
             <wp:extent cx="5321300" cy="2921000"/>
             <wp:effectExtent b="0" l="0" r="0" t="0"/>
-            <wp:docPr descr="Figure 1. The User First Intelligence framework. (a) The thirteen demand surfaces the released implementation reads, grouped by whether they carry a user’s own words or a tool’s reconstruction of demand; the one surface this deployment actually collected is marked. (b) The pipeline from observed questions to content, with the two observation layers this paper reports (dashed) and the component it specifies but does not evaluate (shaded). The deployment in this paper ran the lower layer and one surface of the upper; it did not run the pipeline end to end." title="" id="22" name="Picture"/>
+            <wp:docPr descr="Figure 1. The User First Intelligence framework. (a) The thirteen demand surfaces the released implementation reads, grouped by whether they carry a user’s own words or a tool’s reconstruction of demand; the one surface this deployment collected is marked; Section 5.7 adds a first run on business reviews. (b) The pipeline from observed questions to content, with the two observation layers this paper reports (dashed) and the component it specifies but does not evaluate (shaded). The deployment in this paper ran the lower layer and one surface of the upper; it did not run the pipeline end to end." title="" id="22" name="Picture"/>
             <a:graphic>
               <a:graphicData uri="http://schemas.openxmlformats.org/drawingml/2006/picture">
                 <pic:pic>
@@ -187,7 +187,7 @@
         <w:pStyle w:val="ImageCaption"/>
       </w:pPr>
       <w:r>
-        <w:t xml:space="preserve">Figure 1. The User First Intelligence framework. (a) The thirteen demand surfaces the released implementation reads, grouped by whether they carry a user’s own words or a tool’s reconstruction of demand; the one surface this deployment actually collected is marked. (b) The pipeline from observed questions to content, with the two observation layers this paper reports (dashed) and the component it specifies but does not evaluate (shaded). The deployment in this paper ran the lower layer and one surface of the upper; it did not run the pipeline end to end.</w:t>
+        <w:t xml:space="preserve">Figure 1. The User First Intelligence framework. (a) The thirteen demand surfaces the released implementation reads, grouped by whether they carry a user’s own words or a tool’s reconstruction of demand; the one surface this deployment collected is marked; Section 5.7 adds a first run on business reviews. (b) The pipeline from observed questions to content, with the two observation layers this paper reports (dashed) and the component it specifies but does not evaluate (shaded). The deployment in this paper ran the lower layer and one surface of the upper; it did not run the pipeline end to end.</w:t>
       </w:r>
     </w:p>
     <w:bookmarkEnd w:id="24"/>
@@ -219,7 +219,7 @@
         <w:t xml:space="preserve"> </w:t>
       </w:r>
       <w:r>
-        <w:t xml:space="preserve">(Figure 1): collecting user questions beyond the website across thirteen demand surfaces, classifying and linking them to an industry ontology, holding structure, coverage and demand as separate source roles in a knowledge graph, and scoring unanswered questions with a Content Gap Score and two competency-question metrics (schema pass rate and instance coverage); released as a specification (Appendix B) and an open implementation (Section 12). This deployment collected one of the thirteen surfaces, so the framework’s demand claim is specified and registered for test (Section 11), not demonstrated.</w:t>
+        <w:t xml:space="preserve">(Figure 1): collecting user questions beyond the website across thirteen demand surfaces, classifying and linking them to an industry ontology, holding structure, coverage and demand as separate source roles in a knowledge graph, and scoring unanswered questions with a Content Gap Score and two competency-question metrics (schema pass rate and instance coverage); released as a specification (Appendix B) and an open implementation (Section 12). This deployment collected one of the thirteen surfaces; Section 5.7 runs the framework’s demand comparison on a second, business reviews, and the full multi-surface study is registered (Section 11).</w:t>
       </w:r>
     </w:p>
     <w:p>
@@ -261,6 +261,28 @@
       </w:r>
       <w:r>
         <w:t xml:space="preserve">, showing that the vendor ratio on estimated visits spans 0.20x to 7.24x within a site (0.20x to 8.89x territory-matched), shows no relationship with section age, and does not follow the keyword-universe ratio, while the vendors agree on the ordering of sections (rank correlation 0.94). Section 5.5. This is the paper’s main empirical result, and it retracts the age hypothesis advanced in version 4.0.</w:t>
+      </w:r>
+    </w:p>
+    <w:p>
+      <w:pPr>
+        <w:numPr>
+          <w:ilvl w:val="0"/>
+          <w:numId w:val="1001"/>
+        </w:numPr>
+        <w:pStyle w:val="Compact"/>
+      </w:pPr>
+      <w:r>
+        <w:rPr>
+          <w:bCs/>
+          <w:b/>
+        </w:rPr>
+        <w:t xml:space="preserve">A first test of the demand premise</w:t>
+      </w:r>
+      <w:r>
+        <w:t xml:space="preserve"> </w:t>
+      </w:r>
+      <w:r>
+        <w:t xml:space="preserve">on 37,193 business reviews against a 42,994-node keyword taxonomy: the two signals agree across branches and diverge across topics, most for complaints. Section 5.7.</w:t>
       </w:r>
     </w:p>
     <w:p>
@@ -1706,7 +1728,7 @@
     </w:p>
     <w:bookmarkEnd w:id="33"/>
     <w:bookmarkEnd w:id="34"/>
-    <w:bookmarkStart w:id="53" w:name="two-instruments-on-one-prefix"/>
+    <w:bookmarkStart w:id="57" w:name="two-instruments-on-one-prefix"/>
     <w:p>
       <w:pPr>
         <w:pStyle w:val="Heading2"/>
@@ -5437,8 +5459,129 @@
       </w:r>
     </w:p>
     <w:bookmarkEnd w:id="52"/>
-    <w:bookmarkEnd w:id="53"/>
-    <w:bookmarkStart w:id="54" w:name="the-deployment-series"/>
+    <w:bookmarkStart w:id="56" w:name="X5fe0ed9da3ff4de516dc10d75bc0b069d3f52ad"/>
+    <w:p>
+      <w:pPr>
+        <w:pStyle w:val="Heading3"/>
+      </w:pPr>
+      <w:r>
+        <w:t xml:space="preserve">5.7 Two demand signals on one taxonomy: reviews against keyword volume</w:t>
+      </w:r>
+    </w:p>
+    <w:p>
+      <w:pPr>
+        <w:pStyle w:val="FirstParagraph"/>
+      </w:pPr>
+      <w:r>
+        <w:t xml:space="preserve">The framework’s premise can be tested wherever a first-party demand surface and a tool-derived one describe the same industry. A separate dataset in the same industry allows a first run. It holds 47,485 Google reviews of 378 retail locations of major US telecom carriers, obtained through DataForSEO under its licence and exported on 8 September 2026, of which 37,193 carry text; and a 42,994-node telecom taxonomy built by the author’s clustering engine from 1,898,584 keywords, each node carrying DataForSEO monthly search volume. Reviewer names were discarded before analysis and only per-label counts are reported. Reviews were linked to taxonomy labels with the released exact-match linker (</w:t>
+      </w:r>
+      <w:r>
+        <w:rPr>
+          <w:rStyle w:val="VerbatimChar"/>
+        </w:rPr>
+        <w:t xml:space="preserve">TokenLinker</w:t>
+      </w:r>
+      <w:r>
+        <w:t xml:space="preserve">), so every attribution is auditable from the label. The taxonomy repeats generic labels under many parents, so a label is one linking unit and its volume is the sum over the nodes that carry it. Of the 37,193 reviews, 20,663 (55.6%) linked to at least one of 27,817 linkable labels, at 2.25 labels per linked review, and 1,008 labels were mentioned at least once.</w:t>
+      </w:r>
+    </w:p>
+    <w:p>
+      <w:pPr>
+        <w:pStyle w:val="BodyText"/>
+      </w:pPr>
+      <w:r>
+        <w:t xml:space="preserve">At the level of the taxonomy’s 17 top-level branches the two signals agree: the share of review mentions and the share of search volume have a rank correlation of +0.78 (p &lt; 0.001; Figure 6b). At the level of topics they barely do. Across the 1,008 labels the rank correlation between review mentions and monthly volume is +0.19 (Kendall’s tau +0.13), +0.28 among the 213 labels with at least twenty mentions, and +0.16 (p = 0.10) among the 106 labels mentioned at least twenty times in one- and two-star reviews (Figure 6a). Of the 1,008 labels, 367 (36.4%) carry under 1,000 monthly searches and 106 (10.5%) carry none. Reviews concentrate on carriers and the store experience, 73.0% of mentions against 29.4% of search volume; broadband is 18.8% of search volume and 0.7% of mentions.</w:t>
+      </w:r>
+    </w:p>
+    <w:p>
+      <w:pPr>
+        <w:pStyle w:val="BodyText"/>
+      </w:pPr>
+      <w:r>
+        <w:t xml:space="preserve">The complaint the author’s practice had identified is the cleanest case. Of 6,620 one- and two-star reviews, 924 (14.0%) mention waiting, against 1.9% of five-star reviews; the taxonomy built from 1.9 million keywords holds one label containing</w:t>
+      </w:r>
+      <w:r>
+        <w:t xml:space="preserve"> </w:t>
+      </w:r>
+      <w:r>
+        <w:t xml:space="preserve">“</w:t>
+      </w:r>
+      <w:r>
+        <w:t xml:space="preserve">wait</w:t>
+      </w:r>
+      <w:r>
+        <w:t xml:space="preserve">”</w:t>
+      </w:r>
+      <w:r>
+        <w:t xml:space="preserve">, at 12 searches a month. The pain point most often named by unhappy customers is close to invisible to the volume tool, and what it calls for is a product or service change, such as appointment booking or digital check-in, rather than a page.</w:t>
+      </w:r>
+    </w:p>
+    <w:p>
+      <w:pPr>
+        <w:pStyle w:val="CaptionedFigure"/>
+      </w:pPr>
+      <w:r>
+        <w:drawing>
+          <wp:inline>
+            <wp:extent cx="5334000" cy="2280104"/>
+            <wp:effectExtent b="0" l="0" r="0" t="0"/>
+            <wp:docPr descr="Figure 6. First-party demand against tool-derived demand on one industry taxonomy: 37,193 Google reviews of 378 retail locations of major US telecom carriers, linked to a 42,994-node taxonomy carrying vendor monthly search volume (both sourced through DataForSEO). (a) Each marker is one of the 1,008 taxonomy labels mentioned in at least one review; filled squares carry zero reported volume. (b) Share of review mentions against share of search volume for the nine largest of the 17 top-level branches. Only aggregate counts are shown." title="" id="54" name="Picture"/>
+            <a:graphic>
+              <a:graphicData uri="http://schemas.openxmlformats.org/drawingml/2006/picture">
+                <pic:pic>
+                  <pic:nvPicPr>
+                    <pic:cNvPr descr="fig9_reviews.pdf" id="55" name="Picture"/>
+                    <pic:cNvPicPr>
+                      <a:picLocks noChangeArrowheads="1" noChangeAspect="1"/>
+                    </pic:cNvPicPr>
+                  </pic:nvPicPr>
+                  <pic:blipFill>
+                    <a:blip r:embed="rId53"/>
+                    <a:stretch>
+                      <a:fillRect/>
+                    </a:stretch>
+                  </pic:blipFill>
+                  <pic:spPr bwMode="auto">
+                    <a:xfrm>
+                      <a:off x="0" y="0"/>
+                      <a:ext cx="5334000" cy="2280104"/>
+                    </a:xfrm>
+                    <a:prstGeom prst="rect">
+                      <a:avLst/>
+                    </a:prstGeom>
+                    <a:noFill/>
+                    <a:ln w="9525">
+                      <a:noFill/>
+                      <a:headEnd/>
+                      <a:tailEnd/>
+                    </a:ln>
+                  </pic:spPr>
+                </pic:pic>
+              </a:graphicData>
+            </a:graphic>
+          </wp:inline>
+        </w:drawing>
+      </w:r>
+    </w:p>
+    <w:p>
+      <w:pPr>
+        <w:pStyle w:val="ImageCaption"/>
+      </w:pPr>
+      <w:r>
+        <w:t xml:space="preserve">Figure 6. First-party demand against tool-derived demand on one industry taxonomy: 37,193 Google reviews of 378 retail locations of major US telecom carriers, linked to a 42,994-node taxonomy carrying vendor monthly search volume (both sourced through DataForSEO). (a) Each marker is one of the 1,008 taxonomy labels mentioned in at least one review; filled squares carry zero reported volume. (b) Share of review mentions against share of search volume for the nine largest of the 17 top-level branches. Only aggregate counts are shown.</w:t>
+      </w:r>
+    </w:p>
+    <w:p>
+      <w:pPr>
+        <w:pStyle w:val="BodyText"/>
+      </w:pPr>
+      <w:r>
+        <w:t xml:space="preserve">This is a first run, not the registered study. It uses one first-party surface on one platform in one industry, exact-match linking whose precision has not been hand-checked, relative review dates, and a taxonomy whose labels are themselves search phrasings, which biases the comparison toward agreement. The reviews describe store locations rather than the area-code section of Sections 5.1 to 6, so this result tests the framework’s demand premise and not the deployment. Within those limits it establishes the framework’s narrowest claim: on one industry, what people write in their own words and what a volume tool counts agree on the broad shape of demand and disagree on its topics, and the disagreement is largest for complaints.</w:t>
+      </w:r>
+    </w:p>
+    <w:bookmarkEnd w:id="56"/>
+    <w:bookmarkEnd w:id="57"/>
+    <w:bookmarkStart w:id="58" w:name="the-deployment-series"/>
     <w:p>
       <w:pPr>
         <w:pStyle w:val="Heading2"/>
@@ -6738,8 +6881,8 @@
         <w:t xml:space="preserve">Among the 58,586 US keywords, the lowest-traffic rows are misspellings, non-English forms, numeric fragments and question forms with 40 to 170 reported searches a month or none at all. The section ranks in 105 countries, with 18.5% of Ahrefs-estimated visits from outside the US. This is stated as a distributional observation and not as a test; the per-page threshold test that would make it one requires the full per-page keyword export matched to pre-launch reported volume, which has not been run.</w:t>
       </w:r>
     </w:p>
-    <w:bookmarkEnd w:id="54"/>
-    <w:bookmarkStart w:id="60" w:name="X18d2d2e3075991b6ea11800201c55cd659d5f2a"/>
+    <w:bookmarkEnd w:id="58"/>
+    <w:bookmarkStart w:id="64" w:name="X18d2d2e3075991b6ea11800201c55cd659d5f2a"/>
     <w:p>
       <w:pPr>
         <w:pStyle w:val="Heading2"/>
@@ -6748,7 +6891,7 @@
         <w:t xml:space="preserve">7 What the answers cite, and what they do not</w:t>
       </w:r>
     </w:p>
-    <w:bookmarkStart w:id="58" w:name="X3f8ecac39565194d957ca3ed2247cd0fa13e5b7"/>
+    <w:bookmarkStart w:id="62" w:name="X3f8ecac39565194d957ca3ed2247cd0fa13e5b7"/>
     <w:p>
       <w:pPr>
         <w:pStyle w:val="Heading3"/>
@@ -6762,7 +6905,7 @@
         <w:pStyle w:val="FirstParagraph"/>
       </w:pPr>
       <w:r>
-        <w:t xml:space="preserve">The pages most cited in AI answers are state hubs that enumerate codes, cities and maps: New York 474 answers, California 337, Texas 322, Florida 304, and the national hub 294. Each exceeds any individual code page: 214 Dallas 238, 786 Miami 228, 404 Atlanta 218 (Figure 6).</w:t>
+        <w:t xml:space="preserve">The pages most cited in AI answers are state hubs that enumerate codes, cities and maps: New York 474 answers, California 337, Texas 322, Florida 304, and the national hub 294. Each exceeds any individual code page: 214 Dallas 238, 786 Miami 228, 404 Atlanta 218 (Figure 7).</w:t>
       </w:r>
     </w:p>
     <w:p>
@@ -6774,18 +6917,18 @@
           <wp:inline>
             <wp:extent cx="3594100" cy="2057400"/>
             <wp:effectExtent b="0" l="0" r="0" t="0"/>
-            <wp:docPr descr="Figure 6. The eight pages under the prefix most often cited in stored AI answers, Ahrefs Brand Radar, 11 October 2026. Enumerating pages (state hubs and the national hub) are solid; per-entity code pages are hatched." title="" id="56" name="Picture"/>
+            <wp:docPr descr="Figure 7. The eight pages under the prefix most often cited in stored AI answers, Ahrefs Brand Radar, 11 October 2026. Enumerating pages (state hubs and the national hub) are solid; per-entity code pages are hatched." title="" id="60" name="Picture"/>
             <a:graphic>
               <a:graphicData uri="http://schemas.openxmlformats.org/drawingml/2006/picture">
                 <pic:pic>
                   <pic:nvPicPr>
-                    <pic:cNvPr descr="fig5_cited.pdf" id="57" name="Picture"/>
+                    <pic:cNvPr descr="fig5_cited.pdf" id="61" name="Picture"/>
                     <pic:cNvPicPr>
                       <a:picLocks noChangeArrowheads="1" noChangeAspect="1"/>
                     </pic:cNvPicPr>
                   </pic:nvPicPr>
                   <pic:blipFill>
-                    <a:blip r:embed="rId55"/>
+                    <a:blip r:embed="rId59"/>
                     <a:stretch>
                       <a:fillRect/>
                     </a:stretch>
@@ -6817,7 +6960,7 @@
         <w:pStyle w:val="ImageCaption"/>
       </w:pPr>
       <w:r>
-        <w:t xml:space="preserve">Figure 6. The eight pages under the prefix most often cited in stored AI answers, Ahrefs Brand Radar, 11 October 2026. Enumerating pages (state hubs and the national hub) are solid; per-entity code pages are hatched.</w:t>
+        <w:t xml:space="preserve">Figure 7. The eight pages under the prefix most often cited in stored AI answers, Ahrefs Brand Radar, 11 October 2026. Enumerating pages (state hubs and the national hub) are solid; per-entity code pages are hatched.</w:t>
       </w:r>
     </w:p>
     <w:p>
@@ -6854,8 +6997,8 @@
         <w:t xml:space="preserve">It is an observation on one section. It is the finding in this paper most worth testing elsewhere, and testing it needs no access to this deployment: any site with both hub and per-entity pages on an enumerable class can check it.</w:t>
       </w:r>
     </w:p>
-    <w:bookmarkEnd w:id="58"/>
-    <w:bookmarkStart w:id="59" w:name="X939a8b296bc61e739d55b8a3e4a04501b76ffb7"/>
+    <w:bookmarkEnd w:id="62"/>
+    <w:bookmarkStart w:id="63" w:name="X939a8b296bc61e739d55b8a3e4a04501b76ffb7"/>
     <w:p>
       <w:pPr>
         <w:pStyle w:val="Heading3"/>
@@ -6908,9 +7051,9 @@
         <w:t xml:space="preserve">The comparison that would establish it is outcome-independent and has not been run: the registry’s codes crossed with a fixed set of verbalizations, queried without reference to who is cited, so that each domain’s presence is measured on a denominator none of them selected. Section 11 registers it.</w:t>
       </w:r>
     </w:p>
-    <w:bookmarkEnd w:id="59"/>
-    <w:bookmarkEnd w:id="60"/>
-    <w:bookmarkStart w:id="65" w:name="the-link-profile"/>
+    <w:bookmarkEnd w:id="63"/>
+    <w:bookmarkEnd w:id="64"/>
+    <w:bookmarkStart w:id="69" w:name="the-link-profile"/>
     <w:p>
       <w:pPr>
         <w:pStyle w:val="Heading2"/>
@@ -6943,7 +7086,7 @@
         <w:t xml:space="preserve">The character of the arrivals is not in doubt. They are automated networks: 61.9% .info, 26.4% .asia, 10.2% .xyz, every linking page at URL Rating below 10, top anchors advertising link sellers. The second instrument indexes 80 referring domains for the subfolder, 88% from domains at Authority Score 0–10 and 75% on .xyz.</w:t>
       </w:r>
     </w:p>
-    <w:bookmarkStart w:id="64" w:name="X9e2ab2ed4f0b64dbadd0f7abfea6ed8f39566ac"/>
+    <w:bookmarkStart w:id="68" w:name="X9e2ab2ed4f0b64dbadd0f7abfea6ed8f39566ac"/>
     <w:p>
       <w:pPr>
         <w:pStyle w:val="Heading3"/>
@@ -7510,18 +7653,18 @@
           <wp:inline>
             <wp:extent cx="5334000" cy="3515313"/>
             <wp:effectExtent b="0" l="0" r="0" t="0"/>
-            <wp:docPr descr="Figure 7. Ranking positions and the link profile over 77 days. Upper panel: ranking positions in positions 1 to 100 and in positions 1 to 3, Ahrefs daily series for the prefix, all locations, read 11 October 2026; the hatched band is the interval in which the automated link network arrived; the vertical rules mark the primary checkpoint (day 37), the September 2026 spam update (day 60) and the vendor data-reliability notice (day 65); live referring domains at each checkpoint are printed along the top. Lower panel: positions gained per day in each interval of Table 6, shaded by link status. The upper panel also plots two reads from the same daily series that are not checkpoints in Table 5: day 6 (984 positions, 186 in 1–3) and day 67 (38,801 and 6,942)." title="" id="62" name="Picture"/>
+            <wp:docPr descr="Figure 8. Ranking positions and the link profile over 77 days. Upper panel: ranking positions in positions 1 to 100 and in positions 1 to 3, Ahrefs daily series for the prefix, all locations, read 11 October 2026; the hatched band is the interval in which the automated link network arrived; the vertical rules mark the primary checkpoint (day 37), the September 2026 spam update (day 60) and the vendor data-reliability notice (day 65); live referring domains at each checkpoint are printed along the top. Lower panel: positions gained per day in each interval of Table 6, shaded by link status. The upper panel also plots two reads from the same daily series that are not checkpoints in Table 5: day 6 (984 positions, 186 in 1–3) and day 67 (38,801 and 6,942)." title="" id="66" name="Picture"/>
             <a:graphic>
               <a:graphicData uri="http://schemas.openxmlformats.org/drawingml/2006/picture">
                 <pic:pic>
                   <pic:nvPicPr>
-                    <pic:cNvPr descr="fig6_positions.pdf" id="63" name="Picture"/>
+                    <pic:cNvPr descr="fig6_positions.pdf" id="67" name="Picture"/>
                     <pic:cNvPicPr>
                       <a:picLocks noChangeArrowheads="1" noChangeAspect="1"/>
                     </pic:cNvPicPr>
                   </pic:nvPicPr>
                   <pic:blipFill>
-                    <a:blip r:embed="rId61"/>
+                    <a:blip r:embed="rId65"/>
                     <a:stretch>
                       <a:fillRect/>
                     </a:stretch>
@@ -7553,15 +7696,15 @@
         <w:pStyle w:val="ImageCaption"/>
       </w:pPr>
       <w:r>
-        <w:t xml:space="preserve">Figure 7. Ranking positions and the link profile over 77 days. Upper panel: ranking positions in positions 1 to 100 and in positions 1 to 3, Ahrefs daily series for the prefix, all locations, read 11 October 2026; the hatched band is the interval in which the automated link network arrived; the vertical rules mark the primary checkpoint (day 37), the September 2026 spam update (day 60) and the vendor data-reliability notice (day 65); live referring domains at each checkpoint are printed along the top. Lower panel: positions gained per day in each interval of Table 6, shaded by link status. The upper panel also plots two reads from the same daily series that are not checkpoints in Table 5: day 6 (984 positions, 186 in 1–3) and day 67 (38,801 and 6,942).</w:t>
-      </w:r>
-    </w:p>
-    <w:p>
-      <w:pPr>
-        <w:pStyle w:val="BodyText"/>
-      </w:pPr>
-      <w:r>
-        <w:t xml:space="preserve">Of the 43,302 positions held at day 75, 15,830 (36.6%) were held at day 37 and 27,472 (63.4%) were acquired after the network began arriving (Figure 7). Because the arrival is dated only to an eight-day interval, that share is itself bounded rather than exact: 53.1% to 63.4%. For AI answers, day 37 is not recorded, so the corresponding share is bounded 56.9% to 74.9%.</w:t>
+        <w:t xml:space="preserve">Figure 8. Ranking positions and the link profile over 77 days. Upper panel: ranking positions in positions 1 to 100 and in positions 1 to 3, Ahrefs daily series for the prefix, all locations, read 11 October 2026; the hatched band is the interval in which the automated link network arrived; the vertical rules mark the primary checkpoint (day 37), the September 2026 spam update (day 60) and the vendor data-reliability notice (day 65); live referring domains at each checkpoint are printed along the top. Lower panel: positions gained per day in each interval of Table 6, shaded by link status. The upper panel also plots two reads from the same daily series that are not checkpoints in Table 5: day 6 (984 positions, 186 in 1–3) and day 67 (38,801 and 6,942).</w:t>
+      </w:r>
+    </w:p>
+    <w:p>
+      <w:pPr>
+        <w:pStyle w:val="BodyText"/>
+      </w:pPr>
+      <w:r>
+        <w:t xml:space="preserve">Of the 43,302 positions held at day 75, 15,830 (36.6%) were held at day 37 and 27,472 (63.4%) were acquired after the network began arriving (Figure 8). Because the arrival is dated only to an eight-day interval, that share is itself bounded rather than exact: 53.1% to 63.4%. For AI answers, day 37 is not recorded, so the corresponding share is bounded 56.9% to 74.9%.</w:t>
       </w:r>
     </w:p>
     <w:p>
@@ -7649,9 +7792,9 @@
         <w:t xml:space="preserve">The provider has an exposure this paper discloses rather than analyzes: a spam link profile pointed at a live section, which the provider has been asked to review. A manual action before a later checkpoint would confound any continuation of this series. The author did not commission, purchase or solicit any link to the section.</w:t>
       </w:r>
     </w:p>
-    <w:bookmarkEnd w:id="64"/>
-    <w:bookmarkEnd w:id="65"/>
-    <w:bookmarkStart w:id="68" w:name="X65c2b72456955cd8a1ed6d4492e2b2bf5d03463"/>
+    <w:bookmarkEnd w:id="68"/>
+    <w:bookmarkEnd w:id="69"/>
+    <w:bookmarkStart w:id="72" w:name="X65c2b72456955cd8a1ed6d4492e2b2bf5d03463"/>
     <w:p>
       <w:pPr>
         <w:pStyle w:val="Heading2"/>
@@ -7660,7 +7803,7 @@
         <w:t xml:space="preserve">9 What the deployment cost, and what it got wrong</w:t>
       </w:r>
     </w:p>
-    <w:bookmarkStart w:id="66" w:name="cost"/>
+    <w:bookmarkStart w:id="70" w:name="cost"/>
     <w:p>
       <w:pPr>
         <w:pStyle w:val="Heading3"/>
@@ -7995,8 +8138,8 @@
         <w:t xml:space="preserve">conditions 1 to 3 of Section 3.1 held, and they do not hold for most classes. And the dominant cost was analysis rather than production, which inverts the usual content-program cost structure and is the part a reader should expect to pay.</w:t>
       </w:r>
     </w:p>
-    <w:bookmarkEnd w:id="66"/>
-    <w:bookmarkStart w:id="67" w:name="X1c99813f0140bd8b67a7ffcabf25a3c1af3da08"/>
+    <w:bookmarkEnd w:id="70"/>
+    <w:bookmarkStart w:id="71" w:name="X1c99813f0140bd8b67a7ffcabf25a3c1af3da08"/>
     <w:p>
       <w:pPr>
         <w:pStyle w:val="Heading3"/>
@@ -8076,7 +8219,7 @@
         <w:t xml:space="preserve"> </w:t>
       </w:r>
       <w:r>
-        <w:t xml:space="preserve">This deployment collected no first-party surface: of the thirteen demand surfaces the released implementation reads (Figure 1a), only competitor keyword exports, a tool-derived surface, were linked to any entity; no forum, Q&amp;A, video, social, review or support data was. Cost: the deployment cannot show that the framework’s user-question layer did any work; that layer is specified in Appendix B, exercised in the released example on synthetic records flagged as synthetic, and untested here on observed data.</w:t>
+        <w:t xml:space="preserve">This deployment collected no first-party surface: of the thirteen demand surfaces the released implementation reads (Figure 1a), only competitor keyword exports, a tool-derived surface, were linked to any entity; no forum, Q&amp;A, video, social, review or support data was. Cost: the deployment cannot show that the framework’s user-question layer did any work; that layer is specified in Appendix B, exercised in the released example on synthetic records flagged as synthetic, and untested on this deployment’s data; Section 5.7 runs the comparison on a separate review dataset.</w:t>
       </w:r>
     </w:p>
     <w:p>
@@ -8145,9 +8288,9 @@
         <w:t xml:space="preserve">Area codes are a reference topic on a commercial domain. The score has no feasibility term and someone must decide how business relevance enters.</w:t>
       </w:r>
     </w:p>
-    <w:bookmarkEnd w:id="67"/>
-    <w:bookmarkEnd w:id="68"/>
-    <w:bookmarkStart w:id="69" w:name="threats-to-validity"/>
+    <w:bookmarkEnd w:id="71"/>
+    <w:bookmarkEnd w:id="72"/>
+    <w:bookmarkStart w:id="73" w:name="threats-to-validity"/>
     <w:p>
       <w:pPr>
         <w:pStyle w:val="Heading2"/>
@@ -8322,8 +8465,8 @@
         <w:t xml:space="preserve">The author designed the approach, deployed it as an employee of the organization studied, performed every measurement, wrote this paper, holds a commercial interest in tools built on the approach, and is the author of a forthcoming book that uses its name. No part of the evaluation has been performed by anyone else. A reader should treat every judgment here as made by an interested party, and should weight Section 5’s instrument readings, which are independently reproducible from two commercial subscriptions, far above anything else in the paper. Section 5 is the primary result partly for that reason.</w:t>
       </w:r>
     </w:p>
-    <w:bookmarkEnd w:id="69"/>
-    <w:bookmarkStart w:id="70" w:name="X4aa75f2b733f30d823a695c178671fd7d4eba0a"/>
+    <w:bookmarkEnd w:id="73"/>
+    <w:bookmarkStart w:id="74" w:name="X4aa75f2b733f30d823a695c178671fd7d4eba0a"/>
     <w:p>
       <w:pPr>
         <w:pStyle w:val="Heading2"/>
@@ -8496,7 +8639,7 @@
         <w:t xml:space="preserve"> </w:t>
       </w:r>
       <w:r>
-        <w:t xml:space="preserve">For one enumerable class, collect user questions from the first-party surfaces in Figure 1a (forum, question site, video comments and transcripts, reviews, social groups, support tickets), link them to entities with the released linker, and compare the resulting demand distribution with the keyword-volume distribution for the same entities. The registered prediction is that the two distributions differ in both which entities carry demand and in what form the demand takes (question, comparison, how-to, video), and that the difference is largest where reported volume is smallest. The released implementation reads every surface and prints which returned rows, so a run that collected nothing cannot be reported as one that did.</w:t>
+        <w:t xml:space="preserve">Section 5.7 is a first run on one surface; the registered study extends it. For one enumerable class, collect user questions from the first-party surfaces in Figure 1a (forum, question site, video comments and transcripts, reviews, social groups, support tickets), link them to entities with the released linker, and compare the resulting demand distribution with the keyword-volume distribution for the same entities. The registered prediction is that the two distributions differ in both which entities carry demand and in what form the demand takes (question, comparison, how-to, video), and that the difference is largest where reported volume is smallest. The released implementation reads every surface and prints which returned rows, so a run that collected nothing cannot be reported as one that did.</w:t>
       </w:r>
     </w:p>
     <w:p>
@@ -8535,8 +8678,8 @@
         <w:t xml:space="preserve">The cross-section was run on one domain. The result that the vendor ratio is prefix-specific, with no detectable relationship to age, needs a second site and a second read date before it is more than an observation about one domain. Anyone with both subscriptions and any multi-section site can do it in a day; the data file released with this paper gives the read method.</w:t>
       </w:r>
     </w:p>
-    <w:bookmarkEnd w:id="70"/>
-    <w:bookmarkStart w:id="71" w:name="Xa2745dfa65086de5e8d3cc3900cac8a84758056"/>
+    <w:bookmarkEnd w:id="74"/>
+    <w:bookmarkStart w:id="75" w:name="Xa2745dfa65086de5e8d3cc3900cac8a84758056"/>
     <w:p>
       <w:pPr>
         <w:pStyle w:val="Heading2"/>
@@ -8718,7 +8861,7 @@
         <w:t xml:space="preserve"> </w:t>
       </w:r>
       <w:r>
-        <w:t xml:space="preserve">No human subjects were involved; no user-level, session, cookie or personally identifying data was collected or analyzed. The deployment published reference pages and ran no experiment on visitors. Outcome figures come from commercial dashboards read through their own interfaces under paid subscriptions, within those vendors’ terms; no vendor was scraped and no API was used to assemble the series. This study performed no crawl of any third-party site; the provider’s own site crawl is an internal operation on the organization’s own property. Page facts derive from the numbering plan administrator’s public registry and US Census data, both public-domain US government sources.</w:t>
+        <w:t xml:space="preserve">No human subjects were involved; no user-level, session, cookie or personally identifying data was collected or analyzed. The deployment published reference pages and ran no experiment on visitors. Outcome figures come from commercial dashboards read through their own interfaces under paid subscriptions, within those vendors’ terms; no vendor was scraped and no API was used to assemble the series. This study performed no crawl of any third-party site; the provider’s own site crawl is an internal operation on the organization’s own property. Page facts derive from the numbering plan administrator’s public registry and US Census data, both public-domain US government sources. The review dataset in Section 5.7 was obtained through DataForSEO, a licensed data provider, under its terms; reviewer names were discarded before analysis, no review text is reproduced, and only per-label aggregate counts are reported.</w:t>
       </w:r>
     </w:p>
     <w:p>
@@ -8884,8 +9027,8 @@
         <w:t xml:space="preserve">No independent party has checked any number in this paper. The one check that would change that requires nobody’s permission, budget or cooperation: a third-party re-read of the day-37 row of Table 5 and of Table 4 from the same dashboards. It has not been performed. The cross-prefix replication registered in version 4.0 was performed on 12 October 2026 (Section 5.5); the within-class control registered with it was found not to exist (Section 3). A reader is entitled to weigh that the remaining undone check is the only one requiring another person’s name.</w:t>
       </w:r>
     </w:p>
-    <w:bookmarkEnd w:id="71"/>
-    <w:bookmarkStart w:id="72" w:name="conclusion"/>
+    <w:bookmarkEnd w:id="75"/>
+    <w:bookmarkStart w:id="76" w:name="conclusion"/>
     <w:p>
       <w:pPr>
         <w:pStyle w:val="Heading2"/>
@@ -8899,7 +9042,7 @@
         <w:pStyle w:val="FirstParagraph"/>
       </w:pPr>
       <w:r>
-        <w:t xml:space="preserve">User First Intelligence starts from the observation that people ask most of what they want to know somewhere other than a search box, and that the tools which count search demand see only the countable part. The framework goes beyond the website to where the questions are, classifies and links them to an industry held under an ontology, keeps structure, coverage and demand in separate roles in a knowledge graph, asks that graph competency questions, and scores where the organization fails to answer, with the form of the answer treated as a property to measure rather than assume, as Section 7.1 shows in miniature. It is specified in Appendix B and released as an open implementation reading thirteen demand surfaces, with executable competency questions whose schema pass rate and instance coverage are reported separately. Its scoring function is not evaluated here, and this deployment collected demand from one surface of the thirteen; Section 11 registers the multi-platform demand study and the persona study on AI answers that would test the framework’s two central claims, with parameters locked before any data exist.</w:t>
+        <w:t xml:space="preserve">User First Intelligence starts from the observation that people ask most of what they want to know somewhere other than a search box, and that the tools which count search demand see only the countable part. The framework goes beyond the website to where the questions are, classifies and links them to an industry held under an ontology, keeps structure, coverage and demand in separate roles in a knowledge graph, asks that graph competency questions, and scores where the organization fails to answer, with the form of the answer treated as a property to measure rather than assume, as Section 7.1 shows in miniature. It is specified in Appendix B and released as an open implementation reading thirteen demand surfaces, with executable competency questions whose schema pass rate and instance coverage are reported separately. On 37,193 business reviews linked to a 42,994-node keyword taxonomy, what customers wrote and what the volume tool counted agreed on the broad shape of demand (+0.78 across branches) and diverged on its topics (+0.19), most for complaints: one in seven unhappy reviews named waiting, which the taxonomy records at 12 searches a month. Its scoring function is not evaluated here, and the deployment itself collected demand from one surface of the thirteen; Section 11 registers the multi-platform demand study and the persona study on AI answers that would test the framework’s two central claims, with parameters locked before any data exist.</w:t>
       </w:r>
     </w:p>
     <w:p>
@@ -8918,8 +9061,8 @@
         <w:t xml:space="preserve">The deployment underneath that measurement is reported as context. Following the publication of one page per member of a finite enumerable class, templated from a free registry on a top-decile domain that no comparable competitor covered and no one defended, the section held 15,830 ranking positions with nineteen referring domains at day 37, and by day 77 appeared in 17,206 recorded AI answers having earned no editorial link. The pages most cited were the ones that enumerate rather than the ones that answer. What that conjunction depended on, and in what proportion, is not estimated here, and the within-class comparison that would have begun to estimate it cannot be run on this section, because every code in the class has a page.</w:t>
       </w:r>
     </w:p>
-    <w:bookmarkEnd w:id="72"/>
-    <w:bookmarkStart w:id="73" w:name="references"/>
+    <w:bookmarkEnd w:id="76"/>
+    <w:bookmarkStart w:id="77" w:name="references"/>
     <w:p>
       <w:pPr>
         <w:pStyle w:val="Heading2"/>
@@ -9627,8 +9770,8 @@
         <w:t xml:space="preserve">(pp. 307–314). ACM.</w:t>
       </w:r>
     </w:p>
-    <w:bookmarkEnd w:id="73"/>
-    <w:bookmarkStart w:id="74" w:name="appendix-a-version-history"/>
+    <w:bookmarkEnd w:id="77"/>
+    <w:bookmarkStart w:id="78" w:name="appendix-a-version-history"/>
     <w:p>
       <w:pPr>
         <w:pStyle w:val="Heading2"/>
@@ -9857,11 +10000,11 @@
         <w:t xml:space="preserve"> </w:t>
       </w:r>
       <w:r>
-        <w:t xml:space="preserve">was withdrawn as an overstatement. Two related-work paragraphs, Table 5’s day-77 column, referring-domain ranges in Table 6 and two Table 1 rows were added; stale cross-references were corrected; and the corrections list in Section 12 was replaced by this appendix. Section 5.6’s bound was restated: a 27.1x disagreement means at least one of the two estimates lies a factor of 5.2 or more, the square root of 27.1, from the quantity both estimate; the earlier text gave 13x, which is the absolute bound expressed in units of the smaller reading, not a multiplicative factor. The left-censoring of the age proxy was corrected from three prefixes to one, and the prefixes that cross one under territory matching were corrected. In v4.8 the original title, used through v2.2, was restored, and the abstract, Section 1, Section 2, lessons 1 and 3 of Section 9.2, Section 11 and the conclusion were revised to state the framework’s thesis, that user demand is observed beyond the website and only partly visible to volume tools, with the instrument comparison as its motivating measurement; Figure 1 was added; a personalization paragraph and the multi-platform demand and persona studies were added; every statement about multi-platform demand and personalization is written as the framework’s design or as a registered study, because this deployment collected one demand surface of thirteen. The abstract is longer as a result. The organization that operates the section is no longer named; the author’s affiliation is given as KL University only.</w:t>
-      </w:r>
-    </w:p>
-    <w:bookmarkEnd w:id="74"/>
-    <w:bookmarkStart w:id="75" w:name="X18d9efc5c8709e807ccf3b1afd9c455f8240912"/>
+        <w:t xml:space="preserve">was withdrawn as an overstatement. Two related-work paragraphs, Table 5’s day-77 column, referring-domain ranges in Table 6 and two Table 1 rows were added; stale cross-references were corrected; and the corrections list in Section 12 was replaced by this appendix. Section 5.6’s bound was restated: a 27.1x disagreement means at least one of the two estimates lies a factor of 5.2 or more, the square root of 27.1, from the quantity both estimate; the earlier text gave 13x, which is the absolute bound expressed in units of the smaller reading, not a multiplicative factor. The left-censoring of the age proxy was corrected from three prefixes to one, and the prefixes that cross one under territory matching were corrected. In v4.8 the original title, used through v2.2, was restored, and the abstract, Section 1, Section 2, lessons 1 and 3 of Section 9.2, Section 11 and the conclusion were revised to state the framework’s thesis, that user demand is observed beyond the website and only partly visible to volume tools, with the instrument comparison as its motivating measurement; Figure 1 was added; a personalization paragraph and the multi-platform demand and persona studies were added; every statement about multi-platform demand and personalization is written as the framework’s design or as a registered study, because this deployment collected one demand surface of thirteen. The abstract is longer as a result. Section 5.7 and Figure 6 add a first run of the demand comparison on 37,193 business reviews sourced through DataForSEO, with reviewer names discarded and only aggregate counts reported. The organization that operates the section is no longer named; the author’s affiliation is given as KL University only.</w:t>
+      </w:r>
+    </w:p>
+    <w:bookmarkEnd w:id="78"/>
+    <w:bookmarkStart w:id="79" w:name="X18d9efc5c8709e807ccf3b1afd9c455f8240912"/>
     <w:p>
       <w:pPr>
         <w:pStyle w:val="Heading2"/>
@@ -10113,8 +10256,8 @@
         <w:t xml:space="preserve">The implementation reports competency-question performance as two separate rates, because they fail for different reasons: a schema rate, whether the model can express the question at all, and an instance coverage rate, whether the graph answers it. On the released example these are 4/5 and 70.4%. A question the ontology cannot express is reported as a declared gap with a reason rather than scored as zero.</w:t>
       </w:r>
     </w:p>
-    <w:bookmarkEnd w:id="75"/>
-    <w:bookmarkEnd w:id="76"/>
+    <w:bookmarkEnd w:id="79"/>
+    <w:bookmarkEnd w:id="80"/>
     <w:sectPr/>
   </w:body>
 </w:document>

</xml_diff>